<commit_message>
Atualiza a análise institucional de telas com o produto de 28 de agosto, para o material comercial da liderança.
Co-authored-by: Cursor <cursoragent@cursor.com>
</commit_message>
<xml_diff>
--- a/pdfs/ANALISE_INSTITUCIONAL_TELAS.docx
+++ b/pdfs/ANALISE_INSTITUCIONAL_TELAS.docx
@@ -751,7 +751,7 @@
                 <w:sz w:val="18"/>
                 <w:szCs w:val="18"/>
               </w:rPr>
-              <w:t xml:space="preserve">Cuidado pastoral e vínculo sem exposição indevida</w:t>
+              <w:t xml:space="preserve">Cuidado pastoral, célula com datas reais e vínculo sem exposição indevida</w:t>
             </w:r>
           </w:p>
         </w:tc>
@@ -811,7 +811,7 @@
                 <w:sz w:val="18"/>
                 <w:szCs w:val="18"/>
               </w:rPr>
-              <w:t xml:space="preserve">Ofertas, financeiro, RD, campanhas</w:t>
+              <w:t xml:space="preserve">Eu quero… / Contribuir, Dízimos e Ofertas, campanhas</w:t>
             </w:r>
           </w:p>
         </w:tc>
@@ -840,7 +840,7 @@
                 <w:sz w:val="18"/>
                 <w:szCs w:val="18"/>
               </w:rPr>
-              <w:t xml:space="preserve">PIX imediato e prestação de contas legível</w:t>
+              <w:t xml:space="preserve">PIX Copia e Cola com o valor; campanha identificada sem misturar com o dízimo</w:t>
             </w:r>
           </w:p>
         </w:tc>
@@ -3781,7 +3781,97 @@
                 <w:sz w:val="20"/>
                 <w:szCs w:val="20"/>
               </w:rPr>
-              <w:t xml:space="preserve">É o “saguão”. Depois do login, a pessoa vê atalhos coloridos para Agenda, Salas, QR, Ofertas, Pastoral, Membros, Aniversariantes, Financeiro, Escalas, Células, Campanhas, Mural e Perfil. Nada de labirinto: o que está disponível aparece; o que não cabe naquele dia (QR fora do culto, salas sem evento) fica explicado, não quebrado. A faixa de avisos e próximos eventos concentra comunicados, lembretes pastorais, trocas de escala e marcos de campanha.</w:t>
+              <w:t xml:space="preserve">É o “saguão”. Depois do login, a pessoa vê atalhos para a vida da igreja e, no rodapé, o convite </w:t>
+            </w:r>
+            <w:r>
+              <w:rPr>
+                <w:rFonts w:ascii="Calibri" w:cs="Calibri" w:eastAsia="Calibri" w:hAnsi="Calibri"/>
+                <w:color w:val="1E293B"/>
+                <w:sz w:val="20"/>
+                <w:szCs w:val="20"/>
+              </w:rPr>
+              <w:t xml:space="preserve">Eu quero…</w:t>
+            </w:r>
+            <w:r>
+              <w:rPr>
+                <w:rFonts w:ascii="Calibri" w:cs="Calibri" w:eastAsia="Calibri" w:hAnsi="Calibri"/>
+                <w:color w:val="1E293B"/>
+                <w:sz w:val="20"/>
+                <w:szCs w:val="20"/>
+              </w:rPr>
+              <w:t xml:space="preserve">. O primeiro item é </w:t>
+            </w:r>
+            <w:r>
+              <w:rPr>
+                <w:rFonts w:ascii="Calibri" w:cs="Calibri" w:eastAsia="Calibri" w:hAnsi="Calibri"/>
+                <w:color w:val="1E293B"/>
+                <w:sz w:val="20"/>
+                <w:szCs w:val="20"/>
+              </w:rPr>
+              <w:t xml:space="preserve">Contribuir</w:t>
+            </w:r>
+            <w:r>
+              <w:rPr>
+                <w:rFonts w:ascii="Calibri" w:cs="Calibri" w:eastAsia="Calibri" w:hAnsi="Calibri"/>
+                <w:color w:val="1E293B"/>
+                <w:sz w:val="20"/>
+                <w:szCs w:val="20"/>
+              </w:rPr>
+              <w:t xml:space="preserve"> — subtítulo *Dízimos, Ofertas, Campanhas ou Projetos.* — e se abre em duas opções: </w:t>
+            </w:r>
+            <w:r>
+              <w:rPr>
+                <w:rFonts w:ascii="Calibri" w:cs="Calibri" w:eastAsia="Calibri" w:hAnsi="Calibri"/>
+                <w:color w:val="1E293B"/>
+                <w:sz w:val="20"/>
+                <w:szCs w:val="20"/>
+              </w:rPr>
+              <w:t xml:space="preserve">Dízimos e Ofertas</w:t>
+            </w:r>
+            <w:r>
+              <w:rPr>
+                <w:rFonts w:ascii="Calibri" w:cs="Calibri" w:eastAsia="Calibri" w:hAnsi="Calibri"/>
+                <w:color w:val="1E293B"/>
+                <w:sz w:val="20"/>
+                <w:szCs w:val="20"/>
+              </w:rPr>
+              <w:t xml:space="preserve"> (*Informe o valor, com centavos, e copie o Pix.*) e </w:t>
+            </w:r>
+            <w:r>
+              <w:rPr>
+                <w:rFonts w:ascii="Calibri" w:cs="Calibri" w:eastAsia="Calibri" w:hAnsi="Calibri"/>
+                <w:color w:val="1E293B"/>
+                <w:sz w:val="20"/>
+                <w:szCs w:val="20"/>
+              </w:rPr>
+              <w:t xml:space="preserve">Campanhas e Projetos</w:t>
+            </w:r>
+            <w:r>
+              <w:rPr>
+                <w:rFonts w:ascii="Calibri" w:cs="Calibri" w:eastAsia="Calibri" w:hAnsi="Calibri"/>
+                <w:color w:val="1E293B"/>
+                <w:sz w:val="20"/>
+                <w:szCs w:val="20"/>
+              </w:rPr>
+              <w:t xml:space="preserve"> (*Informe o valor e copie o Pix já identificado.*). Ao lado, </w:t>
+            </w:r>
+            <w:r>
+              <w:rPr>
+                <w:rFonts w:ascii="Calibri" w:cs="Calibri" w:eastAsia="Calibri" w:hAnsi="Calibri"/>
+                <w:color w:val="1E293B"/>
+                <w:sz w:val="20"/>
+                <w:szCs w:val="20"/>
+              </w:rPr>
+              <w:t xml:space="preserve">Fazer um pedido de Oração</w:t>
+            </w:r>
+            <w:r>
+              <w:rPr>
+                <w:rFonts w:ascii="Calibri" w:cs="Calibri" w:eastAsia="Calibri" w:hAnsi="Calibri"/>
+                <w:color w:val="1E293B"/>
+                <w:sz w:val="20"/>
+                <w:szCs w:val="20"/>
+              </w:rPr>
+              <w:t xml:space="preserve">. Sem caçar item no menu. A faixa de avisos e próximos eventos concentra comunicados, lembretes pastorais, trocas de escala e marcos de campanha. O recorte da tela acompanha o aparelho: as margens laterais crescem com a largura, alinhadas ao chrome superior, para o conteúdo não “flutuar” nem estourar no celular ou no monitor.</w:t>
             </w:r>
           </w:p>
           <w:p>
@@ -3851,7 +3941,43 @@
                 <w:sz w:val="20"/>
                 <w:szCs w:val="20"/>
               </w:rPr>
-              <w:t xml:space="preserve">). Rodapé: Encerrar sessão; engrenagem de manutenção à direita, se houver permissão. Marca d’água da instância. A caixa de avisos recarrega em tempo real e não repete o mesmo recado já visto.</w:t>
+              <w:t xml:space="preserve">). </w:t>
+            </w:r>
+            <w:r>
+              <w:rPr>
+                <w:rFonts w:ascii="Calibri" w:cs="Calibri" w:eastAsia="Calibri" w:hAnsi="Calibri"/>
+                <w:color w:val="1E293B"/>
+                <w:sz w:val="20"/>
+                <w:szCs w:val="20"/>
+              </w:rPr>
+              <w:t xml:space="preserve">Eu quero… → Contribuir</w:t>
+            </w:r>
+            <w:r>
+              <w:rPr>
+                <w:rFonts w:ascii="Calibri" w:cs="Calibri" w:eastAsia="Calibri" w:hAnsi="Calibri"/>
+                <w:color w:val="1E293B"/>
+                <w:sz w:val="20"/>
+                <w:szCs w:val="20"/>
+              </w:rPr>
+              <w:t xml:space="preserve"> reúne Dízimos e Ofertas e Campanhas e Projetos; o pedido de oração abre o Coração Aberto. Rodapé de sessão: Encerrar sessão. Engrenagem de manutenção à direita, só com permissão. Marca d’água da instância. A caixa de avisos recarrega em tempo real e não repete o mesmo recado já visto. </w:t>
+            </w:r>
+            <w:r>
+              <w:rPr>
+                <w:rFonts w:ascii="Calibri" w:cs="Calibri" w:eastAsia="Calibri" w:hAnsi="Calibri"/>
+                <w:color w:val="1E293B"/>
+                <w:sz w:val="20"/>
+                <w:szCs w:val="20"/>
+              </w:rPr>
+              <w:t xml:space="preserve">Fechar</w:t>
+            </w:r>
+            <w:r>
+              <w:rPr>
+                <w:rFonts w:ascii="Calibri" w:cs="Calibri" w:eastAsia="Calibri" w:hAnsi="Calibri"/>
+                <w:color w:val="1E293B"/>
+                <w:sz w:val="20"/>
+                <w:szCs w:val="20"/>
+              </w:rPr>
+              <w:t xml:space="preserve"> em telas de conteúdo devolve ao Índice; só Encerrar sessão limpa o aparelho.</w:t>
             </w:r>
           </w:p>
           <w:tbl>
@@ -3916,7 +4042,7 @@
                       <w:sz w:val="19"/>
                       <w:szCs w:val="19"/>
                     </w:rPr>
-                    <w:t xml:space="preserve">Encontra o que precisa em um toque, com linguagem de igreja, não de sistema. Vê o recado do culto e o próximo evento sem procurar.</w:t>
+                    <w:t xml:space="preserve">Encontra o que precisa em um toque, com linguagem de igreja. Contribui ou pede oração sem sair do saguão. Vê o recado do culto e o próximo evento sem procurar.</w:t>
                   </w:r>
                 </w:p>
               </w:tc>
@@ -3965,7 +4091,7 @@
                       <w:sz w:val="19"/>
                       <w:szCs w:val="19"/>
                     </w:rPr>
-                    <w:t xml:space="preserve">Atalhos respeitam ACL. Quem não deve ver Financeiro ou Membros simplesmente não recebe o botão.</w:t>
+                    <w:t xml:space="preserve">Atalhos respeitam ACL. Quem não deve ver Financeiro ou Membros simplesmente não recebe o botão. Dízimo e campanha não disputam espaço no menu do membro: nascem do mesmo “Contribuir”.</w:t>
                   </w:r>
                 </w:p>
               </w:tc>
@@ -4160,7 +4286,25 @@
                 <w:sz w:val="20"/>
                 <w:szCs w:val="20"/>
               </w:rPr>
-              <w:t xml:space="preserve">É o corredor interno da plataforma. Na parte de cima, a vida do membro (Início, Perfil, Financeiro, Escalas, Aniversariantes, Lista de Membros, Administrativo). Depois da linha, a operação da igreja (eventos, salas, escalas, pastoral, células, campanhas, mural de vagas, finanças, relatórios, papéis e transferência). A engrenagem abre configurações finas: trilha, salas, avisos, igrejas, assinaturas e autorização de imagem.</w:t>
+              <w:t xml:space="preserve">É o corredor interno da plataforma, separado com clareza. Na parte de cima, só a vida do membro: Início, Perfil, Dados cadastrais, Família, Reembolsos, Financeiro, Coração Aberto, Trilha de Discipulado, Minha Célula, Escalas, Mural de Oportunidades, Sugestões e Redes Sociais. Dízimos e Campanhas não aparecem aqui: já estão em </w:t>
+            </w:r>
+            <w:r>
+              <w:rPr>
+                <w:rFonts w:ascii="Calibri" w:cs="Calibri" w:eastAsia="Calibri" w:hAnsi="Calibri"/>
+                <w:color w:val="1E293B"/>
+                <w:sz w:val="20"/>
+                <w:szCs w:val="20"/>
+              </w:rPr>
+              <w:t xml:space="preserve">Eu quero… → Contribuir</w:t>
+            </w:r>
+            <w:r>
+              <w:rPr>
+                <w:rFonts w:ascii="Calibri" w:cs="Calibri" w:eastAsia="Calibri" w:hAnsi="Calibri"/>
+                <w:color w:val="1E293B"/>
+                <w:sz w:val="20"/>
+                <w:szCs w:val="20"/>
+              </w:rPr>
+              <w:t xml:space="preserve">. A engrenagem concentra a gestão em cinco grupos que começam recolhidos — Operação e Segurança, Gestão de Pessoas, Culto e Eventos, Finanças e Inteligência, Governança e TI. O título abre a lista. Quem não tem o papel nem vê o item — e a URL administrativa não entrega a ferramenta ao membro comum.</w:t>
             </w:r>
           </w:p>
           <w:p>
@@ -4211,7 +4355,7 @@
                 <w:sz w:val="20"/>
                 <w:szCs w:val="20"/>
               </w:rPr>
-              <w:t xml:space="preserve">, filtrados por papel. Navega para rotas próprias ou para o carrossel da Manutenção (</w:t>
+              <w:t xml:space="preserve">, filtrados por papel, com redirecionamento fail-closed. Navega para rotas próprias ou para o carrossel da Manutenção. Configurações em </w:t>
             </w:r>
             <w:r>
               <w:rPr>
@@ -4221,25 +4365,6 @@
                 <w:szCs w:val="20"/>
                 <w:shd w:fill="F1F5F9" w:val="clear"/>
               </w:rPr>
-              <w:t xml:space="preserve">maintenance-dashboard</w:t>
-            </w:r>
-            <w:r>
-              <w:rPr>
-                <w:rFonts w:ascii="Calibri" w:cs="Calibri" w:eastAsia="Calibri" w:hAnsi="Calibri"/>
-                <w:color w:val="1E293B"/>
-                <w:sz w:val="20"/>
-                <w:szCs w:val="20"/>
-              </w:rPr>
-              <w:t xml:space="preserve"> + painel). Configurações em </w:t>
-            </w:r>
-            <w:r>
-              <w:rPr>
-                <w:rFonts w:ascii="Calibri" w:cs="Calibri" w:eastAsia="Calibri" w:hAnsi="Calibri"/>
-                <w:color w:val="1E293B"/>
-                <w:sz w:val="20"/>
-                <w:szCs w:val="20"/>
-                <w:shd w:fill="F1F5F9" w:val="clear"/>
-              </w:rPr>
               <w:t xml:space="preserve">AppDrawerSettings</w:t>
             </w:r>
             <w:r>
@@ -4249,7 +4374,7 @@
                 <w:sz w:val="20"/>
                 <w:szCs w:val="20"/>
               </w:rPr>
-              <w:t xml:space="preserve">.</w:t>
+              <w:t xml:space="preserve">, nos cinco grupos acima.</w:t>
             </w:r>
           </w:p>
           <w:tbl>
@@ -4314,7 +4439,7 @@
                       <w:sz w:val="19"/>
                       <w:szCs w:val="19"/>
                     </w:rPr>
-                    <w:t xml:space="preserve">Um menu estável, sempre no mesmo lugar, com o que aquela pessoa realmente pode usar.</w:t>
+                    <w:t xml:space="preserve">Um menu estável, curto, com o que aquela pessoa realmente vive na igreja. Contribuição não compete com Perfil e Célula na mesma lista.</w:t>
                   </w:r>
                 </w:p>
               </w:tc>
@@ -4363,7 +4488,7 @@
                       <w:sz w:val="19"/>
                       <w:szCs w:val="19"/>
                     </w:rPr>
-                    <w:t xml:space="preserve">A equipe entra nos módulos de gestão sem misturar com a jornada do membro. Super administrador vê instâncias e billing.</w:t>
+                    <w:t xml:space="preserve">A equipe entra nos módulos pela engrenagem, já agrupados. O membro comum não “descobre” a manutenção digitando o endereço da tela.</w:t>
                   </w:r>
                 </w:p>
               </w:tc>
@@ -4666,7 +4791,7 @@
                 <w:sz w:val="20"/>
                 <w:szCs w:val="20"/>
               </w:rPr>
-              <w:t xml:space="preserve">). Rodapé </w:t>
+              <w:t xml:space="preserve">). No modo da família, o card preenche a coluna útil da tela (título, textos e botões na mesma largura). Rodapé </w:t>
             </w:r>
             <w:r>
               <w:rPr>
@@ -5102,7 +5227,25 @@
                 <w:sz w:val="20"/>
                 <w:szCs w:val="20"/>
               </w:rPr>
-              <w:t xml:space="preserve">). Distingue Encerrar sessão (web) de Sair do aplicativo (PWA instalado / nativo). Não deve ser disparado pelo Fechar de Ofertas ou Pastoral: esses voltam ao Índice.</w:t>
+              <w:t xml:space="preserve">). Distingue Encerrar sessão (web) de Sair do aplicativo (PWA instalado / nativo). O </w:t>
+            </w:r>
+            <w:r>
+              <w:rPr>
+                <w:rFonts w:ascii="Calibri" w:cs="Calibri" w:eastAsia="Calibri" w:hAnsi="Calibri"/>
+                <w:color w:val="1E293B"/>
+                <w:sz w:val="20"/>
+                <w:szCs w:val="20"/>
+              </w:rPr>
+              <w:t xml:space="preserve">Fechar</w:t>
+            </w:r>
+            <w:r>
+              <w:rPr>
+                <w:rFonts w:ascii="Calibri" w:cs="Calibri" w:eastAsia="Calibri" w:hAnsi="Calibri"/>
+                <w:color w:val="1E293B"/>
+                <w:sz w:val="20"/>
+                <w:szCs w:val="20"/>
+              </w:rPr>
+              <w:t xml:space="preserve"> de Ofertas, Pastoral, Célula e demais conteúdos devolve ao Índice — não dispara este diálogo.</w:t>
             </w:r>
           </w:p>
           <w:tbl>
@@ -6469,7 +6612,7 @@
                 <w:szCs w:val="16"/>
                 <w:shd w:fill="EFF6FF" w:val="clear"/>
               </w:rPr>
-              <w:t xml:space="preserve">Rota /ofertas · card do Painel</w:t>
+              <w:t xml:space="preserve">Rota /ofertas · card do Painel · atalho Eu quero… → Contribuir</w:t>
             </w:r>
           </w:p>
           <w:p>
@@ -6501,7 +6644,151 @@
                 <w:sz w:val="20"/>
                 <w:szCs w:val="20"/>
               </w:rPr>
-              <w:t xml:space="preserve">A contribuição deixa de ser um constrangimento de “como eu pago?”. A tela mostra o recebedor da igreja e a chave PIX, com um toque para copiar. O Fechar volta ao Índice — não encerra a sessão.</w:t>
+              <w:t xml:space="preserve">A contribuição deixa de ser um constrangimento de “como eu pago?”. Em </w:t>
+            </w:r>
+            <w:r>
+              <w:rPr>
+                <w:rFonts w:ascii="Calibri" w:cs="Calibri" w:eastAsia="Calibri" w:hAnsi="Calibri"/>
+                <w:color w:val="1E293B"/>
+                <w:sz w:val="20"/>
+                <w:szCs w:val="20"/>
+              </w:rPr>
+              <w:t xml:space="preserve">Dízimos e Ofertas</w:t>
+            </w:r>
+            <w:r>
+              <w:rPr>
+                <w:rFonts w:ascii="Calibri" w:cs="Calibri" w:eastAsia="Calibri" w:hAnsi="Calibri"/>
+                <w:color w:val="1E293B"/>
+                <w:sz w:val="20"/>
+                <w:szCs w:val="20"/>
+              </w:rPr>
+              <w:t xml:space="preserve">, a pessoa vê os dados do recebedor e a chave, informa o valor </w:t>
+            </w:r>
+            <w:r>
+              <w:rPr>
+                <w:rFonts w:ascii="Calibri" w:cs="Calibri" w:eastAsia="Calibri" w:hAnsi="Calibri"/>
+                <w:color w:val="1E293B"/>
+                <w:sz w:val="20"/>
+                <w:szCs w:val="20"/>
+              </w:rPr>
+              <w:t xml:space="preserve">com centavos</w:t>
+            </w:r>
+            <w:r>
+              <w:rPr>
+                <w:rFonts w:ascii="Calibri" w:cs="Calibri" w:eastAsia="Calibri" w:hAnsi="Calibri"/>
+                <w:color w:val="1E293B"/>
+                <w:sz w:val="20"/>
+                <w:szCs w:val="20"/>
+              </w:rPr>
+              <w:t xml:space="preserve"> — a máscara preenche da direita para a esquerda, como no banco (1 vira R$ 0,01) — e toca em </w:t>
+            </w:r>
+            <w:r>
+              <w:rPr>
+                <w:rFonts w:ascii="Calibri" w:cs="Calibri" w:eastAsia="Calibri" w:hAnsi="Calibri"/>
+                <w:color w:val="1E293B"/>
+                <w:sz w:val="20"/>
+                <w:szCs w:val="20"/>
+              </w:rPr>
+              <w:t xml:space="preserve">Copiar chave PIX</w:t>
+            </w:r>
+            <w:r>
+              <w:rPr>
+                <w:rFonts w:ascii="Calibri" w:cs="Calibri" w:eastAsia="Calibri" w:hAnsi="Calibri"/>
+                <w:color w:val="1E293B"/>
+                <w:sz w:val="20"/>
+                <w:szCs w:val="20"/>
+              </w:rPr>
+              <w:t xml:space="preserve">. O app gera o </w:t>
+            </w:r>
+            <w:r>
+              <w:rPr>
+                <w:rFonts w:ascii="Calibri" w:cs="Calibri" w:eastAsia="Calibri" w:hAnsi="Calibri"/>
+                <w:color w:val="1E293B"/>
+                <w:sz w:val="20"/>
+                <w:szCs w:val="20"/>
+              </w:rPr>
+              <w:t xml:space="preserve">Pix Copia e Cola</w:t>
+            </w:r>
+            <w:r>
+              <w:rPr>
+                <w:rFonts w:ascii="Calibri" w:cs="Calibri" w:eastAsia="Calibri" w:hAnsi="Calibri"/>
+                <w:color w:val="1E293B"/>
+                <w:sz w:val="20"/>
+                <w:szCs w:val="20"/>
+              </w:rPr>
+              <w:t xml:space="preserve"> já com o montante; basta colar no banco. O botão </w:t>
+            </w:r>
+            <w:r>
+              <w:rPr>
+                <w:rFonts w:ascii="Calibri" w:cs="Calibri" w:eastAsia="Calibri" w:hAnsi="Calibri"/>
+                <w:color w:val="1E293B"/>
+                <w:sz w:val="20"/>
+                <w:szCs w:val="20"/>
+              </w:rPr>
+              <w:t xml:space="preserve">Limpar</w:t>
+            </w:r>
+            <w:r>
+              <w:rPr>
+                <w:rFonts w:ascii="Calibri" w:cs="Calibri" w:eastAsia="Calibri" w:hAnsi="Calibri"/>
+                <w:color w:val="1E293B"/>
+                <w:sz w:val="20"/>
+                <w:szCs w:val="20"/>
+              </w:rPr>
+              <w:t xml:space="preserve">, na mesma linha do valor, zera o digitado sem perder a chave. Em </w:t>
+            </w:r>
+            <w:r>
+              <w:rPr>
+                <w:rFonts w:ascii="Calibri" w:cs="Calibri" w:eastAsia="Calibri" w:hAnsi="Calibri"/>
+                <w:color w:val="1E293B"/>
+                <w:sz w:val="20"/>
+                <w:szCs w:val="20"/>
+              </w:rPr>
+              <w:t xml:space="preserve">Campanhas e Projetos</w:t>
+            </w:r>
+            <w:r>
+              <w:rPr>
+                <w:rFonts w:ascii="Calibri" w:cs="Calibri" w:eastAsia="Calibri" w:hAnsi="Calibri"/>
+                <w:color w:val="1E293B"/>
+                <w:sz w:val="20"/>
+                <w:szCs w:val="20"/>
+              </w:rPr>
+              <w:t xml:space="preserve">, o valor é em reais inteiros; os </w:t>
+            </w:r>
+            <w:r>
+              <w:rPr>
+                <w:rFonts w:ascii="Calibri" w:cs="Calibri" w:eastAsia="Calibri" w:hAnsi="Calibri"/>
+                <w:color w:val="1E293B"/>
+                <w:sz w:val="20"/>
+                <w:szCs w:val="20"/>
+              </w:rPr>
+              <w:t xml:space="preserve">centavos de identificação</w:t>
+            </w:r>
+            <w:r>
+              <w:rPr>
+                <w:rFonts w:ascii="Calibri" w:cs="Calibri" w:eastAsia="Calibri" w:hAnsi="Calibri"/>
+                <w:color w:val="1E293B"/>
+                <w:sz w:val="20"/>
+                <w:szCs w:val="20"/>
+              </w:rPr>
+              <w:t xml:space="preserve"> entram sozinhos. A tela mostra o QR e o botão </w:t>
+            </w:r>
+            <w:r>
+              <w:rPr>
+                <w:rFonts w:ascii="Calibri" w:cs="Calibri" w:eastAsia="Calibri" w:hAnsi="Calibri"/>
+                <w:color w:val="1E293B"/>
+                <w:sz w:val="20"/>
+                <w:szCs w:val="20"/>
+              </w:rPr>
+              <w:t xml:space="preserve">Copiar Chave Pix</w:t>
+            </w:r>
+            <w:r>
+              <w:rPr>
+                <w:rFonts w:ascii="Calibri" w:cs="Calibri" w:eastAsia="Calibri" w:hAnsi="Calibri"/>
+                <w:color w:val="1E293B"/>
+                <w:sz w:val="20"/>
+                <w:szCs w:val="20"/>
+              </w:rPr>
+              <w:t xml:space="preserve">. Mesmo gesto de contribuir, destinos distintos — e o Fechar volta ao Índice, sem encerrar a sessão.</w:t>
             </w:r>
           </w:p>
           <w:p>
@@ -6552,7 +6839,7 @@
                 <w:sz w:val="20"/>
                 <w:szCs w:val="20"/>
               </w:rPr>
-              <w:t xml:space="preserve">). Independente da flag de ofertas do evento. PIX copiado com feedback.</w:t>
+              <w:t xml:space="preserve">). Independente da flag de ofertas do evento. O Pix Copia e Cola é aceito pelo aplicativo do banco (payload no padrão EMV). Fechar volta ao Índice.</w:t>
             </w:r>
           </w:p>
           <w:tbl>
@@ -6617,7 +6904,7 @@
                       <w:sz w:val="19"/>
                       <w:szCs w:val="19"/>
                     </w:rPr>
-                    <w:t xml:space="preserve">Contribui no próprio banco, na hora, sem pedir chave no corredor.</w:t>
+                    <w:t xml:space="preserve">Digita R$ 150,00 (ou R$ 0,50), toca em copiar, cola no banco. Não pede chave no corredor e não precisa “lembrar os centavos”.</w:t>
                   </w:r>
                 </w:p>
               </w:tc>
@@ -6666,7 +6953,7 @@
                       <w:sz w:val="19"/>
                       <w:szCs w:val="19"/>
                     </w:rPr>
-                    <w:t xml:space="preserve">Chave oficial única, atualizável, sem grupos paralelos de PIX.</w:t>
+                    <w:t xml:space="preserve">Chave oficial única, atualizável. O extrato chega com o valor que a pessoa digitou, sem grupo paralelo de PIX.</w:t>
                   </w:r>
                 </w:p>
               </w:tc>
@@ -8660,7 +8947,43 @@
                 <w:sz w:val="20"/>
                 <w:szCs w:val="20"/>
               </w:rPr>
-              <w:t xml:space="preserve">Presta contas com linguagem de boletim, não de ERP: resultado do mês, comparativo, 12 meses, planejado × realizado e saldo bancário. A confiança na tesouraria cresce quando o membro lê o mesmo número que a diretoria.</w:t>
+              <w:t xml:space="preserve">Presta contas com linguagem de boletim, não de ERP: resultado do mês, comparativo, 12 meses, planejado × realizado e saldo bancário. O resumo de </w:t>
+            </w:r>
+            <w:r>
+              <w:rPr>
+                <w:rFonts w:ascii="Calibri" w:cs="Calibri" w:eastAsia="Calibri" w:hAnsi="Calibri"/>
+                <w:color w:val="1E293B"/>
+                <w:sz w:val="20"/>
+                <w:szCs w:val="20"/>
+              </w:rPr>
+              <w:t xml:space="preserve">ENTRADAS</w:t>
+            </w:r>
+            <w:r>
+              <w:rPr>
+                <w:rFonts w:ascii="Calibri" w:cs="Calibri" w:eastAsia="Calibri" w:hAnsi="Calibri"/>
+                <w:color w:val="1E293B"/>
+                <w:sz w:val="20"/>
+                <w:szCs w:val="20"/>
+              </w:rPr>
+              <w:t xml:space="preserve"> e </w:t>
+            </w:r>
+            <w:r>
+              <w:rPr>
+                <w:rFonts w:ascii="Calibri" w:cs="Calibri" w:eastAsia="Calibri" w:hAnsi="Calibri"/>
+                <w:color w:val="1E293B"/>
+                <w:sz w:val="20"/>
+                <w:szCs w:val="20"/>
+              </w:rPr>
+              <w:t xml:space="preserve">SAÍDAS</w:t>
+            </w:r>
+            <w:r>
+              <w:rPr>
+                <w:rFonts w:ascii="Calibri" w:cs="Calibri" w:eastAsia="Calibri" w:hAnsi="Calibri"/>
+                <w:color w:val="1E293B"/>
+                <w:sz w:val="20"/>
+                <w:szCs w:val="20"/>
+              </w:rPr>
+              <w:t xml:space="preserve"> usa a mesma paleta da competência em destaque, para o olho não “trocar de relatório” no meio da leitura. A confiança na tesouraria cresce quando o membro lê o mesmo número que a diretoria.</w:t>
             </w:r>
           </w:p>
           <w:p>
@@ -8730,7 +9053,7 @@
                 <w:sz w:val="20"/>
                 <w:szCs w:val="20"/>
               </w:rPr>
-              <w:t xml:space="preserve">. Campanhas aparecem no bloco de leitura, isoladas da receita ordinária.</w:t>
+              <w:t xml:space="preserve">. Campanhas têm tela e Pix próprios — não entram no bloco ordinário do boletim.</w:t>
             </w:r>
           </w:p>
           <w:tbl>
@@ -9399,7 +9722,25 @@
                 <w:sz w:val="20"/>
                 <w:szCs w:val="20"/>
               </w:rPr>
-              <w:t xml:space="preserve">O servo vê quando serve e com quem. A igreja deixa de anunciar escala só no grupo, onde a mensagem some. Quando o tipo de escala permite, o servo pede substituição pontual a outro voluntário do mesmo ministério — sem alterar o ciclo futuro.</w:t>
+              <w:t xml:space="preserve">O servo vê quando serve e com quem. A igreja deixa de anunciar escala só no grupo, onde a mensagem some. </w:t>
+            </w:r>
+            <w:r>
+              <w:rPr>
+                <w:rFonts w:ascii="Calibri" w:cs="Calibri" w:eastAsia="Calibri" w:hAnsi="Calibri"/>
+                <w:color w:val="1E293B"/>
+                <w:sz w:val="20"/>
+                <w:szCs w:val="20"/>
+              </w:rPr>
+              <w:t xml:space="preserve">Solicitar troca</w:t>
+            </w:r>
+            <w:r>
+              <w:rPr>
+                <w:rFonts w:ascii="Calibri" w:cs="Calibri" w:eastAsia="Calibri" w:hAnsi="Calibri"/>
+                <w:color w:val="1E293B"/>
+                <w:sz w:val="20"/>
+                <w:szCs w:val="20"/>
+              </w:rPr>
+              <w:t xml:space="preserve"> aparece na entrada de Escalas e no Painel, nas datas em que a pessoa está escalada — inclusive intercessão e estacionamento. O pedido reconhece nome composto. Quando o tipo de escala permite, o servo escolhe o substituto da mesma equipe; o WhatsApp já sai com ministério, data e motivo.</w:t>
             </w:r>
           </w:p>
           <w:p>
@@ -9534,7 +9875,7 @@
                       <w:sz w:val="19"/>
                       <w:szCs w:val="19"/>
                     </w:rPr>
-                    <w:t xml:space="preserve">Sabe o domingo em que está de pé, fala com o parceiro e, se precisar, combina a troca no próprio app.</w:t>
+                    <w:t xml:space="preserve">Sabe o domingo em que está de pé, fala com o parceiro e, se precisar, combina a troca no próprio app — sem redigitar o contexto no Zap.</w:t>
                   </w:r>
                 </w:p>
               </w:tc>
@@ -9583,7 +9924,7 @@
                       <w:sz w:val="19"/>
                       <w:szCs w:val="19"/>
                     </w:rPr>
-                    <w:t xml:space="preserve">Ciclo justo, vagas por domingo e trocas rastreadas — sem escala “presa” em pedido pendente.</w:t>
+                    <w:t xml:space="preserve">Ciclo justo, vagas por domingo e trocas rastreadas — sem escala “presa” em pedido pendente. A lista de substitutos reconhece o servo mesmo com nome composto.</w:t>
                   </w:r>
                 </w:p>
               </w:tc>
@@ -10087,7 +10428,7 @@
                 <w:szCs w:val="16"/>
                 <w:shd w:fill="EFF6FF" w:val="clear"/>
               </w:rPr>
-              <w:t xml:space="preserve">Card do Painel small_group</w:t>
+              <w:t xml:space="preserve">Card do Painel small_group · menu Minha Célula</w:t>
             </w:r>
           </w:p>
           <w:p>
@@ -10119,7 +10460,169 @@
                 <w:sz w:val="20"/>
                 <w:szCs w:val="20"/>
               </w:rPr>
-              <w:t xml:space="preserve">A célula deixa de viver só no WhatsApp. O membro vê o próprio grupo, o endereço, o dia da reunião, o mapa e o roteiro da semana. Falta justificada e visita ganham registro pastoral.</w:t>
+              <w:t xml:space="preserve">A célula deixa de viver só no WhatsApp. Quem ainda não tem grupo vê os </w:t>
+            </w:r>
+            <w:r>
+              <w:rPr>
+                <w:rFonts w:ascii="Calibri" w:cs="Calibri" w:eastAsia="Calibri" w:hAnsi="Calibri"/>
+                <w:color w:val="1E293B"/>
+                <w:sz w:val="20"/>
+                <w:szCs w:val="20"/>
+              </w:rPr>
+              <w:t xml:space="preserve">anfitriões mais próximos da residência</w:t>
+            </w:r>
+            <w:r>
+              <w:rPr>
+                <w:rFonts w:ascii="Calibri" w:cs="Calibri" w:eastAsia="Calibri" w:hAnsi="Calibri"/>
+                <w:color w:val="1E293B"/>
+                <w:sz w:val="20"/>
+                <w:szCs w:val="20"/>
+              </w:rPr>
+              <w:t xml:space="preserve">, da menor para a maior distância: nome, grupo, bairro, dia e horário da reunião, quantos já estão inscritos e, dentro de cada card, </w:t>
+            </w:r>
+            <w:r>
+              <w:rPr>
+                <w:rFonts w:ascii="Calibri" w:cs="Calibri" w:eastAsia="Calibri" w:hAnsi="Calibri"/>
+                <w:color w:val="1E293B"/>
+                <w:sz w:val="20"/>
+                <w:szCs w:val="20"/>
+              </w:rPr>
+              <w:t xml:space="preserve">Quero participar deste grupo</w:t>
+            </w:r>
+            <w:r>
+              <w:rPr>
+                <w:rFonts w:ascii="Calibri" w:cs="Calibri" w:eastAsia="Calibri" w:hAnsi="Calibri"/>
+                <w:color w:val="1E293B"/>
+                <w:sz w:val="20"/>
+                <w:szCs w:val="20"/>
+              </w:rPr>
+              <w:t xml:space="preserve">. Sem CEP no perfil, o app pede o cadastro para calcular a distância. Quem já pertence à célula vê as </w:t>
+            </w:r>
+            <w:r>
+              <w:rPr>
+                <w:rFonts w:ascii="Calibri" w:cs="Calibri" w:eastAsia="Calibri" w:hAnsi="Calibri"/>
+                <w:color w:val="1E293B"/>
+                <w:sz w:val="20"/>
+                <w:szCs w:val="20"/>
+              </w:rPr>
+              <w:t xml:space="preserve">datas reais</w:t>
+            </w:r>
+            <w:r>
+              <w:rPr>
+                <w:rFonts w:ascii="Calibri" w:cs="Calibri" w:eastAsia="Calibri" w:hAnsi="Calibri"/>
+                <w:color w:val="1E293B"/>
+                <w:sz w:val="20"/>
+                <w:szCs w:val="20"/>
+              </w:rPr>
+              <w:t xml:space="preserve"> das reuniões (não um único “toda quarta”), líder, anfitrião e endereço oficial — sem atalho para Maps ou Waze. A linha de participantes (ex.: *3 participantes*) abre o modal </w:t>
+            </w:r>
+            <w:r>
+              <w:rPr>
+                <w:rFonts w:ascii="Calibri" w:cs="Calibri" w:eastAsia="Calibri" w:hAnsi="Calibri"/>
+                <w:color w:val="1E293B"/>
+                <w:sz w:val="20"/>
+                <w:szCs w:val="20"/>
+              </w:rPr>
+              <w:t xml:space="preserve">Participantes</w:t>
+            </w:r>
+            <w:r>
+              <w:rPr>
+                <w:rFonts w:ascii="Calibri" w:cs="Calibri" w:eastAsia="Calibri" w:hAnsi="Calibri"/>
+                <w:color w:val="1E293B"/>
+                <w:sz w:val="20"/>
+                <w:szCs w:val="20"/>
+              </w:rPr>
+              <w:t xml:space="preserve">, só com os nomes completos e um </w:t>
+            </w:r>
+            <w:r>
+              <w:rPr>
+                <w:rFonts w:ascii="Calibri" w:cs="Calibri" w:eastAsia="Calibri" w:hAnsi="Calibri"/>
+                <w:color w:val="1E293B"/>
+                <w:sz w:val="20"/>
+                <w:szCs w:val="20"/>
+              </w:rPr>
+              <w:t xml:space="preserve">Fechar</w:t>
+            </w:r>
+            <w:r>
+              <w:rPr>
+                <w:rFonts w:ascii="Calibri" w:cs="Calibri" w:eastAsia="Calibri" w:hAnsi="Calibri"/>
+                <w:color w:val="1E293B"/>
+                <w:sz w:val="20"/>
+                <w:szCs w:val="20"/>
+              </w:rPr>
+              <w:t xml:space="preserve">. Em seguida: </w:t>
+            </w:r>
+            <w:r>
+              <w:rPr>
+                <w:rFonts w:ascii="Calibri" w:cs="Calibri" w:eastAsia="Calibri" w:hAnsi="Calibri"/>
+                <w:color w:val="1E293B"/>
+                <w:sz w:val="20"/>
+                <w:szCs w:val="20"/>
+              </w:rPr>
+              <w:t xml:space="preserve">Roteiro da Semana</w:t>
+            </w:r>
+            <w:r>
+              <w:rPr>
+                <w:rFonts w:ascii="Calibri" w:cs="Calibri" w:eastAsia="Calibri" w:hAnsi="Calibri"/>
+                <w:color w:val="1E293B"/>
+                <w:sz w:val="20"/>
+                <w:szCs w:val="20"/>
+              </w:rPr>
+              <w:t xml:space="preserve">, </w:t>
+            </w:r>
+            <w:r>
+              <w:rPr>
+                <w:rFonts w:ascii="Calibri" w:cs="Calibri" w:eastAsia="Calibri" w:hAnsi="Calibri"/>
+                <w:color w:val="1E293B"/>
+                <w:sz w:val="20"/>
+                <w:szCs w:val="20"/>
+              </w:rPr>
+              <w:t xml:space="preserve">Avisar Ausência</w:t>
+            </w:r>
+            <w:r>
+              <w:rPr>
+                <w:rFonts w:ascii="Calibri" w:cs="Calibri" w:eastAsia="Calibri" w:hAnsi="Calibri"/>
+                <w:color w:val="1E293B"/>
+                <w:sz w:val="20"/>
+                <w:szCs w:val="20"/>
+              </w:rPr>
+              <w:t xml:space="preserve"> (WhatsApp do líder) e, se não for anfitrião nem líder, </w:t>
+            </w:r>
+            <w:r>
+              <w:rPr>
+                <w:rFonts w:ascii="Calibri" w:cs="Calibri" w:eastAsia="Calibri" w:hAnsi="Calibri"/>
+                <w:color w:val="1E293B"/>
+                <w:sz w:val="20"/>
+                <w:szCs w:val="20"/>
+              </w:rPr>
+              <w:t xml:space="preserve">Quero sair deste grupo</w:t>
+            </w:r>
+            <w:r>
+              <w:rPr>
+                <w:rFonts w:ascii="Calibri" w:cs="Calibri" w:eastAsia="Calibri" w:hAnsi="Calibri"/>
+                <w:color w:val="1E293B"/>
+                <w:sz w:val="20"/>
+                <w:szCs w:val="20"/>
+              </w:rPr>
+              <w:t xml:space="preserve">. O título </w:t>
+            </w:r>
+            <w:r>
+              <w:rPr>
+                <w:rFonts w:ascii="Calibri" w:cs="Calibri" w:eastAsia="Calibri" w:hAnsi="Calibri"/>
+                <w:color w:val="1E293B"/>
+                <w:sz w:val="20"/>
+                <w:szCs w:val="20"/>
+              </w:rPr>
+              <w:t xml:space="preserve">Pequeno Grupo</w:t>
+            </w:r>
+            <w:r>
+              <w:rPr>
+                <w:rFonts w:ascii="Calibri" w:cs="Calibri" w:eastAsia="Calibri" w:hAnsi="Calibri"/>
+                <w:color w:val="1E293B"/>
+                <w:sz w:val="20"/>
+                <w:szCs w:val="20"/>
+              </w:rPr>
+              <w:t xml:space="preserve"> aparece uma vez, no corpo da tela. Título, cards e botões acompanham a largura do aparelho.</w:t>
             </w:r>
           </w:p>
           <w:p>
@@ -10151,7 +10654,25 @@
                 <w:sz w:val="20"/>
                 <w:szCs w:val="20"/>
               </w:rPr>
-              <w:t xml:space="preserve">Card do dashboard; gestão em </w:t>
+              <w:t xml:space="preserve">Card do dashboard e item </w:t>
+            </w:r>
+            <w:r>
+              <w:rPr>
+                <w:rFonts w:ascii="Calibri" w:cs="Calibri" w:eastAsia="Calibri" w:hAnsi="Calibri"/>
+                <w:color w:val="1E293B"/>
+                <w:sz w:val="20"/>
+                <w:szCs w:val="20"/>
+              </w:rPr>
+              <w:t xml:space="preserve">Minha Célula</w:t>
+            </w:r>
+            <w:r>
+              <w:rPr>
+                <w:rFonts w:ascii="Calibri" w:cs="Calibri" w:eastAsia="Calibri" w:hAnsi="Calibri"/>
+                <w:color w:val="1E293B"/>
+                <w:sz w:val="20"/>
+                <w:szCs w:val="20"/>
+              </w:rPr>
+              <w:t xml:space="preserve"> no menu. Distância a partir do CEP do perfil. Inscrição e saída pedem confirmação no celular e no navegador. Roteiro lido no modal; gestão em </w:t>
             </w:r>
             <w:r>
               <w:rPr>
@@ -10169,7 +10690,7 @@
                 <w:sz w:val="20"/>
                 <w:szCs w:val="20"/>
               </w:rPr>
-              <w:t xml:space="preserve">. Roteiro semanal pode nascer da Trilha. Mapa e WhatsApp do anfitrião/líder.</w:t>
+              <w:t xml:space="preserve">.</w:t>
             </w:r>
           </w:p>
           <w:tbl>
@@ -10234,7 +10755,7 @@
                       <w:sz w:val="19"/>
                       <w:szCs w:val="19"/>
                     </w:rPr>
-                    <w:t xml:space="preserve">Sabe onde e quando a célula se reúne, lê o estudo da semana e avisa ausência.</w:t>
+                    <w:t xml:space="preserve">Encontra a célula perto de casa, entra com um toque, vê quem mais participa, lê o estudo e avisa se faltar — tudo no mesmo recorte da carteirinha.</w:t>
                   </w:r>
                 </w:p>
               </w:tc>
@@ -10283,7 +10804,7 @@
                       <w:sz w:val="19"/>
                       <w:szCs w:val="19"/>
                     </w:rPr>
-                    <w:t xml:space="preserve">Presença, visitantes e relatório de células no mesmo lugar da operação da igreja.</w:t>
+                    <w:t xml:space="preserve">A rede cresce por proximidade, não por recado no grupo. Presença, visitantes e relatório continuam na gestão.</w:t>
                   </w:r>
                 </w:p>
               </w:tc>
@@ -10446,7 +10967,7 @@
                 <w:szCs w:val="16"/>
                 <w:shd w:fill="EFF6FF" w:val="clear"/>
               </w:rPr>
-              <w:t xml:space="preserve">Card do Painel campaign_card</w:t>
+              <w:t xml:space="preserve">Card do Painel campaign_card · atalho Eu quero… → Contribuir</w:t>
             </w:r>
           </w:p>
           <w:p>
@@ -10478,7 +10999,61 @@
                 <w:sz w:val="20"/>
                 <w:szCs w:val="20"/>
               </w:rPr>
-              <w:t xml:space="preserve">A campanha de construção, missão ou projeto especial ganha meta, progresso e PIX — sem misturar com o dízimo do mês. O membro acompanha o termômetro; a tesouraria concilia por centavos.</w:t>
+              <w:t xml:space="preserve">A campanha de construção, missão ou projeto especial ganha meta, progresso, capa e PIX — sem misturar com o dízimo do mês. O membro acompanha o termômetro e contribui pelo mesmo </w:t>
+            </w:r>
+            <w:r>
+              <w:rPr>
+                <w:rFonts w:ascii="Calibri" w:cs="Calibri" w:eastAsia="Calibri" w:hAnsi="Calibri"/>
+                <w:color w:val="1E293B"/>
+                <w:sz w:val="20"/>
+                <w:szCs w:val="20"/>
+              </w:rPr>
+              <w:t xml:space="preserve">Contribuir</w:t>
+            </w:r>
+            <w:r>
+              <w:rPr>
+                <w:rFonts w:ascii="Calibri" w:cs="Calibri" w:eastAsia="Calibri" w:hAnsi="Calibri"/>
+                <w:color w:val="1E293B"/>
+                <w:sz w:val="20"/>
+                <w:szCs w:val="20"/>
+              </w:rPr>
+              <w:t xml:space="preserve"> da tela inicial, ou pelo </w:t>
+            </w:r>
+            <w:r>
+              <w:rPr>
+                <w:rFonts w:ascii="Calibri" w:cs="Calibri" w:eastAsia="Calibri" w:hAnsi="Calibri"/>
+                <w:color w:val="1E293B"/>
+                <w:sz w:val="20"/>
+                <w:szCs w:val="20"/>
+              </w:rPr>
+              <w:t xml:space="preserve">Contribuir Agora</w:t>
+            </w:r>
+            <w:r>
+              <w:rPr>
+                <w:rFonts w:ascii="Calibri" w:cs="Calibri" w:eastAsia="Calibri" w:hAnsi="Calibri"/>
+                <w:color w:val="1E293B"/>
+                <w:sz w:val="20"/>
+                <w:szCs w:val="20"/>
+              </w:rPr>
+              <w:t xml:space="preserve"> no card. Informa o valor em reais inteiros; os </w:t>
+            </w:r>
+            <w:r>
+              <w:rPr>
+                <w:rFonts w:ascii="Calibri" w:cs="Calibri" w:eastAsia="Calibri" w:hAnsi="Calibri"/>
+                <w:color w:val="1E293B"/>
+                <w:sz w:val="20"/>
+                <w:szCs w:val="20"/>
+              </w:rPr>
+              <w:t xml:space="preserve">centavos de identificação</w:t>
+            </w:r>
+            <w:r>
+              <w:rPr>
+                <w:rFonts w:ascii="Calibri" w:cs="Calibri" w:eastAsia="Calibri" w:hAnsi="Calibri"/>
+                <w:color w:val="1E293B"/>
+                <w:sz w:val="20"/>
+                <w:szCs w:val="20"/>
+              </w:rPr>
+              <w:t xml:space="preserve"> combinados com a tesouraria entram sozinhos. A tela mostra o QR e o Pix Copia e Cola já identificado, para o depósito aparecer no extrato como daquela campanha.</w:t>
             </w:r>
           </w:p>
           <w:p>
@@ -10510,7 +11085,7 @@
                 <w:sz w:val="20"/>
                 <w:szCs w:val="20"/>
               </w:rPr>
-              <w:t xml:space="preserve">Campanhas ativas no card; gestão na manutenção. Conciliação isolada da receita ordinária. Avisos de marco na caixa da home.</w:t>
+              <w:t xml:space="preserve">Campanhas ativas no card; gestão na manutenção. Conciliação isolada da receita ordinária — o boletim de leitura não mistura os dois fluxos. Avisos de marco na caixa da home. Se houver uma campanha só, o atalho abre direto nela; se houver várias, a pessoa escolhe. Sem campanha ativa, o app avisa com clareza.</w:t>
             </w:r>
           </w:p>
           <w:tbl>
@@ -10575,7 +11150,7 @@
                       <w:sz w:val="19"/>
                       <w:szCs w:val="19"/>
                     </w:rPr>
-                    <w:t xml:space="preserve">Vê a meta, o quanto já entrou e contribui com clareza do destino.</w:t>
+                    <w:t xml:space="preserve">Vê a meta, o quanto já entrou e copia o Pix já identificado — sem perguntar “é o PIX da obra ou o do dízimo?”.</w:t>
                   </w:r>
                 </w:p>
               </w:tc>
@@ -15979,7 +16554,25 @@
                 <w:sz w:val="20"/>
                 <w:szCs w:val="20"/>
               </w:rPr>
-              <w:t xml:space="preserve">O calendário oficial: criar, publicar, capacidade, totem, quórum, geofence, salas, ofertas. O culto deixa de ser um post e vira um objeto de operação.</w:t>
+              <w:t xml:space="preserve">O calendário oficial: criar, publicar, capacidade, totem, quórum, geofence, salas, ofertas. O culto deixa de ser um post e vira um objeto de operação. O seletor de datas (mês, dia, OK) é o mesmo da </w:t>
+            </w:r>
+            <w:r>
+              <w:rPr>
+                <w:rFonts w:ascii="Calibri" w:cs="Calibri" w:eastAsia="Calibri" w:hAnsi="Calibri"/>
+                <w:color w:val="1E293B"/>
+                <w:sz w:val="20"/>
+                <w:szCs w:val="20"/>
+              </w:rPr>
+              <w:t xml:space="preserve">Gestão de Pequenos Grupos</w:t>
+            </w:r>
+            <w:r>
+              <w:rPr>
+                <w:rFonts w:ascii="Calibri" w:cs="Calibri" w:eastAsia="Calibri" w:hAnsi="Calibri"/>
+                <w:color w:val="1E293B"/>
+                <w:sz w:val="20"/>
+                <w:szCs w:val="20"/>
+              </w:rPr>
+              <w:t xml:space="preserve"> — a liderança não aprende dois calendários.</w:t>
             </w:r>
           </w:p>
           <w:p>
@@ -17709,7 +18302,7 @@
                 <w:szCs w:val="16"/>
                 <w:shd w:fill="EFF6FF" w:val="clear"/>
               </w:rPr>
-              <w:t xml:space="preserve">Painel small_groups_management</w:t>
+              <w:t xml:space="preserve">Painel small_groups_management · engrenagem</w:t>
             </w:r>
           </w:p>
           <w:p>
@@ -17741,7 +18334,188 @@
                 <w:sz w:val="20"/>
                 <w:szCs w:val="20"/>
               </w:rPr>
-              <w:t xml:space="preserve">Células com líder, anfitrião, dia, mapa, chamada e visitantes. O roteiro da semana pode ser a lição publicada da Trilha. Relatório de presença deixa de ser caderno.</w:t>
+              <w:t xml:space="preserve">A célula deixa de ser “toda quarta às 19h30” congelada no cadastro. Quem tem acesso abre o </w:t>
+            </w:r>
+            <w:r>
+              <w:rPr>
+                <w:rFonts w:ascii="Calibri" w:cs="Calibri" w:eastAsia="Calibri" w:hAnsi="Calibri"/>
+                <w:color w:val="1E293B"/>
+                <w:sz w:val="20"/>
+                <w:szCs w:val="20"/>
+              </w:rPr>
+              <w:t xml:space="preserve">mesmo calendário da Programação de Eventos</w:t>
+            </w:r>
+            <w:r>
+              <w:rPr>
+                <w:rFonts w:ascii="Calibri" w:cs="Calibri" w:eastAsia="Calibri" w:hAnsi="Calibri"/>
+                <w:color w:val="1E293B"/>
+                <w:sz w:val="20"/>
+                <w:szCs w:val="20"/>
+              </w:rPr>
+              <w:t xml:space="preserve"> (título *Datas das reuniões*), toca nos dias de interesse e define </w:t>
+            </w:r>
+            <w:r>
+              <w:rPr>
+                <w:rFonts w:ascii="Calibri" w:cs="Calibri" w:eastAsia="Calibri" w:hAnsi="Calibri"/>
+                <w:color w:val="1E293B"/>
+                <w:sz w:val="20"/>
+                <w:szCs w:val="20"/>
+              </w:rPr>
+              <w:t xml:space="preserve">horário próprio para cada data</w:t>
+            </w:r>
+            <w:r>
+              <w:rPr>
+                <w:rFonts w:ascii="Calibri" w:cs="Calibri" w:eastAsia="Calibri" w:hAnsi="Calibri"/>
+                <w:color w:val="1E293B"/>
+                <w:sz w:val="20"/>
+                <w:szCs w:val="20"/>
+              </w:rPr>
+              <w:t xml:space="preserve"> (HH:MM). A busca de anfitrião, líder e participante filtra de verdade por nome ou celular — não devolve uma lista alfabética incompleta. O celular do visitante usa a máscara da igreja, </w:t>
+            </w:r>
+            <w:r>
+              <w:rPr>
+                <w:rFonts w:ascii="Calibri" w:cs="Calibri" w:eastAsia="Calibri" w:hAnsi="Calibri"/>
+                <w:color w:val="1E293B"/>
+                <w:sz w:val="20"/>
+                <w:szCs w:val="20"/>
+                <w:shd w:fill="F1F5F9" w:val="clear"/>
+              </w:rPr>
+              <w:t xml:space="preserve">(11) 98765-4321</w:t>
+            </w:r>
+            <w:r>
+              <w:rPr>
+                <w:rFonts w:ascii="Calibri" w:cs="Calibri" w:eastAsia="Calibri" w:hAnsi="Calibri"/>
+                <w:color w:val="1E293B"/>
+                <w:sz w:val="20"/>
+                <w:szCs w:val="20"/>
+              </w:rPr>
+              <w:t xml:space="preserve">, e o nome vai para a fila de Recepção Familiar. O </w:t>
+            </w:r>
+            <w:r>
+              <w:rPr>
+                <w:rFonts w:ascii="Calibri" w:cs="Calibri" w:eastAsia="Calibri" w:hAnsi="Calibri"/>
+                <w:color w:val="1E293B"/>
+                <w:sz w:val="20"/>
+                <w:szCs w:val="20"/>
+              </w:rPr>
+              <w:t xml:space="preserve">Roteiro da semana</w:t>
+            </w:r>
+            <w:r>
+              <w:rPr>
+                <w:rFonts w:ascii="Calibri" w:cs="Calibri" w:eastAsia="Calibri" w:hAnsi="Calibri"/>
+                <w:color w:val="1E293B"/>
+                <w:sz w:val="20"/>
+                <w:szCs w:val="20"/>
+              </w:rPr>
+              <w:t xml:space="preserve"> pode ser escrito na hora (título, conteúdo e link ou PDF opcional) e publicado com </w:t>
+            </w:r>
+            <w:r>
+              <w:rPr>
+                <w:rFonts w:ascii="Calibri" w:cs="Calibri" w:eastAsia="Calibri" w:hAnsi="Calibri"/>
+                <w:color w:val="1E293B"/>
+                <w:sz w:val="20"/>
+                <w:szCs w:val="20"/>
+              </w:rPr>
+              <w:t xml:space="preserve">Publicar roteiro</w:t>
+            </w:r>
+            <w:r>
+              <w:rPr>
+                <w:rFonts w:ascii="Calibri" w:cs="Calibri" w:eastAsia="Calibri" w:hAnsi="Calibri"/>
+                <w:color w:val="1E293B"/>
+                <w:sz w:val="20"/>
+                <w:szCs w:val="20"/>
+              </w:rPr>
+              <w:t xml:space="preserve">; os temas da Trilha continuam só como atalho opcional. A </w:t>
+            </w:r>
+            <w:r>
+              <w:rPr>
+                <w:rFonts w:ascii="Calibri" w:cs="Calibri" w:eastAsia="Calibri" w:hAnsi="Calibri"/>
+                <w:color w:val="1E293B"/>
+                <w:sz w:val="20"/>
+                <w:szCs w:val="20"/>
+              </w:rPr>
+              <w:t xml:space="preserve">Chamada</w:t>
+            </w:r>
+            <w:r>
+              <w:rPr>
+                <w:rFonts w:ascii="Calibri" w:cs="Calibri" w:eastAsia="Calibri" w:hAnsi="Calibri"/>
+                <w:color w:val="1E293B"/>
+                <w:sz w:val="20"/>
+                <w:szCs w:val="20"/>
+              </w:rPr>
+              <w:t xml:space="preserve"> escolhe a data no calendário e lista o </w:t>
+            </w:r>
+            <w:r>
+              <w:rPr>
+                <w:rFonts w:ascii="Calibri" w:cs="Calibri" w:eastAsia="Calibri" w:hAnsi="Calibri"/>
+                <w:color w:val="1E293B"/>
+                <w:sz w:val="20"/>
+                <w:szCs w:val="20"/>
+              </w:rPr>
+              <w:t xml:space="preserve">nome completo</w:t>
+            </w:r>
+            <w:r>
+              <w:rPr>
+                <w:rFonts w:ascii="Calibri" w:cs="Calibri" w:eastAsia="Calibri" w:hAnsi="Calibri"/>
+                <w:color w:val="1E293B"/>
+                <w:sz w:val="20"/>
+                <w:szCs w:val="20"/>
+              </w:rPr>
+              <w:t xml:space="preserve"> de cada participante com caixa de seleção de presença. </w:t>
+            </w:r>
+            <w:r>
+              <w:rPr>
+                <w:rFonts w:ascii="Calibri" w:cs="Calibri" w:eastAsia="Calibri" w:hAnsi="Calibri"/>
+                <w:color w:val="1E293B"/>
+                <w:sz w:val="20"/>
+                <w:szCs w:val="20"/>
+              </w:rPr>
+              <w:t xml:space="preserve">Excluir grupo</w:t>
+            </w:r>
+            <w:r>
+              <w:rPr>
+                <w:rFonts w:ascii="Calibri" w:cs="Calibri" w:eastAsia="Calibri" w:hAnsi="Calibri"/>
+                <w:color w:val="1E293B"/>
+                <w:sz w:val="20"/>
+                <w:szCs w:val="20"/>
+              </w:rPr>
+              <w:t xml:space="preserve"> pede confirmação: apaga o cadastro da célula, a lista e as chamadas; anfitrião e líder </w:t>
+            </w:r>
+            <w:r>
+              <w:rPr>
+                <w:rFonts w:ascii="Calibri" w:cs="Calibri" w:eastAsia="Calibri" w:hAnsi="Calibri"/>
+                <w:color w:val="1E293B"/>
+                <w:sz w:val="20"/>
+                <w:szCs w:val="20"/>
+              </w:rPr>
+              <w:t xml:space="preserve">permanecem</w:t>
+            </w:r>
+            <w:r>
+              <w:rPr>
+                <w:rFonts w:ascii="Calibri" w:cs="Calibri" w:eastAsia="Calibri" w:hAnsi="Calibri"/>
+                <w:color w:val="1E293B"/>
+                <w:sz w:val="20"/>
+                <w:szCs w:val="20"/>
+              </w:rPr>
+              <w:t xml:space="preserve"> na igreja. Relatório espiritual (oração e notas pastorais) segue para o cuidado pastoral com </w:t>
+            </w:r>
+            <w:r>
+              <w:rPr>
+                <w:rFonts w:ascii="Calibri" w:cs="Calibri" w:eastAsia="Calibri" w:hAnsi="Calibri"/>
+                <w:color w:val="1E293B"/>
+                <w:sz w:val="20"/>
+                <w:szCs w:val="20"/>
+              </w:rPr>
+              <w:t xml:space="preserve">Enviar ao cuidado pastoral</w:t>
+            </w:r>
+            <w:r>
+              <w:rPr>
+                <w:rFonts w:ascii="Calibri" w:cs="Calibri" w:eastAsia="Calibri" w:hAnsi="Calibri"/>
+                <w:color w:val="1E293B"/>
+                <w:sz w:val="20"/>
+                <w:szCs w:val="20"/>
+              </w:rPr>
+              <w:t xml:space="preserve">.</w:t>
             </w:r>
           </w:p>
           <w:p>
@@ -17792,7 +18566,44 @@
                 <w:sz w:val="20"/>
                 <w:szCs w:val="20"/>
               </w:rPr>
-              <w:t xml:space="preserve"> / membros / presença. Card do membro. Avisos só para líderes de célula.</w:t>
+              <w:t xml:space="preserve">, reuniões (</w:t>
+            </w:r>
+            <w:r>
+              <w:rPr>
+                <w:rFonts w:ascii="Calibri" w:cs="Calibri" w:eastAsia="Calibri" w:hAnsi="Calibri"/>
+                <w:color w:val="1E293B"/>
+                <w:sz w:val="20"/>
+                <w:szCs w:val="20"/>
+                <w:shd w:fill="F1F5F9" w:val="clear"/>
+              </w:rPr>
+              <w:t xml:space="preserve">small_group_meetings</w:t>
+            </w:r>
+            <w:r>
+              <w:rPr>
+                <w:rFonts w:ascii="Calibri" w:cs="Calibri" w:eastAsia="Calibri" w:hAnsi="Calibri"/>
+                <w:color w:val="1E293B"/>
+                <w:sz w:val="20"/>
+                <w:szCs w:val="20"/>
+              </w:rPr>
+              <w:t xml:space="preserve">), membros e presença. Card </w:t>
+            </w:r>
+            <w:r>
+              <w:rPr>
+                <w:rFonts w:ascii="Calibri" w:cs="Calibri" w:eastAsia="Calibri" w:hAnsi="Calibri"/>
+                <w:color w:val="1E293B"/>
+                <w:sz w:val="20"/>
+                <w:szCs w:val="20"/>
+              </w:rPr>
+              <w:t xml:space="preserve">Minha Célula</w:t>
+            </w:r>
+            <w:r>
+              <w:rPr>
+                <w:rFonts w:ascii="Calibri" w:cs="Calibri" w:eastAsia="Calibri" w:hAnsi="Calibri"/>
+                <w:color w:val="1E293B"/>
+                <w:sz w:val="20"/>
+                <w:szCs w:val="20"/>
+              </w:rPr>
+              <w:t xml:space="preserve"> do membro. Visitante vai para a fila de Recepção Familiar. Relatório espiritual (oração e notas pastorais) segue para o cuidado pastoral. Avisos podem ir só a líderes de célula.</w:t>
             </w:r>
           </w:p>
           <w:tbl>
@@ -17857,7 +18668,7 @@
                       <w:sz w:val="19"/>
                       <w:szCs w:val="19"/>
                     </w:rPr>
-                    <w:t xml:space="preserve">Vive a célula com informação oficial: local, horário e estudo.</w:t>
+                    <w:t xml:space="preserve">Vê as datas em que a célula realmente se reúne, quem mais participa e o estudo daquela semana.</w:t>
                   </w:r>
                 </w:p>
               </w:tc>
@@ -17906,7 +18717,7 @@
                       <w:sz w:val="19"/>
                       <w:szCs w:val="19"/>
                     </w:rPr>
-                    <w:t xml:space="preserve">Rede de células visível, com presença e visitantes no mesmo sistema da igreja.</w:t>
+                    <w:t xml:space="preserve">Rede de células com calendário vivo, chamada objetiva, busca que encontra a pessoa e exclusão que não apaga o irmão do rol da igreja.</w:t>
                   </w:r>
                 </w:p>
               </w:tc>
@@ -18101,7 +18912,25 @@
                 <w:sz w:val="20"/>
                 <w:szCs w:val="20"/>
               </w:rPr>
-              <w:t xml:space="preserve">A tesouraria e a liderança abrem campanha com meta, prazo, capa e conciliação por depósito. O termômetro que o membro vê nasce daqui.</w:t>
+              <w:t xml:space="preserve">A tesouraria e a liderança abrem campanha com meta, prazo, capa e </w:t>
+            </w:r>
+            <w:r>
+              <w:rPr>
+                <w:rFonts w:ascii="Calibri" w:cs="Calibri" w:eastAsia="Calibri" w:hAnsi="Calibri"/>
+                <w:color w:val="1E293B"/>
+                <w:sz w:val="20"/>
+                <w:szCs w:val="20"/>
+              </w:rPr>
+              <w:t xml:space="preserve">centavos simbólicos de referência</w:t>
+            </w:r>
+            <w:r>
+              <w:rPr>
+                <w:rFonts w:ascii="Calibri" w:cs="Calibri" w:eastAsia="Calibri" w:hAnsi="Calibri"/>
+                <w:color w:val="1E293B"/>
+                <w:sz w:val="20"/>
+                <w:szCs w:val="20"/>
+              </w:rPr>
+              <w:t xml:space="preserve"> (ex.: 60 vira 0,60 no Pix). O Pix Copia e Cola do membro recebe esse sufixo sozinho; o depósito é reconhecido e fica fora da receita ordinária. O painel mostra desempenho: percentual da meta, doadores únicos, velocidade por dia e os centavos em uso.</w:t>
             </w:r>
           </w:p>
           <w:p>
@@ -18162,7 +18991,25 @@
                 <w:sz w:val="20"/>
                 <w:szCs w:val="20"/>
               </w:rPr>
-              <w:t xml:space="preserve"> isolada do ordinário. Card do dashboard e bloco no financeiro de leitura.</w:t>
+              <w:t xml:space="preserve"> isolada do ordinário. Card do dashboard e atalho </w:t>
+            </w:r>
+            <w:r>
+              <w:rPr>
+                <w:rFonts w:ascii="Calibri" w:cs="Calibri" w:eastAsia="Calibri" w:hAnsi="Calibri"/>
+                <w:color w:val="1E293B"/>
+                <w:sz w:val="20"/>
+                <w:szCs w:val="20"/>
+              </w:rPr>
+              <w:t xml:space="preserve">Eu quero… → Contribuir</w:t>
+            </w:r>
+            <w:r>
+              <w:rPr>
+                <w:rFonts w:ascii="Calibri" w:cs="Calibri" w:eastAsia="Calibri" w:hAnsi="Calibri"/>
+                <w:color w:val="1E293B"/>
+                <w:sz w:val="20"/>
+                <w:szCs w:val="20"/>
+              </w:rPr>
+              <w:t xml:space="preserve">. O boletim financeiro de leitura não mistura campanha com dízimo.</w:t>
             </w:r>
           </w:p>
           <w:tbl>
@@ -23944,7 +24791,7 @@
           <w:sz w:val="20"/>
           <w:szCs w:val="20"/>
         </w:rPr>
-        <w:t xml:space="preserve"> (pastoral, células, escalas, mural, RD, ofertas e campanhas).</w:t>
+        <w:t xml:space="preserve"> (pastoral, células com datas reais, escalas com troca, mural, RD, ofertas e campanhas pelo mesmo Contribuir).</w:t>
       </w:r>
     </w:p>
     <w:p>
@@ -24011,7 +24858,25 @@
           <w:sz w:val="20"/>
           <w:szCs w:val="20"/>
         </w:rPr>
-        <w:t xml:space="preserve">Este documento descreve o produto como ele está no código em 26 de agosto de 2026. Telas condicionais (QR, estacionamento, servos, manutenção) aparecem somente quando o papel, o evento e os parâmetros da instância autorizam — e isso, em si, já é parte da proposta comercial: </w:t>
+        <w:t xml:space="preserve">Este documento descreve o produto como ele está no código em </w:t>
+      </w:r>
+      <w:r>
+        <w:rPr>
+          <w:rFonts w:ascii="Calibri" w:cs="Calibri" w:eastAsia="Calibri" w:hAnsi="Calibri"/>
+          <w:color w:val="1E293B"/>
+          <w:sz w:val="20"/>
+          <w:szCs w:val="20"/>
+        </w:rPr>
+        <w:t xml:space="preserve">28 de agosto de 2026</w:t>
+      </w:r>
+      <w:r>
+        <w:rPr>
+          <w:rFonts w:ascii="Calibri" w:cs="Calibri" w:eastAsia="Calibri" w:hAnsi="Calibri"/>
+          <w:color w:val="1E293B"/>
+          <w:sz w:val="20"/>
+          <w:szCs w:val="20"/>
+        </w:rPr>
+        <w:t xml:space="preserve">. Telas condicionais (QR, estacionamento, servos, manutenção) aparecem somente quando o papel, o evento e os parâmetros da instância autorizam — e isso, em si, já é parte da proposta comercial: </w:t>
       </w:r>
       <w:r>
         <w:rPr>

</xml_diff>

<commit_message>
Corrige a régua de acolhimento e o mural de generosidade para não duplicar tarefas em crianças, falhar a foto nem esconder o item no menu, e atualiza a análise institucional das telas.
Co-authored-by: Cursor <cursoragent@cursor.com>
</commit_message>
<xml_diff>
--- a/pdfs/ANALISE_INSTITUCIONAL_TELAS.docx
+++ b/pdfs/ANALISE_INSTITUCIONAL_TELAS.docx
@@ -235,7 +235,7 @@
           <w:sz w:val="20"/>
           <w:szCs w:val="20"/>
         </w:rPr>
-        <w:t xml:space="preserve"> — Índice, Painel, Perfil, eventos, ofertas, pastoral, células, campanhas, voluntariado, financeiro de leitura e escalas.</w:t>
+        <w:t xml:space="preserve"> — Índice, Painel, Perfil, eventos, ofertas, pastoral, células, campanhas, voluntariado, mural de generosidade, financeiro de leitura e escalas.</w:t>
       </w:r>
     </w:p>
     <w:p>
@@ -722,7 +722,7 @@
                 <w:sz w:val="18"/>
                 <w:szCs w:val="18"/>
               </w:rPr>
-              <w:t xml:space="preserve">Pastoral, agenda pastoral, aniversariantes, membros, mapa, células</w:t>
+              <w:t xml:space="preserve">Pastoral, agenda pastoral, aniversariantes, membros, mapa, células, Régua de Acolhimento</w:t>
             </w:r>
           </w:p>
         </w:tc>
@@ -751,7 +751,7 @@
                 <w:sz w:val="18"/>
                 <w:szCs w:val="18"/>
               </w:rPr>
-              <w:t xml:space="preserve">Cuidado pastoral, célula com datas reais e vínculo sem exposição indevida</w:t>
+              <w:t xml:space="preserve">Cuidado pastoral, célula com datas reais, visitante acompanhado em etapas após a recepção</w:t>
             </w:r>
           </w:p>
         </w:tc>
@@ -900,7 +900,7 @@
                 <w:sz w:val="18"/>
                 <w:szCs w:val="18"/>
               </w:rPr>
-              <w:t xml:space="preserve">Escalas, troca pontual, mural de vagas, estacionamento</w:t>
+              <w:t xml:space="preserve">Escalas, troca pontual, mural de vagas, mural de generosidade, estacionamento</w:t>
             </w:r>
           </w:p>
         </w:tc>
@@ -929,7 +929,7 @@
                 <w:sz w:val="18"/>
                 <w:szCs w:val="18"/>
               </w:rPr>
-              <w:t xml:space="preserve">Escala visível, substituição combinada e dons reconhecidos</w:t>
+              <w:t xml:space="preserve">Escala visível, substituição combinada, dons reconhecidos e doação/empréstimo entre irmãos</w:t>
             </w:r>
           </w:p>
         </w:tc>
@@ -3443,7 +3443,25 @@
                 <w:sz w:val="20"/>
                 <w:szCs w:val="20"/>
               </w:rPr>
-              <w:t xml:space="preserve"> na manutenção. Evita cadastro improvisado em papel.</w:t>
+              <w:t xml:space="preserve"> na manutenção. A aprovação dispara a </w:t>
+            </w:r>
+            <w:r>
+              <w:rPr>
+                <w:rFonts w:ascii="Calibri" w:cs="Calibri" w:eastAsia="Calibri" w:hAnsi="Calibri"/>
+                <w:color w:val="1E293B"/>
+                <w:sz w:val="20"/>
+                <w:szCs w:val="20"/>
+              </w:rPr>
+              <w:t xml:space="preserve">Régua de Acolhimento</w:t>
+            </w:r>
+            <w:r>
+              <w:rPr>
+                <w:rFonts w:ascii="Calibri" w:cs="Calibri" w:eastAsia="Calibri" w:hAnsi="Calibri"/>
+                <w:color w:val="1E293B"/>
+                <w:sz w:val="20"/>
+                <w:szCs w:val="20"/>
+              </w:rPr>
+              <w:t xml:space="preserve">. Evita cadastro improvisado em papel.</w:t>
             </w:r>
           </w:p>
           <w:tbl>
@@ -3959,7 +3977,25 @@
                 <w:sz w:val="20"/>
                 <w:szCs w:val="20"/>
               </w:rPr>
-              <w:t xml:space="preserve"> reúne Dízimos e Ofertas e Campanhas e Projetos; o pedido de oração abre o Coração Aberto. Rodapé de sessão: Encerrar sessão. Engrenagem de manutenção à direita, só com permissão. Marca d’água da instância. A caixa de avisos recarrega em tempo real e não repete o mesmo recado já visto. </w:t>
+              <w:t xml:space="preserve"> reúne Dízimos e Ofertas e Campanhas e Projetos; o pedido de oração abre o Coração Aberto. Rodapé de sessão: Encerrar sessão. Engrenagem de manutenção à direita, só com permissão. Marca d’água da instância. A caixa de avisos recarrega em tempo real e não repete o mesmo recado já visto — inclui recados do culto, trocas de escala, marcos de campanha, vagas ministeriais e </w:t>
+            </w:r>
+            <w:r>
+              <w:rPr>
+                <w:rFonts w:ascii="Calibri" w:cs="Calibri" w:eastAsia="Calibri" w:hAnsi="Calibri"/>
+                <w:color w:val="1E293B"/>
+                <w:sz w:val="20"/>
+                <w:szCs w:val="20"/>
+              </w:rPr>
+              <w:t xml:space="preserve">avisos do Mural de Generosidade</w:t>
+            </w:r>
+            <w:r>
+              <w:rPr>
+                <w:rFonts w:ascii="Calibri" w:cs="Calibri" w:eastAsia="Calibri" w:hAnsi="Calibri"/>
+                <w:color w:val="1E293B"/>
+                <w:sz w:val="20"/>
+                <w:szCs w:val="20"/>
+              </w:rPr>
+              <w:t xml:space="preserve">. </w:t>
             </w:r>
             <w:r>
               <w:rPr>
@@ -4286,7 +4322,25 @@
                 <w:sz w:val="20"/>
                 <w:szCs w:val="20"/>
               </w:rPr>
-              <w:t xml:space="preserve">É o corredor interno da plataforma, separado com clareza. Na parte de cima, só a vida do membro: Início, Perfil, Dados cadastrais, Família, Reembolsos, Financeiro, Coração Aberto, Trilha de Discipulado, Minha Célula, Escalas, Mural de Oportunidades, Sugestões e Redes Sociais. Dízimos e Campanhas não aparecem aqui: já estão em </w:t>
+              <w:t xml:space="preserve">É o corredor interno da plataforma, separado com clareza. Na parte de cima, só a vida do membro: Início, Perfil, Financeiro, Minha Célula, Escalas, Mural de Oportunidades, </w:t>
+            </w:r>
+            <w:r>
+              <w:rPr>
+                <w:rFonts w:ascii="Calibri" w:cs="Calibri" w:eastAsia="Calibri" w:hAnsi="Calibri"/>
+                <w:color w:val="1E293B"/>
+                <w:sz w:val="20"/>
+                <w:szCs w:val="20"/>
+              </w:rPr>
+              <w:t xml:space="preserve">Mural de Generosidade</w:t>
+            </w:r>
+            <w:r>
+              <w:rPr>
+                <w:rFonts w:ascii="Calibri" w:cs="Calibri" w:eastAsia="Calibri" w:hAnsi="Calibri"/>
+                <w:color w:val="1E293B"/>
+                <w:sz w:val="20"/>
+                <w:szCs w:val="20"/>
+              </w:rPr>
+              <w:t xml:space="preserve">, Sugestões, Redes Sociais e Sobre o Conecta+. Dízimos e Campanhas não aparecem aqui: já estão em </w:t>
             </w:r>
             <w:r>
               <w:rPr>
@@ -4734,7 +4788,7 @@
                 <w:sz w:val="20"/>
                 <w:szCs w:val="20"/>
               </w:rPr>
-              <w:t xml:space="preserve">. Inclui células (</w:t>
+              <w:t xml:space="preserve">. No caminho publicado, só Célula (</w:t>
             </w:r>
             <w:r>
               <w:rPr>
@@ -4753,7 +4807,7 @@
                 <w:sz w:val="20"/>
                 <w:szCs w:val="20"/>
               </w:rPr>
-              <w:t xml:space="preserve">), campanhas (</w:t>
+              <w:t xml:space="preserve">) e Mural de Oportunidades (</w:t>
             </w:r>
             <w:r>
               <w:rPr>
@@ -4763,16 +4817,34 @@
                 <w:szCs w:val="20"/>
                 <w:shd w:fill="F1F5F9" w:val="clear"/>
               </w:rPr>
-              <w:t xml:space="preserve">campaign_card</w:t>
-            </w:r>
-            <w:r>
-              <w:rPr>
-                <w:rFonts w:ascii="Calibri" w:cs="Calibri" w:eastAsia="Calibri" w:hAnsi="Calibri"/>
-                <w:color w:val="1E293B"/>
-                <w:sz w:val="20"/>
-                <w:szCs w:val="20"/>
-              </w:rPr>
-              <w:t xml:space="preserve">) e mural (</w:t>
+              <w:t xml:space="preserve">opportunity_mural_card</w:t>
+            </w:r>
+            <w:r>
+              <w:rPr>
+                <w:rFonts w:ascii="Calibri" w:cs="Calibri" w:eastAsia="Calibri" w:hAnsi="Calibri"/>
+                <w:color w:val="1E293B"/>
+                <w:sz w:val="20"/>
+                <w:szCs w:val="20"/>
+              </w:rPr>
+              <w:t xml:space="preserve">) permanecem no carrossel; o </w:t>
+            </w:r>
+            <w:r>
+              <w:rPr>
+                <w:rFonts w:ascii="Calibri" w:cs="Calibri" w:eastAsia="Calibri" w:hAnsi="Calibri"/>
+                <w:color w:val="1E293B"/>
+                <w:sz w:val="20"/>
+                <w:szCs w:val="20"/>
+              </w:rPr>
+              <w:t xml:space="preserve">Mural de Generosidade</w:t>
+            </w:r>
+            <w:r>
+              <w:rPr>
+                <w:rFonts w:ascii="Calibri" w:cs="Calibri" w:eastAsia="Calibri" w:hAnsi="Calibri"/>
+                <w:color w:val="1E293B"/>
+                <w:sz w:val="20"/>
+                <w:szCs w:val="20"/>
+              </w:rPr>
+              <w:t xml:space="preserve"> abre rota própria (</w:t>
             </w:r>
             <w:r>
               <w:rPr>
@@ -4782,16 +4854,16 @@
                 <w:szCs w:val="20"/>
                 <w:shd w:fill="F1F5F9" w:val="clear"/>
               </w:rPr>
-              <w:t xml:space="preserve">opportunity_mural_card</w:t>
-            </w:r>
-            <w:r>
-              <w:rPr>
-                <w:rFonts w:ascii="Calibri" w:cs="Calibri" w:eastAsia="Calibri" w:hAnsi="Calibri"/>
-                <w:color w:val="1E293B"/>
-                <w:sz w:val="20"/>
-                <w:szCs w:val="20"/>
-              </w:rPr>
-              <w:t xml:space="preserve">). No modo da família, o card preenche a coluna útil da tela (título, textos e botões na mesma largura). Rodapé </w:t>
+              <w:t xml:space="preserve">/mural-generosidade</w:t>
+            </w:r>
+            <w:r>
+              <w:rPr>
+                <w:rFonts w:ascii="Calibri" w:cs="Calibri" w:eastAsia="Calibri" w:hAnsi="Calibri"/>
+                <w:color w:val="1E293B"/>
+                <w:sz w:val="20"/>
+                <w:szCs w:val="20"/>
+              </w:rPr>
+              <w:t xml:space="preserve">), sem card extra no Painel. No modo da família, o card preenche a coluna útil da tela (título, textos e botões na mesma largura). Rodapé </w:t>
             </w:r>
             <w:r>
               <w:rPr>
@@ -11463,7 +11535,25 @@
                 <w:sz w:val="20"/>
                 <w:szCs w:val="20"/>
               </w:rPr>
-              <w:t xml:space="preserve">. Aviso pode ser só para quem tem o perfil compatível.</w:t>
+              <w:t xml:space="preserve">. Aviso pode ser só para quem tem o perfil compatível. O </w:t>
+            </w:r>
+            <w:r>
+              <w:rPr>
+                <w:rFonts w:ascii="Calibri" w:cs="Calibri" w:eastAsia="Calibri" w:hAnsi="Calibri"/>
+                <w:color w:val="1E293B"/>
+                <w:sz w:val="20"/>
+                <w:szCs w:val="20"/>
+              </w:rPr>
+              <w:t xml:space="preserve">Mural de Generosidade</w:t>
+            </w:r>
+            <w:r>
+              <w:rPr>
+                <w:rFonts w:ascii="Calibri" w:cs="Calibri" w:eastAsia="Calibri" w:hAnsi="Calibri"/>
+                <w:color w:val="1E293B"/>
+                <w:sz w:val="20"/>
+                <w:szCs w:val="20"/>
+              </w:rPr>
+              <w:t xml:space="preserve"> é outra superfície — doações e empréstimos, com moderação.</w:t>
             </w:r>
           </w:p>
           <w:tbl>
@@ -11643,6 +11733,403 @@
                       <w:szCs w:val="20"/>
                     </w:rPr>
                     <w:t xml:space="preserve">Espaço para imagem — Mural de Oportunidades</w:t>
+                  </w:r>
+                </w:p>
+                <w:p>
+                  <w:pPr>
+                    <w:jc w:val="center"/>
+                  </w:pPr>
+                  <w:r>
+                    <w:rPr>
+                      <w:rFonts w:ascii="Calibri" w:cs="Calibri" w:eastAsia="Calibri" w:hAnsi="Calibri"/>
+                      <w:i/>
+                      <w:iCs/>
+                      <w:color w:val="64748B"/>
+                      <w:sz w:val="18"/>
+                      <w:szCs w:val="18"/>
+                    </w:rPr>
+                    <w:t xml:space="preserve">No Word: clique nesta caixa → Inserir → Imagens → Esta pasta (ou Arrastar a captura para cá).</w:t>
+                  </w:r>
+                </w:p>
+              </w:tc>
+            </w:tr>
+          </w:tbl>
+          <w:p/>
+        </w:tc>
+      </w:tr>
+    </w:tbl>
+    <w:p>
+      <w:pPr>
+        <w:spacing w:after="200"/>
+      </w:pPr>
+      <w:r>
+        <w:t xml:space="preserve"/>
+      </w:r>
+    </w:p>
+    <w:tbl>
+      <w:tblPr>
+        <w:tblW w:type="pct" w:w="100%"/>
+        <w:tblBorders>
+          <w:top w:val="single" w:color="auto" w:sz="4"/>
+          <w:left w:val="single" w:color="auto" w:sz="4"/>
+          <w:bottom w:val="single" w:color="auto" w:sz="4"/>
+          <w:right w:val="single" w:color="auto" w:sz="4"/>
+          <w:insideH w:val="single" w:color="auto" w:sz="4"/>
+          <w:insideV w:val="single" w:color="auto" w:sz="4"/>
+        </w:tblBorders>
+      </w:tblPr>
+      <w:tblGrid>
+        <w:gridCol w:w="100"/>
+      </w:tblGrid>
+      <w:tr>
+        <w:tc>
+          <w:tcPr>
+            <w:tcW w:type="dxa" w:w="10320"/>
+            <w:tcBorders>
+              <w:top w:val="single" w:color="E2E8F0" w:sz="8"/>
+              <w:left w:val="single" w:color="E2E8F0" w:sz="8"/>
+              <w:bottom w:val="single" w:color="E2E8F0" w:sz="8"/>
+              <w:right w:val="single" w:color="E2E8F0" w:sz="8"/>
+            </w:tcBorders>
+            <w:shd w:fill="FFFFFF" w:val="clear"/>
+            <w:tcMar>
+              <w:top w:type="dxa" w:w="160"/>
+              <w:left w:type="dxa" w:w="180"/>
+              <w:bottom w:type="dxa" w:w="160"/>
+              <w:right w:type="dxa" w:w="180"/>
+            </w:tcMar>
+          </w:tcPr>
+          <w:p>
+            <w:pPr>
+              <w:pStyle w:val="Heading2"/>
+              <w:keepNext/>
+              <w:spacing w:after="80" w:before="0"/>
+            </w:pPr>
+            <w:r>
+              <w:rPr>
+                <w:rFonts w:ascii="Calibri" w:cs="Calibri" w:eastAsia="Calibri" w:hAnsi="Calibri"/>
+                <w:b/>
+                <w:bCs/>
+                <w:color w:val="1E3A8A"/>
+                <w:sz w:val="29"/>
+                <w:szCs w:val="29"/>
+              </w:rPr>
+              <w:t xml:space="preserve">Mural de Generosidade</w:t>
+            </w:r>
+          </w:p>
+          <w:p>
+            <w:pPr>
+              <w:keepNext/>
+              <w:spacing w:after="120"/>
+            </w:pPr>
+            <w:r>
+              <w:rPr>
+                <w:rFonts w:ascii="Consolas" w:cs="Consolas" w:eastAsia="Consolas" w:hAnsi="Consolas"/>
+                <w:color w:val="1E40AF"/>
+                <w:sz w:val="16"/>
+                <w:szCs w:val="16"/>
+                <w:shd w:fill="EFF6FF" w:val="clear"/>
+              </w:rPr>
+              <w:t xml:space="preserve">Rota /mural-generosidade · menu menu_generosity_mural</w:t>
+            </w:r>
+          </w:p>
+          <w:p>
+            <w:pPr>
+              <w:pStyle w:val="Heading3"/>
+              <w:keepNext/>
+              <w:spacing w:after="80" w:before="160"/>
+            </w:pPr>
+            <w:r>
+              <w:rPr>
+                <w:rFonts w:ascii="Calibri" w:cs="Calibri" w:eastAsia="Calibri" w:hAnsi="Calibri"/>
+                <w:b/>
+                <w:bCs/>
+                <w:color w:val="1E40AF"/>
+                <w:sz w:val="23"/>
+                <w:szCs w:val="23"/>
+              </w:rPr>
+              <w:t xml:space="preserve">Descrição comercial</w:t>
+            </w:r>
+          </w:p>
+          <w:p>
+            <w:pPr>
+              <w:spacing w:after="140" w:line="276" w:lineRule="auto"/>
+            </w:pPr>
+            <w:r>
+              <w:rPr>
+                <w:rFonts w:ascii="Calibri" w:cs="Calibri" w:eastAsia="Calibri" w:hAnsi="Calibri"/>
+                <w:color w:val="1E293B"/>
+                <w:sz w:val="20"/>
+                <w:szCs w:val="20"/>
+              </w:rPr>
+              <w:t xml:space="preserve">A comunidade troca doações e pedidos de empréstimo — móveis, equipamentos de saúde, vestuário, livros — sem transformar o mural em classificados públicos. Nada entra no ar sem a liderança aprovar. O feed não mostra telefone: quem tem interesse avisa a igreja, e a equipe faz a ponte.</w:t>
+            </w:r>
+          </w:p>
+          <w:p>
+            <w:pPr>
+              <w:pStyle w:val="Heading3"/>
+              <w:keepNext/>
+              <w:spacing w:after="80" w:before="160"/>
+            </w:pPr>
+            <w:r>
+              <w:rPr>
+                <w:rFonts w:ascii="Calibri" w:cs="Calibri" w:eastAsia="Calibri" w:hAnsi="Calibri"/>
+                <w:b/>
+                <w:bCs/>
+                <w:color w:val="1E40AF"/>
+                <w:sz w:val="23"/>
+                <w:szCs w:val="23"/>
+              </w:rPr>
+              <w:t xml:space="preserve">Propósito e conexões</w:t>
+            </w:r>
+          </w:p>
+          <w:p>
+            <w:pPr>
+              <w:spacing w:after="160" w:line="276" w:lineRule="auto"/>
+            </w:pPr>
+            <w:r>
+              <w:rPr>
+                <w:rFonts w:ascii="Calibri" w:cs="Calibri" w:eastAsia="Calibri" w:hAnsi="Calibri"/>
+                <w:color w:val="1E293B"/>
+                <w:sz w:val="20"/>
+                <w:szCs w:val="20"/>
+              </w:rPr>
+              <w:t xml:space="preserve">Anúncios em </w:t>
+            </w:r>
+            <w:r>
+              <w:rPr>
+                <w:rFonts w:ascii="Calibri" w:cs="Calibri" w:eastAsia="Calibri" w:hAnsi="Calibri"/>
+                <w:color w:val="1E293B"/>
+                <w:sz w:val="20"/>
+                <w:szCs w:val="20"/>
+                <w:shd w:fill="F1F5F9" w:val="clear"/>
+              </w:rPr>
+              <w:t xml:space="preserve">generosity_posts</w:t>
+            </w:r>
+            <w:r>
+              <w:rPr>
+                <w:rFonts w:ascii="Calibri" w:cs="Calibri" w:eastAsia="Calibri" w:hAnsi="Calibri"/>
+                <w:color w:val="1E293B"/>
+                <w:sz w:val="20"/>
+                <w:szCs w:val="20"/>
+              </w:rPr>
+              <w:t xml:space="preserve"> nascem como </w:t>
+            </w:r>
+            <w:r>
+              <w:rPr>
+                <w:rFonts w:ascii="Calibri" w:cs="Calibri" w:eastAsia="Calibri" w:hAnsi="Calibri"/>
+                <w:color w:val="1E293B"/>
+                <w:sz w:val="20"/>
+                <w:szCs w:val="20"/>
+                <w:shd w:fill="F1F5F9" w:val="clear"/>
+              </w:rPr>
+              <w:t xml:space="preserve">pendente</w:t>
+            </w:r>
+            <w:r>
+              <w:rPr>
+                <w:rFonts w:ascii="Calibri" w:cs="Calibri" w:eastAsia="Calibri" w:hAnsi="Calibri"/>
+                <w:color w:val="1E293B"/>
+                <w:sz w:val="20"/>
+                <w:szCs w:val="20"/>
+              </w:rPr>
+              <w:t xml:space="preserve">. Foto opcional no bucket privado. Interesse gera aviso interno, sem WhatsApp no mural do membro. A liderança opera em </w:t>
+            </w:r>
+            <w:r>
+              <w:rPr>
+                <w:rFonts w:ascii="Calibri" w:cs="Calibri" w:eastAsia="Calibri" w:hAnsi="Calibri"/>
+                <w:color w:val="1E293B"/>
+                <w:sz w:val="20"/>
+                <w:szCs w:val="20"/>
+              </w:rPr>
+              <w:t xml:space="preserve">Moderação do Mural</w:t>
+            </w:r>
+            <w:r>
+              <w:rPr>
+                <w:rFonts w:ascii="Calibri" w:cs="Calibri" w:eastAsia="Calibri" w:hAnsi="Calibri"/>
+                <w:color w:val="1E293B"/>
+                <w:sz w:val="20"/>
+                <w:szCs w:val="20"/>
+              </w:rPr>
+              <w:t xml:space="preserve">. Avisos de aprovação, recusa e mediação aparecem na caixa da home. Exige vínculo ativo de membresia. Não entra no carrossel do Painel.</w:t>
+            </w:r>
+          </w:p>
+          <w:tbl>
+            <w:tblPr>
+              <w:tblW w:type="pct" w:w="100%"/>
+              <w:tblBorders>
+                <w:top w:val="single" w:color="auto" w:sz="4"/>
+                <w:left w:val="single" w:color="auto" w:sz="4"/>
+                <w:bottom w:val="single" w:color="auto" w:sz="4"/>
+                <w:right w:val="single" w:color="auto" w:sz="4"/>
+                <w:insideH w:val="single" w:color="auto" w:sz="4"/>
+                <w:insideV w:val="single" w:color="auto" w:sz="4"/>
+              </w:tblBorders>
+            </w:tblPr>
+            <w:tblGrid>
+              <w:gridCol w:w="5060"/>
+              <w:gridCol w:w="5060"/>
+            </w:tblGrid>
+            <w:tr>
+              <w:tc>
+                <w:tcPr>
+                  <w:tcW w:type="dxa" w:w="5060"/>
+                  <w:tcBorders>
+                    <w:top w:val="none" w:color="FFFFFF" w:sz="0"/>
+                    <w:left w:val="single" w:color="15803D" w:sz="24"/>
+                    <w:bottom w:val="none" w:color="FFFFFF" w:sz="0"/>
+                    <w:right w:val="none" w:color="FFFFFF" w:sz="0"/>
+                  </w:tcBorders>
+                  <w:shd w:fill="F0FDF4" w:val="clear"/>
+                  <w:tcMar>
+                    <w:top w:type="dxa" w:w="120"/>
+                    <w:left w:type="dxa" w:w="140"/>
+                    <w:bottom w:type="dxa" w:w="120"/>
+                    <w:right w:type="dxa" w:w="140"/>
+                  </w:tcMar>
+                  <w:vAlign w:val="top"/>
+                </w:tcPr>
+                <w:p>
+                  <w:pPr>
+                    <w:spacing w:after="80"/>
+                  </w:pPr>
+                  <w:r>
+                    <w:rPr>
+                      <w:rFonts w:ascii="Calibri" w:cs="Calibri" w:eastAsia="Calibri" w:hAnsi="Calibri"/>
+                      <w:b/>
+                      <w:bCs/>
+                      <w:color w:val="166534"/>
+                      <w:sz w:val="20"/>
+                      <w:szCs w:val="20"/>
+                    </w:rPr>
+                    <w:t xml:space="preserve">Visão do Usuário Final</w:t>
+                  </w:r>
+                </w:p>
+                <w:p>
+                  <w:pPr>
+                    <w:spacing w:after="0" w:line="276" w:lineRule="auto"/>
+                  </w:pPr>
+                  <w:r>
+                    <w:rPr>
+                      <w:rFonts w:ascii="Calibri" w:cs="Calibri" w:eastAsia="Calibri" w:hAnsi="Calibri"/>
+                      <w:color w:val="1E293B"/>
+                      <w:sz w:val="19"/>
+                      <w:szCs w:val="19"/>
+                    </w:rPr>
+                    <w:t xml:space="preserve">Publica o que pode doar ou o que precisa emprestado, acompanha o próprio anúncio e manifesta interesse sem expor o celular.</w:t>
+                  </w:r>
+                </w:p>
+              </w:tc>
+              <w:tc>
+                <w:tcPr>
+                  <w:tcW w:type="dxa" w:w="5060"/>
+                  <w:tcBorders>
+                    <w:top w:val="none" w:color="FFFFFF" w:sz="0"/>
+                    <w:left w:val="single" w:color="1D4ED8" w:sz="24"/>
+                    <w:bottom w:val="none" w:color="FFFFFF" w:sz="0"/>
+                    <w:right w:val="none" w:color="FFFFFF" w:sz="0"/>
+                  </w:tcBorders>
+                  <w:shd w:fill="EFF6FF" w:val="clear"/>
+                  <w:tcMar>
+                    <w:top w:type="dxa" w:w="120"/>
+                    <w:left w:type="dxa" w:w="140"/>
+                    <w:bottom w:type="dxa" w:w="120"/>
+                    <w:right w:type="dxa" w:w="140"/>
+                  </w:tcMar>
+                  <w:vAlign w:val="top"/>
+                </w:tcPr>
+                <w:p>
+                  <w:pPr>
+                    <w:spacing w:after="80"/>
+                  </w:pPr>
+                  <w:r>
+                    <w:rPr>
+                      <w:rFonts w:ascii="Calibri" w:cs="Calibri" w:eastAsia="Calibri" w:hAnsi="Calibri"/>
+                      <w:b/>
+                      <w:bCs/>
+                      <w:color w:val="1E3A8A"/>
+                      <w:sz w:val="20"/>
+                      <w:szCs w:val="20"/>
+                    </w:rPr>
+                    <w:t xml:space="preserve">Visão da Administração</w:t>
+                  </w:r>
+                </w:p>
+                <w:p>
+                  <w:pPr>
+                    <w:spacing w:after="0" w:line="276" w:lineRule="auto"/>
+                  </w:pPr>
+                  <w:r>
+                    <w:rPr>
+                      <w:rFonts w:ascii="Calibri" w:cs="Calibri" w:eastAsia="Calibri" w:hAnsi="Calibri"/>
+                      <w:color w:val="1E293B"/>
+                      <w:sz w:val="19"/>
+                      <w:szCs w:val="19"/>
+                    </w:rPr>
+                    <w:t xml:space="preserve">Fila de moderação, mediação de contato e encerramento do anúncio — a igreja permanece no meio, não o aplicativo.</w:t>
+                  </w:r>
+                </w:p>
+              </w:tc>
+            </w:tr>
+          </w:tbl>
+          <w:p>
+            <w:pPr>
+              <w:spacing w:after="160"/>
+            </w:pPr>
+            <w:r>
+              <w:t xml:space="preserve"/>
+            </w:r>
+          </w:p>
+          <w:tbl>
+            <w:tblPr>
+              <w:tblW w:type="pct" w:w="100%"/>
+              <w:tblBorders>
+                <w:top w:val="single" w:color="auto" w:sz="4"/>
+                <w:left w:val="single" w:color="auto" w:sz="4"/>
+                <w:bottom w:val="single" w:color="auto" w:sz="4"/>
+                <w:right w:val="single" w:color="auto" w:sz="4"/>
+                <w:insideH w:val="single" w:color="auto" w:sz="4"/>
+                <w:insideV w:val="single" w:color="auto" w:sz="4"/>
+              </w:tblBorders>
+            </w:tblPr>
+            <w:tblGrid>
+              <w:gridCol w:w="100"/>
+            </w:tblGrid>
+            <w:tr>
+              <w:trPr>
+                <w:trHeight w:val="2800" w:hRule="atLeast"/>
+              </w:trPr>
+              <w:tc>
+                <w:tcPr>
+                  <w:tcW w:type="dxa" w:w="10320"/>
+                  <w:tcBorders>
+                    <w:top w:val="dashed" w:color="94A3B8" w:sz="8"/>
+                    <w:left w:val="dashed" w:color="94A3B8" w:sz="8"/>
+                    <w:bottom w:val="dashed" w:color="94A3B8" w:sz="8"/>
+                    <w:right w:val="dashed" w:color="94A3B8" w:sz="8"/>
+                  </w:tcBorders>
+                  <w:shd w:fill="F8FAFC" w:val="clear"/>
+                  <w:tcMar>
+                    <w:top w:type="dxa" w:w="200"/>
+                    <w:left w:type="dxa" w:w="200"/>
+                    <w:bottom w:type="dxa" w:w="200"/>
+                    <w:right w:type="dxa" w:w="200"/>
+                  </w:tcMar>
+                  <w:vAlign w:val="center"/>
+                </w:tcPr>
+                <w:p>
+                  <w:pPr>
+                    <w:spacing w:after="60"/>
+                    <w:jc w:val="center"/>
+                  </w:pPr>
+                  <w:r>
+                    <w:rPr>
+                      <w:rFonts w:ascii="Calibri" w:cs="Calibri" w:eastAsia="Calibri" w:hAnsi="Calibri"/>
+                      <w:b/>
+                      <w:bCs/>
+                      <w:color w:val="475569"/>
+                      <w:sz w:val="20"/>
+                      <w:szCs w:val="20"/>
+                    </w:rPr>
+                    <w:t xml:space="preserve">Espaço para imagem — Mural de Generosidade</w:t>
                   </w:r>
                 </w:p>
                 <w:p>
@@ -17974,7 +18461,25 @@
                 <w:sz w:val="20"/>
                 <w:szCs w:val="20"/>
               </w:rPr>
-              <w:t xml:space="preserve">A fila sagrada: pedidos do Coração Aberto chegam aqui para o pastor e a intercessão tratarem com método, sem perder sigilo. A agenda de horários da pastoral também se opera daqui.</w:t>
+              <w:t xml:space="preserve">A fila sagrada: pedidos do Coração Aberto chegam aqui para o pastor e a intercessão tratarem com método, sem perder sigilo. A agenda de horários da pastoral também se opera daqui. No mesmo painel, o destaque </w:t>
+            </w:r>
+            <w:r>
+              <w:rPr>
+                <w:rFonts w:ascii="Calibri" w:cs="Calibri" w:eastAsia="Calibri" w:hAnsi="Calibri"/>
+                <w:color w:val="1E293B"/>
+                <w:sz w:val="20"/>
+                <w:szCs w:val="20"/>
+              </w:rPr>
+              <w:t xml:space="preserve">Visitantes sem retorno</w:t>
+            </w:r>
+            <w:r>
+              <w:rPr>
+                <w:rFonts w:ascii="Calibri" w:cs="Calibri" w:eastAsia="Calibri" w:hAnsi="Calibri"/>
+                <w:color w:val="1E293B"/>
+                <w:sz w:val="20"/>
+                <w:szCs w:val="20"/>
+              </w:rPr>
+              <w:t xml:space="preserve"> traz quem a Régua de Acolhimento não viu no culto até o 8º dia.</w:t>
             </w:r>
           </w:p>
           <w:p>
@@ -18025,7 +18530,44 @@
                 <w:sz w:val="20"/>
                 <w:szCs w:val="20"/>
               </w:rPr>
-              <w:t xml:space="preserve">. Status visível em Meus pedidos. Slots de atendimento por igreja.</w:t>
+              <w:t xml:space="preserve">. Status visível em Meus pedidos. Slots de atendimento por igreja. Alertas </w:t>
+            </w:r>
+            <w:r>
+              <w:rPr>
+                <w:rFonts w:ascii="Calibri" w:cs="Calibri" w:eastAsia="Calibri" w:hAnsi="Calibri"/>
+                <w:color w:val="1E293B"/>
+                <w:sz w:val="20"/>
+                <w:szCs w:val="20"/>
+                <w:shd w:fill="F1F5F9" w:val="clear"/>
+              </w:rPr>
+              <w:t xml:space="preserve">ligacao_pastor_dia_8</w:t>
+            </w:r>
+            <w:r>
+              <w:rPr>
+                <w:rFonts w:ascii="Calibri" w:cs="Calibri" w:eastAsia="Calibri" w:hAnsi="Calibri"/>
+                <w:color w:val="1E293B"/>
+                <w:sz w:val="20"/>
+                <w:szCs w:val="20"/>
+              </w:rPr>
+              <w:t xml:space="preserve"> da régua — check-in da família no período encerra o ciclo; ausência escala para ligação pastoral. A régua </w:t>
+            </w:r>
+            <w:r>
+              <w:rPr>
+                <w:rFonts w:ascii="Calibri" w:cs="Calibri" w:eastAsia="Calibri" w:hAnsi="Calibri"/>
+                <w:color w:val="1E293B"/>
+                <w:sz w:val="20"/>
+                <w:szCs w:val="20"/>
+              </w:rPr>
+              <w:t xml:space="preserve">não</w:t>
+            </w:r>
+            <w:r>
+              <w:rPr>
+                <w:rFonts w:ascii="Calibri" w:cs="Calibri" w:eastAsia="Calibri" w:hAnsi="Calibri"/>
+                <w:color w:val="1E293B"/>
+                <w:sz w:val="20"/>
+                <w:szCs w:val="20"/>
+              </w:rPr>
+              <w:t xml:space="preserve"> promove o visitante a membro.</w:t>
             </w:r>
           </w:p>
           <w:tbl>
@@ -18139,7 +18681,7 @@
                       <w:sz w:val="19"/>
                       <w:szCs w:val="19"/>
                     </w:rPr>
-                    <w:t xml:space="preserve">Distribuição de cuidado, priorização, registro ministerial e agenda.</w:t>
+                    <w:t xml:space="preserve">Distribuição de cuidado, priorização, registro ministerial, agenda e o visitante que ainda não voltou ao culto.</w:t>
                   </w:r>
                 </w:p>
               </w:tc>
@@ -19360,7 +19902,43 @@
                 <w:sz w:val="20"/>
                 <w:szCs w:val="20"/>
               </w:rPr>
-              <w:t xml:space="preserve">. Match com a Lição 5.1. Interesse pendente/aceito/recusado. Aviso de vaga pode ir só a quem casa.</w:t>
+              <w:t xml:space="preserve">. Match com a Lição 5.1. Interesse pendente/aceito/recusado. Aviso de vaga pode ir só a quem casa. Doações e empréstimos ficam no </w:t>
+            </w:r>
+            <w:r>
+              <w:rPr>
+                <w:rFonts w:ascii="Calibri" w:cs="Calibri" w:eastAsia="Calibri" w:hAnsi="Calibri"/>
+                <w:color w:val="1E293B"/>
+                <w:sz w:val="20"/>
+                <w:szCs w:val="20"/>
+              </w:rPr>
+              <w:t xml:space="preserve">Mural de Generosidade</w:t>
+            </w:r>
+            <w:r>
+              <w:rPr>
+                <w:rFonts w:ascii="Calibri" w:cs="Calibri" w:eastAsia="Calibri" w:hAnsi="Calibri"/>
+                <w:color w:val="1E293B"/>
+                <w:sz w:val="20"/>
+                <w:szCs w:val="20"/>
+              </w:rPr>
+              <w:t xml:space="preserve">, com fila própria em </w:t>
+            </w:r>
+            <w:r>
+              <w:rPr>
+                <w:rFonts w:ascii="Calibri" w:cs="Calibri" w:eastAsia="Calibri" w:hAnsi="Calibri"/>
+                <w:color w:val="1E293B"/>
+                <w:sz w:val="20"/>
+                <w:szCs w:val="20"/>
+              </w:rPr>
+              <w:t xml:space="preserve">Moderação do Mural</w:t>
+            </w:r>
+            <w:r>
+              <w:rPr>
+                <w:rFonts w:ascii="Calibri" w:cs="Calibri" w:eastAsia="Calibri" w:hAnsi="Calibri"/>
+                <w:color w:val="1E293B"/>
+                <w:sz w:val="20"/>
+                <w:szCs w:val="20"/>
+              </w:rPr>
+              <w:t xml:space="preserve">.</w:t>
             </w:r>
           </w:p>
           <w:tbl>
@@ -19621,7 +20199,7 @@
                 <w:sz w:val="29"/>
                 <w:szCs w:val="29"/>
               </w:rPr>
-              <w:t xml:space="preserve">Temas, Reconhecimentos e Reset da Trilha</w:t>
+              <w:t xml:space="preserve">Moderação do Mural de Generosidade</w:t>
             </w:r>
           </w:p>
           <w:p>
@@ -19637,7 +20215,7 @@
                 <w:szCs w:val="16"/>
                 <w:shd w:fill="EFF6FF" w:val="clear"/>
               </w:rPr>
-              <w:t xml:space="preserve">Painéis discipleship_* · engrenagem</w:t>
+              <w:t xml:space="preserve">Painel generosity_moderation · engrenagem</w:t>
             </w:r>
           </w:p>
           <w:p>
@@ -19669,7 +20247,7 @@
                 <w:sz w:val="20"/>
                 <w:szCs w:val="20"/>
               </w:rPr>
-              <w:t xml:space="preserve">A trilha é conteúdo vivo. Temas se editam, reconhecimentos alertam a pastoral, o reset existe para recomeçar com critério — não para apagar formação por acidente.</w:t>
+              <w:t xml:space="preserve">Nada do Mural de Generosidade entra no ar sem este crivo. A liderança aprova, rejeita ou encerra o anúncio e media o interesse: telefones aparecem só aqui, para a igreja fazer a ponte entre quem doa e quem pede.</w:t>
             </w:r>
           </w:p>
           <w:p>
@@ -19701,7 +20279,7 @@
                 <w:sz w:val="20"/>
                 <w:szCs w:val="20"/>
               </w:rPr>
-              <w:t xml:space="preserve">Alimenta </w:t>
+              <w:t xml:space="preserve">Fila </w:t>
             </w:r>
             <w:r>
               <w:rPr>
@@ -19711,16 +20289,73 @@
                 <w:szCs w:val="20"/>
                 <w:shd w:fill="F1F5F9" w:val="clear"/>
               </w:rPr>
-              <w:t xml:space="preserve">/trilha-discipulado</w:t>
-            </w:r>
-            <w:r>
-              <w:rPr>
-                <w:rFonts w:ascii="Calibri" w:cs="Calibri" w:eastAsia="Calibri" w:hAnsi="Calibri"/>
-                <w:color w:val="1E293B"/>
-                <w:sz w:val="20"/>
-                <w:szCs w:val="20"/>
-              </w:rPr>
-              <w:t xml:space="preserve"> e o Perfil Ministerial. Grants específicos.</w:t>
+              <w:t xml:space="preserve">pendente</w:t>
+            </w:r>
+            <w:r>
+              <w:rPr>
+                <w:rFonts w:ascii="Calibri" w:cs="Calibri" w:eastAsia="Calibri" w:hAnsi="Calibri"/>
+                <w:color w:val="1E293B"/>
+                <w:sz w:val="20"/>
+                <w:szCs w:val="20"/>
+              </w:rPr>
+              <w:t xml:space="preserve"> / </w:t>
+            </w:r>
+            <w:r>
+              <w:rPr>
+                <w:rFonts w:ascii="Calibri" w:cs="Calibri" w:eastAsia="Calibri" w:hAnsi="Calibri"/>
+                <w:color w:val="1E293B"/>
+                <w:sz w:val="20"/>
+                <w:szCs w:val="20"/>
+                <w:shd w:fill="F1F5F9" w:val="clear"/>
+              </w:rPr>
+              <w:t xml:space="preserve">ativo</w:t>
+            </w:r>
+            <w:r>
+              <w:rPr>
+                <w:rFonts w:ascii="Calibri" w:cs="Calibri" w:eastAsia="Calibri" w:hAnsi="Calibri"/>
+                <w:color w:val="1E293B"/>
+                <w:sz w:val="20"/>
+                <w:szCs w:val="20"/>
+              </w:rPr>
+              <w:t xml:space="preserve"> e aba de interesses. RPCs </w:t>
+            </w:r>
+            <w:r>
+              <w:rPr>
+                <w:rFonts w:ascii="Calibri" w:cs="Calibri" w:eastAsia="Calibri" w:hAnsi="Calibri"/>
+                <w:color w:val="1E293B"/>
+                <w:sz w:val="20"/>
+                <w:szCs w:val="20"/>
+                <w:shd w:fill="F1F5F9" w:val="clear"/>
+              </w:rPr>
+              <w:t xml:space="preserve">moderate_generosity_post</w:t>
+            </w:r>
+            <w:r>
+              <w:rPr>
+                <w:rFonts w:ascii="Calibri" w:cs="Calibri" w:eastAsia="Calibri" w:hAnsi="Calibri"/>
+                <w:color w:val="1E293B"/>
+                <w:sz w:val="20"/>
+                <w:szCs w:val="20"/>
+              </w:rPr>
+              <w:t xml:space="preserve"> e </w:t>
+            </w:r>
+            <w:r>
+              <w:rPr>
+                <w:rFonts w:ascii="Calibri" w:cs="Calibri" w:eastAsia="Calibri" w:hAnsi="Calibri"/>
+                <w:color w:val="1E293B"/>
+                <w:sz w:val="20"/>
+                <w:szCs w:val="20"/>
+                <w:shd w:fill="F1F5F9" w:val="clear"/>
+              </w:rPr>
+              <w:t xml:space="preserve">accept_generosity_interest</w:t>
+            </w:r>
+            <w:r>
+              <w:rPr>
+                <w:rFonts w:ascii="Calibri" w:cs="Calibri" w:eastAsia="Calibri" w:hAnsi="Calibri"/>
+                <w:color w:val="1E293B"/>
+                <w:sz w:val="20"/>
+                <w:szCs w:val="20"/>
+              </w:rPr>
+              <w:t xml:space="preserve">. Aviso interno ao autor e ao interessado. Papéis liderança/pastoral/super administrador.</w:t>
             </w:r>
           </w:p>
           <w:tbl>
@@ -19785,7 +20420,7 @@
                       <w:sz w:val="19"/>
                       <w:szCs w:val="19"/>
                     </w:rPr>
-                    <w:t xml:space="preserve">Estuda o material atual da igreja, com selos que significam algo.</w:t>
+                    <w:t xml:space="preserve">Espera a aprovação da igreja; o feed público não vira classificado sem filtro.</w:t>
                   </w:r>
                 </w:p>
               </w:tc>
@@ -19834,7 +20469,7 @@
                       <w:sz w:val="19"/>
                       <w:szCs w:val="19"/>
                     </w:rPr>
-                    <w:t xml:space="preserve">Currículo discipulador sob governança, com alertas e reset auditável.</w:t>
+                    <w:t xml:space="preserve">Governança do compartilhamento material, com contato mediado e sem telefone no mural do membro.</w:t>
                   </w:r>
                 </w:p>
               </w:tc>
@@ -19899,7 +20534,7 @@
                       <w:sz w:val="20"/>
                       <w:szCs w:val="20"/>
                     </w:rPr>
-                    <w:t xml:space="preserve">Espaço para imagem — Temas, Reconhecimentos e Reset da Trilha</w:t>
+                    <w:t xml:space="preserve">Espaço para imagem — Moderação do Mural de Generosidade</w:t>
                   </w:r>
                 </w:p>
                 <w:p>
@@ -19981,7 +20616,7 @@
                 <w:sz w:val="29"/>
                 <w:szCs w:val="29"/>
               </w:rPr>
-              <w:t xml:space="preserve">Informações Financeiras (manutenção)</w:t>
+              <w:t xml:space="preserve">Temas, Reconhecimentos e Reset da Trilha</w:t>
             </w:r>
           </w:p>
           <w:p>
@@ -19997,7 +20632,7 @@
                 <w:szCs w:val="16"/>
                 <w:shd w:fill="EFF6FF" w:val="clear"/>
               </w:rPr>
-              <w:t xml:space="preserve">Painel financials</w:t>
+              <w:t xml:space="preserve">Painéis discipleship_* · engrenagem</w:t>
             </w:r>
           </w:p>
           <w:p>
@@ -20029,7 +20664,7 @@
                 <w:sz w:val="20"/>
                 <w:szCs w:val="20"/>
               </w:rPr>
-              <w:t xml:space="preserve">A tesouraria importa CSV, escolhe REALIZADO ou PLANEJADO, esvazia mês com escopo e concilia RD. O boletim que o membro lê nasce daqui.</w:t>
+              <w:t xml:space="preserve">A trilha é conteúdo vivo. Temas se editam, reconhecimentos alertam a pastoral, o reset existe para recomeçar com critério — não para apagar formação por acidente.</w:t>
             </w:r>
           </w:p>
           <w:p>
@@ -20061,7 +20696,7 @@
                 <w:sz w:val="20"/>
                 <w:szCs w:val="20"/>
               </w:rPr>
-              <w:t xml:space="preserve">Carga, accordion de seções, RD do mês, desconciliação. Alimenta </w:t>
+              <w:t xml:space="preserve">Alimenta </w:t>
             </w:r>
             <w:r>
               <w:rPr>
@@ -20071,16 +20706,16 @@
                 <w:szCs w:val="20"/>
                 <w:shd w:fill="F1F5F9" w:val="clear"/>
               </w:rPr>
-              <w:t xml:space="preserve">/financial</w:t>
-            </w:r>
-            <w:r>
-              <w:rPr>
-                <w:rFonts w:ascii="Calibri" w:cs="Calibri" w:eastAsia="Calibri" w:hAnsi="Calibri"/>
-                <w:color w:val="1E293B"/>
-                <w:sz w:val="20"/>
-                <w:szCs w:val="20"/>
-              </w:rPr>
-              <w:t xml:space="preserve">.</w:t>
+              <w:t xml:space="preserve">/trilha-discipulado</w:t>
+            </w:r>
+            <w:r>
+              <w:rPr>
+                <w:rFonts w:ascii="Calibri" w:cs="Calibri" w:eastAsia="Calibri" w:hAnsi="Calibri"/>
+                <w:color w:val="1E293B"/>
+                <w:sz w:val="20"/>
+                <w:szCs w:val="20"/>
+              </w:rPr>
+              <w:t xml:space="preserve"> e o Perfil Ministerial. Grants específicos.</w:t>
             </w:r>
           </w:p>
           <w:tbl>
@@ -20145,7 +20780,7 @@
                       <w:sz w:val="19"/>
                       <w:szCs w:val="19"/>
                     </w:rPr>
-                    <w:t xml:space="preserve">Números confiáveis no card Financeiro.</w:t>
+                    <w:t xml:space="preserve">Estuda o material atual da igreja, com selos que significam algo.</w:t>
                   </w:r>
                 </w:p>
               </w:tc>
@@ -20194,7 +20829,7 @@
                       <w:sz w:val="19"/>
                       <w:szCs w:val="19"/>
                     </w:rPr>
-                    <w:t xml:space="preserve">Operação de tesouraria com versão orçamentária explícita e rastro de RD.</w:t>
+                    <w:t xml:space="preserve">Currículo discipulador sob governança, com alertas e reset auditável.</w:t>
                   </w:r>
                 </w:p>
               </w:tc>
@@ -20259,7 +20894,7 @@
                       <w:sz w:val="20"/>
                       <w:szCs w:val="20"/>
                     </w:rPr>
-                    <w:t xml:space="preserve">Espaço para imagem — Informações Financeiras (manutenção)</w:t>
+                    <w:t xml:space="preserve">Espaço para imagem — Temas, Reconhecimentos e Reset da Trilha</w:t>
                   </w:r>
                 </w:p>
                 <w:p>
@@ -20341,7 +20976,7 @@
                 <w:sz w:val="29"/>
                 <w:szCs w:val="29"/>
               </w:rPr>
-              <w:t xml:space="preserve">Modelo preditivo</w:t>
+              <w:t xml:space="preserve">Informações Financeiras (manutenção)</w:t>
             </w:r>
           </w:p>
           <w:p>
@@ -20357,7 +20992,7 @@
                 <w:szCs w:val="16"/>
                 <w:shd w:fill="EFF6FF" w:val="clear"/>
               </w:rPr>
-              <w:t xml:space="preserve">Painel predictive_insights</w:t>
+              <w:t xml:space="preserve">Painel financials</w:t>
             </w:r>
           </w:p>
           <w:p>
@@ -20389,7 +21024,7 @@
                 <w:sz w:val="20"/>
                 <w:szCs w:val="20"/>
               </w:rPr>
-              <w:t xml:space="preserve">Projeta receita ordinária (dízimos e ofertas) com base no realizado. A diretoria planeja com evidência, não só com esperança.</w:t>
+              <w:t xml:space="preserve">A tesouraria importa CSV, escolhe REALIZADO ou PLANEJADO, esvazia mês com escopo e concilia RD. O boletim que o membro lê nasce daqui.</w:t>
             </w:r>
           </w:p>
           <w:p>
@@ -20421,7 +21056,7 @@
                 <w:sz w:val="20"/>
                 <w:szCs w:val="20"/>
               </w:rPr>
-              <w:t xml:space="preserve">Modelo em </w:t>
+              <w:t xml:space="preserve">Carga, accordion de seções, RD do mês, desconciliação. Alimenta </w:t>
             </w:r>
             <w:r>
               <w:rPr>
@@ -20431,16 +21066,16 @@
                 <w:szCs w:val="20"/>
                 <w:shd w:fill="F1F5F9" w:val="clear"/>
               </w:rPr>
-              <w:t xml:space="preserve">financialPredictiveModel</w:t>
-            </w:r>
-            <w:r>
-              <w:rPr>
-                <w:rFonts w:ascii="Calibri" w:cs="Calibri" w:eastAsia="Calibri" w:hAnsi="Calibri"/>
-                <w:color w:val="1E293B"/>
-                <w:sz w:val="20"/>
-                <w:szCs w:val="20"/>
-              </w:rPr>
-              <w:t xml:space="preserve">. Exige histórico mínimo de meses positivos.</w:t>
+              <w:t xml:space="preserve">/financial</w:t>
+            </w:r>
+            <w:r>
+              <w:rPr>
+                <w:rFonts w:ascii="Calibri" w:cs="Calibri" w:eastAsia="Calibri" w:hAnsi="Calibri"/>
+                <w:color w:val="1E293B"/>
+                <w:sz w:val="20"/>
+                <w:szCs w:val="20"/>
+              </w:rPr>
+              <w:t xml:space="preserve">.</w:t>
             </w:r>
           </w:p>
           <w:tbl>
@@ -20505,7 +21140,7 @@
                       <w:sz w:val="19"/>
                       <w:szCs w:val="19"/>
                     </w:rPr>
-                    <w:t xml:space="preserve">Indireta: orçamento da igreja mais responsável.</w:t>
+                    <w:t xml:space="preserve">Números confiáveis no card Financeiro.</w:t>
                   </w:r>
                 </w:p>
               </w:tc>
@@ -20554,7 +21189,7 @@
                       <w:sz w:val="19"/>
                       <w:szCs w:val="19"/>
                     </w:rPr>
-                    <w:t xml:space="preserve">Insight quantitativo para conselho e tesouraria.</w:t>
+                    <w:t xml:space="preserve">Operação de tesouraria com versão orçamentária explícita e rastro de RD.</w:t>
                   </w:r>
                 </w:p>
               </w:tc>
@@ -20619,7 +21254,7 @@
                       <w:sz w:val="20"/>
                       <w:szCs w:val="20"/>
                     </w:rPr>
-                    <w:t xml:space="preserve">Espaço para imagem — Modelo preditivo</w:t>
+                    <w:t xml:space="preserve">Espaço para imagem — Informações Financeiras (manutenção)</w:t>
                   </w:r>
                 </w:p>
                 <w:p>
@@ -20701,7 +21336,7 @@
                 <w:sz w:val="29"/>
                 <w:szCs w:val="29"/>
               </w:rPr>
-              <w:t xml:space="preserve">Relatórios</w:t>
+              <w:t xml:space="preserve">Modelo preditivo</w:t>
             </w:r>
           </w:p>
           <w:p>
@@ -20717,7 +21352,7 @@
                 <w:szCs w:val="16"/>
                 <w:shd w:fill="EFF6FF" w:val="clear"/>
               </w:rPr>
-              <w:t xml:space="preserve">Painel relatorios</w:t>
+              <w:t xml:space="preserve">Painel predictive_insights</w:t>
             </w:r>
           </w:p>
           <w:p>
@@ -20749,7 +21384,7 @@
                 <w:sz w:val="20"/>
                 <w:szCs w:val="20"/>
               </w:rPr>
-              <w:t xml:space="preserve">Olhares analíticos: membros ativos/inativos, necessidades pastorais, saúde infantil (LGPD), quórum, estacionamento, sugestões, inscritos por evento. Sem relatório de faixa etária — decisão consciente de privacidade.</w:t>
+              <w:t xml:space="preserve">Projeta receita ordinária (dízimos e ofertas) com base no realizado. A diretoria planeja com evidência, não só com esperança.</w:t>
             </w:r>
           </w:p>
           <w:p>
@@ -20781,7 +21416,26 @@
                 <w:sz w:val="20"/>
                 <w:szCs w:val="20"/>
               </w:rPr>
-              <w:t xml:space="preserve">Catálogo da manutenção. Papéis pastoral/super administrador conforme o relatório.</w:t>
+              <w:t xml:space="preserve">Modelo em </w:t>
+            </w:r>
+            <w:r>
+              <w:rPr>
+                <w:rFonts w:ascii="Calibri" w:cs="Calibri" w:eastAsia="Calibri" w:hAnsi="Calibri"/>
+                <w:color w:val="1E293B"/>
+                <w:sz w:val="20"/>
+                <w:szCs w:val="20"/>
+                <w:shd w:fill="F1F5F9" w:val="clear"/>
+              </w:rPr>
+              <w:t xml:space="preserve">financialPredictiveModel</w:t>
+            </w:r>
+            <w:r>
+              <w:rPr>
+                <w:rFonts w:ascii="Calibri" w:cs="Calibri" w:eastAsia="Calibri" w:hAnsi="Calibri"/>
+                <w:color w:val="1E293B"/>
+                <w:sz w:val="20"/>
+                <w:szCs w:val="20"/>
+              </w:rPr>
+              <w:t xml:space="preserve">. Exige histórico mínimo de meses positivos.</w:t>
             </w:r>
           </w:p>
           <w:tbl>
@@ -20846,7 +21500,7 @@
                       <w:sz w:val="19"/>
                       <w:szCs w:val="19"/>
                     </w:rPr>
-                    <w:t xml:space="preserve">Benefício indireto: decisões da igreja baseadas em fato, com menos exposição etária.</w:t>
+                    <w:t xml:space="preserve">Indireta: orçamento da igreja mais responsável.</w:t>
                   </w:r>
                 </w:p>
               </w:tc>
@@ -20895,7 +21549,7 @@
                       <w:sz w:val="19"/>
                       <w:szCs w:val="19"/>
                     </w:rPr>
-                    <w:t xml:space="preserve">Painel de gestão sem exportar a igreja inteira para uma planilha solta.</w:t>
+                    <w:t xml:space="preserve">Insight quantitativo para conselho e tesouraria.</w:t>
                   </w:r>
                 </w:p>
               </w:tc>
@@ -20960,7 +21614,7 @@
                       <w:sz w:val="20"/>
                       <w:szCs w:val="20"/>
                     </w:rPr>
-                    <w:t xml:space="preserve">Espaço para imagem — Relatórios</w:t>
+                    <w:t xml:space="preserve">Espaço para imagem — Modelo preditivo</w:t>
                   </w:r>
                 </w:p>
                 <w:p>
@@ -21042,7 +21696,7 @@
                 <w:sz w:val="29"/>
                 <w:szCs w:val="29"/>
               </w:rPr>
-              <w:t xml:space="preserve">Lista de Presença (quórum)</w:t>
+              <w:t xml:space="preserve">Relatórios</w:t>
             </w:r>
           </w:p>
           <w:p>
@@ -21058,7 +21712,7 @@
                 <w:szCs w:val="16"/>
                 <w:shd w:fill="EFF6FF" w:val="clear"/>
               </w:rPr>
-              <w:t xml:space="preserve">Painel quorum_presence</w:t>
+              <w:t xml:space="preserve">Painel relatorios</w:t>
             </w:r>
           </w:p>
           <w:p>
@@ -21090,7 +21744,7 @@
                 <w:sz w:val="20"/>
                 <w:szCs w:val="20"/>
               </w:rPr>
-              <w:t xml:space="preserve">Quando o evento exige quórum, esta é a ata viva: quem confirmou no totem, a que horas, pronta para impressão.</w:t>
+              <w:t xml:space="preserve">Olhares analíticos: membros ativos/inativos, necessidades pastorais, saúde infantil (LGPD), quórum, estacionamento, sugestões, inscritos por evento. Sem relatório de faixa etária — decisão consciente de privacidade.</w:t>
             </w:r>
           </w:p>
           <w:p>
@@ -21122,26 +21776,7 @@
                 <w:sz w:val="20"/>
                 <w:szCs w:val="20"/>
               </w:rPr>
-              <w:t xml:space="preserve">Atualiza após check-in. Flag </w:t>
-            </w:r>
-            <w:r>
-              <w:rPr>
-                <w:rFonts w:ascii="Calibri" w:cs="Calibri" w:eastAsia="Calibri" w:hAnsi="Calibri"/>
-                <w:color w:val="1E293B"/>
-                <w:sz w:val="20"/>
-                <w:szCs w:val="20"/>
-                <w:shd w:fill="F1F5F9" w:val="clear"/>
-              </w:rPr>
-              <w:t xml:space="preserve">requer_quorum</w:t>
-            </w:r>
-            <w:r>
-              <w:rPr>
-                <w:rFonts w:ascii="Calibri" w:cs="Calibri" w:eastAsia="Calibri" w:hAnsi="Calibri"/>
-                <w:color w:val="1E293B"/>
-                <w:sz w:val="20"/>
-                <w:szCs w:val="20"/>
-              </w:rPr>
-              <w:t xml:space="preserve"> no evento.</w:t>
+              <w:t xml:space="preserve">Catálogo da manutenção. Papéis pastoral/super administrador conforme o relatório.</w:t>
             </w:r>
           </w:p>
           <w:tbl>
@@ -21206,7 +21841,7 @@
                       <w:sz w:val="19"/>
                       <w:szCs w:val="19"/>
                     </w:rPr>
-                    <w:t xml:space="preserve">O check-in da família conta de verdade para a assembleia.</w:t>
+                    <w:t xml:space="preserve">Benefício indireto: decisões da igreja baseadas em fato, com menos exposição etária.</w:t>
                   </w:r>
                 </w:p>
               </w:tc>
@@ -21255,7 +21890,7 @@
                       <w:sz w:val="19"/>
                       <w:szCs w:val="19"/>
                     </w:rPr>
-                    <w:t xml:space="preserve">Documento de presença, não lista de WhatsApp.</w:t>
+                    <w:t xml:space="preserve">Painel de gestão sem exportar a igreja inteira para uma planilha solta.</w:t>
                   </w:r>
                 </w:p>
               </w:tc>
@@ -21320,7 +21955,7 @@
                       <w:sz w:val="20"/>
                       <w:szCs w:val="20"/>
                     </w:rPr>
-                    <w:t xml:space="preserve">Espaço para imagem — Lista de Presença (quórum)</w:t>
+                    <w:t xml:space="preserve">Espaço para imagem — Relatórios</w:t>
                   </w:r>
                 </w:p>
                 <w:p>
@@ -21402,7 +22037,7 @@
                 <w:sz w:val="29"/>
                 <w:szCs w:val="29"/>
               </w:rPr>
-              <w:t xml:space="preserve">Cadastro de Usuário</w:t>
+              <w:t xml:space="preserve">Lista de Presença (quórum)</w:t>
             </w:r>
           </w:p>
           <w:p>
@@ -21418,7 +22053,7 @@
                 <w:szCs w:val="16"/>
                 <w:shd w:fill="EFF6FF" w:val="clear"/>
               </w:rPr>
-              <w:t xml:space="preserve">Painel profile_cadastro · super administrador</w:t>
+              <w:t xml:space="preserve">Painel quorum_presence</w:t>
             </w:r>
           </w:p>
           <w:p>
@@ -21450,7 +22085,7 @@
                 <w:sz w:val="20"/>
                 <w:szCs w:val="20"/>
               </w:rPr>
-              <w:t xml:space="preserve">Correção cirúrgica: buscar pessoa, ajustar CEP/endereço, em último caso excluir perfil. Poder alto, uso raro, responsabilidade máxima.</w:t>
+              <w:t xml:space="preserve">Quando o evento exige quórum, esta é a ata viva: quem confirmou no totem, a que horas, pronta para impressão.</w:t>
             </w:r>
           </w:p>
           <w:p>
@@ -21482,7 +22117,7 @@
                 <w:sz w:val="20"/>
                 <w:szCs w:val="20"/>
               </w:rPr>
-              <w:t xml:space="preserve">Busca em </w:t>
+              <w:t xml:space="preserve">Atualiza após check-in. Flag </w:t>
             </w:r>
             <w:r>
               <w:rPr>
@@ -21492,16 +22127,16 @@
                 <w:szCs w:val="20"/>
                 <w:shd w:fill="F1F5F9" w:val="clear"/>
               </w:rPr>
-              <w:t xml:space="preserve">profiles</w:t>
-            </w:r>
-            <w:r>
-              <w:rPr>
-                <w:rFonts w:ascii="Calibri" w:cs="Calibri" w:eastAsia="Calibri" w:hAnsi="Calibri"/>
-                <w:color w:val="1E293B"/>
-                <w:sz w:val="20"/>
-                <w:szCs w:val="20"/>
-              </w:rPr>
-              <w:t xml:space="preserve">. Exclusão completa restrita. Complementa Mudança de Papéis.</w:t>
+              <w:t xml:space="preserve">requer_quorum</w:t>
+            </w:r>
+            <w:r>
+              <w:rPr>
+                <w:rFonts w:ascii="Calibri" w:cs="Calibri" w:eastAsia="Calibri" w:hAnsi="Calibri"/>
+                <w:color w:val="1E293B"/>
+                <w:sz w:val="20"/>
+                <w:szCs w:val="20"/>
+              </w:rPr>
+              <w:t xml:space="preserve"> no evento.</w:t>
             </w:r>
           </w:p>
           <w:tbl>
@@ -21566,7 +22201,7 @@
                       <w:sz w:val="19"/>
                       <w:szCs w:val="19"/>
                     </w:rPr>
-                    <w:t xml:space="preserve">Erros de cadastro se resolvem sem a pessoa “criar outra conta”.</w:t>
+                    <w:t xml:space="preserve">O check-in da família conta de verdade para a assembleia.</w:t>
                   </w:r>
                 </w:p>
               </w:tc>
@@ -21615,7 +22250,7 @@
                       <w:sz w:val="19"/>
                       <w:szCs w:val="19"/>
                     </w:rPr>
-                    <w:t xml:space="preserve">Higiene cadastral com trilha, não edição clandestina no banco.</w:t>
+                    <w:t xml:space="preserve">Documento de presença, não lista de WhatsApp.</w:t>
                   </w:r>
                 </w:p>
               </w:tc>
@@ -21680,7 +22315,7 @@
                       <w:sz w:val="20"/>
                       <w:szCs w:val="20"/>
                     </w:rPr>
-                    <w:t xml:space="preserve">Espaço para imagem — Cadastro de Usuário</w:t>
+                    <w:t xml:space="preserve">Espaço para imagem — Lista de Presença (quórum)</w:t>
                   </w:r>
                 </w:p>
                 <w:p>
@@ -21762,7 +22397,7 @@
                 <w:sz w:val="29"/>
                 <w:szCs w:val="29"/>
               </w:rPr>
-              <w:t xml:space="preserve">Recepção Familiar</w:t>
+              <w:t xml:space="preserve">Cadastro de Usuário</w:t>
             </w:r>
           </w:p>
           <w:p>
@@ -21778,7 +22413,7 @@
                 <w:szCs w:val="16"/>
                 <w:shd w:fill="EFF6FF" w:val="clear"/>
               </w:rPr>
-              <w:t xml:space="preserve">Painel family_reception</w:t>
+              <w:t xml:space="preserve">Painel profile_cadastro · super administrador</w:t>
             </w:r>
           </w:p>
           <w:p>
@@ -21810,26 +22445,7 @@
                 <w:sz w:val="20"/>
                 <w:szCs w:val="20"/>
               </w:rPr>
-              <w:t xml:space="preserve">A porta de entrada institucional da fila pública </w:t>
-            </w:r>
-            <w:r>
-              <w:rPr>
-                <w:rFonts w:ascii="Calibri" w:cs="Calibri" w:eastAsia="Calibri" w:hAnsi="Calibri"/>
-                <w:color w:val="1E293B"/>
-                <w:sz w:val="20"/>
-                <w:szCs w:val="20"/>
-                <w:shd w:fill="F1F5F9" w:val="clear"/>
-              </w:rPr>
-              <w:t xml:space="preserve">/cadastro-familia/</w:t>
-            </w:r>
-            <w:r>
-              <w:rPr>
-                <w:rFonts w:ascii="Calibri" w:cs="Calibri" w:eastAsia="Calibri" w:hAnsi="Calibri"/>
-                <w:color w:val="1E293B"/>
-                <w:sz w:val="20"/>
-                <w:szCs w:val="20"/>
-              </w:rPr>
-              <w:t xml:space="preserve">. Gravar ou rejeitar em lote é acolher com processo.</w:t>
+              <w:t xml:space="preserve">Correção cirúrgica: buscar pessoa, ajustar CEP/endereço, em último caso excluir perfil. Poder alto, uso raro, responsabilidade máxima.</w:t>
             </w:r>
           </w:p>
           <w:p>
@@ -21861,7 +22477,26 @@
                 <w:sz w:val="20"/>
                 <w:szCs w:val="20"/>
               </w:rPr>
-              <w:t xml:space="preserve">Fila do formulário standalone. Gera família/perfil oficiais.</w:t>
+              <w:t xml:space="preserve">Busca em </w:t>
+            </w:r>
+            <w:r>
+              <w:rPr>
+                <w:rFonts w:ascii="Calibri" w:cs="Calibri" w:eastAsia="Calibri" w:hAnsi="Calibri"/>
+                <w:color w:val="1E293B"/>
+                <w:sz w:val="20"/>
+                <w:szCs w:val="20"/>
+                <w:shd w:fill="F1F5F9" w:val="clear"/>
+              </w:rPr>
+              <w:t xml:space="preserve">profiles</w:t>
+            </w:r>
+            <w:r>
+              <w:rPr>
+                <w:rFonts w:ascii="Calibri" w:cs="Calibri" w:eastAsia="Calibri" w:hAnsi="Calibri"/>
+                <w:color w:val="1E293B"/>
+                <w:sz w:val="20"/>
+                <w:szCs w:val="20"/>
+              </w:rPr>
+              <w:t xml:space="preserve">. Exclusão completa restrita. Complementa Mudança de Papéis.</w:t>
             </w:r>
           </w:p>
           <w:tbl>
@@ -21926,7 +22561,7 @@
                       <w:sz w:val="19"/>
                       <w:szCs w:val="19"/>
                     </w:rPr>
-                    <w:t xml:space="preserve">O cadastro feito no link vira gente de verdade na igreja.</w:t>
+                    <w:t xml:space="preserve">Erros de cadastro se resolvem sem a pessoa “criar outra conta”.</w:t>
                   </w:r>
                 </w:p>
               </w:tc>
@@ -21975,7 +22610,7 @@
                       <w:sz w:val="19"/>
                       <w:szCs w:val="19"/>
                     </w:rPr>
-                    <w:t xml:space="preserve">Acolhimento com aceite formal, sem planilha de “pendentes da recepção”.</w:t>
+                    <w:t xml:space="preserve">Higiene cadastral com trilha, não edição clandestina no banco.</w:t>
                   </w:r>
                 </w:p>
               </w:tc>
@@ -22040,7 +22675,7 @@
                       <w:sz w:val="20"/>
                       <w:szCs w:val="20"/>
                     </w:rPr>
-                    <w:t xml:space="preserve">Espaço para imagem — Recepção Familiar</w:t>
+                    <w:t xml:space="preserve">Espaço para imagem — Cadastro de Usuário</w:t>
                   </w:r>
                 </w:p>
                 <w:p>
@@ -22122,7 +22757,7 @@
                 <w:sz w:val="29"/>
                 <w:szCs w:val="29"/>
               </w:rPr>
-              <w:t xml:space="preserve">Controle de Acesso</w:t>
+              <w:t xml:space="preserve">Recepção Familiar</w:t>
             </w:r>
           </w:p>
           <w:p>
@@ -22138,7 +22773,7 @@
                 <w:szCs w:val="16"/>
                 <w:shd w:fill="EFF6FF" w:val="clear"/>
               </w:rPr>
-              <w:t xml:space="preserve">Painel access_control</w:t>
+              <w:t xml:space="preserve">Painel family_reception</w:t>
             </w:r>
           </w:p>
           <w:p>
@@ -22170,7 +22805,26 @@
                 <w:sz w:val="20"/>
                 <w:szCs w:val="20"/>
               </w:rPr>
-              <w:t xml:space="preserve">O coração da governança: papéis, grants, visão por papel ou por recurso. O Gestor de Controle de Acesso não vê o Super Administrador — escudo explícito. LGPD da instância liga/desliga aqui.</w:t>
+              <w:t xml:space="preserve">A porta de entrada institucional da fila pública </w:t>
+            </w:r>
+            <w:r>
+              <w:rPr>
+                <w:rFonts w:ascii="Calibri" w:cs="Calibri" w:eastAsia="Calibri" w:hAnsi="Calibri"/>
+                <w:color w:val="1E293B"/>
+                <w:sz w:val="20"/>
+                <w:szCs w:val="20"/>
+                <w:shd w:fill="F1F5F9" w:val="clear"/>
+              </w:rPr>
+              <w:t xml:space="preserve">/cadastro-familia/</w:t>
+            </w:r>
+            <w:r>
+              <w:rPr>
+                <w:rFonts w:ascii="Calibri" w:cs="Calibri" w:eastAsia="Calibri" w:hAnsi="Calibri"/>
+                <w:color w:val="1E293B"/>
+                <w:sz w:val="20"/>
+                <w:szCs w:val="20"/>
+              </w:rPr>
+              <w:t xml:space="preserve">. Gravar ou rejeitar em lote é acolher com processo.</w:t>
             </w:r>
           </w:p>
           <w:p>
@@ -22202,7 +22856,7 @@
                 <w:sz w:val="20"/>
                 <w:szCs w:val="20"/>
               </w:rPr>
-              <w:t xml:space="preserve">RPCs SECURITY DEFINER amarradas à sessão do ator, matriz de grants, </w:t>
+              <w:t xml:space="preserve">Fila do formulário standalone. Gera família/perfil oficiais. A aprovação (</w:t>
             </w:r>
             <w:r>
               <w:rPr>
@@ -22212,16 +22866,34 @@
                 <w:szCs w:val="20"/>
                 <w:shd w:fill="F1F5F9" w:val="clear"/>
               </w:rPr>
-              <w:t xml:space="preserve">assert_gestor_super_admin_shield</w:t>
-            </w:r>
-            <w:r>
-              <w:rPr>
-                <w:rFonts w:ascii="Calibri" w:cs="Calibri" w:eastAsia="Calibri" w:hAnsi="Calibri"/>
-                <w:color w:val="1E293B"/>
-                <w:sz w:val="20"/>
-                <w:szCs w:val="20"/>
-              </w:rPr>
-              <w:t xml:space="preserve">. Afeta todas as telas.</w:t>
+              <w:t xml:space="preserve">processed</w:t>
+            </w:r>
+            <w:r>
+              <w:rPr>
+                <w:rFonts w:ascii="Calibri" w:cs="Calibri" w:eastAsia="Calibri" w:hAnsi="Calibri"/>
+                <w:color w:val="1E293B"/>
+                <w:sz w:val="20"/>
+                <w:szCs w:val="20"/>
+              </w:rPr>
+              <w:t xml:space="preserve">) dispara a </w:t>
+            </w:r>
+            <w:r>
+              <w:rPr>
+                <w:rFonts w:ascii="Calibri" w:cs="Calibri" w:eastAsia="Calibri" w:hAnsi="Calibri"/>
+                <w:color w:val="1E293B"/>
+                <w:sz w:val="20"/>
+                <w:szCs w:val="20"/>
+              </w:rPr>
+              <w:t xml:space="preserve">Régua de Acolhimento</w:t>
+            </w:r>
+            <w:r>
+              <w:rPr>
+                <w:rFonts w:ascii="Calibri" w:cs="Calibri" w:eastAsia="Calibri" w:hAnsi="Calibri"/>
+                <w:color w:val="1E293B"/>
+                <w:sz w:val="20"/>
+                <w:szCs w:val="20"/>
+              </w:rPr>
+              <w:t xml:space="preserve"> para o informante (e para quem tem telefone próprio): WhatsApp no dia 1, convite à célula mais próxima no dia 4, verificação de check-in no domingo do 8º dia.</w:t>
             </w:r>
           </w:p>
           <w:tbl>
@@ -22286,7 +22958,7 @@
                       <w:sz w:val="19"/>
                       <w:szCs w:val="19"/>
                     </w:rPr>
-                    <w:t xml:space="preserve">Vê só o que lhe cabe — e isso é cuidado, não restrição vazia.</w:t>
+                    <w:t xml:space="preserve">O cadastro feito no link vira gente de verdade na igreja — e alguém da equipe continua o cuidado depois da porta.</w:t>
                   </w:r>
                 </w:p>
               </w:tc>
@@ -22335,7 +23007,7 @@
                       <w:sz w:val="19"/>
                       <w:szCs w:val="19"/>
                     </w:rPr>
-                    <w:t xml:space="preserve">ACL auditável, fail-closed, sem o gestor enxergar o super administrador.</w:t>
+                    <w:t xml:space="preserve">Acolhimento com aceite formal, sem planilha de “pendentes da recepção”, e tarefas automáticas para não deixar o visitante sem retorno.</w:t>
                   </w:r>
                 </w:p>
               </w:tc>
@@ -22400,7 +23072,7 @@
                       <w:sz w:val="20"/>
                       <w:szCs w:val="20"/>
                     </w:rPr>
-                    <w:t xml:space="preserve">Espaço para imagem — Controle de Acesso</w:t>
+                    <w:t xml:space="preserve">Espaço para imagem — Recepção Familiar</w:t>
                   </w:r>
                 </w:p>
                 <w:p>
@@ -22482,7 +23154,7 @@
                 <w:sz w:val="29"/>
                 <w:szCs w:val="29"/>
               </w:rPr>
-              <w:t xml:space="preserve">Mudança de Papéis</w:t>
+              <w:t xml:space="preserve">Régua de Acolhimento</w:t>
             </w:r>
           </w:p>
           <w:p>
@@ -22498,7 +23170,7 @@
                 <w:szCs w:val="16"/>
                 <w:shd w:fill="EFF6FF" w:val="clear"/>
               </w:rPr>
-              <w:t xml:space="preserve">Painel mudanca_papeis</w:t>
+              <w:t xml:space="preserve">Painel visitor_followup · engrenagem</w:t>
             </w:r>
           </w:p>
           <w:p>
@@ -22530,7 +23202,25 @@
                 <w:sz w:val="20"/>
                 <w:szCs w:val="20"/>
               </w:rPr>
-              <w:t xml:space="preserve">Visitante, congregado, membro: a caminhada eclesial vira dado oficial, com contagem de ativos e herança familiar.</w:t>
+              <w:t xml:space="preserve">Depois que a Recepção Familiar grava o lote, a igreja não “esquece” o visitante. A equipe de boas-vindas vê as tarefas do dia — mensagem pronta no WhatsApp, convite à célula mais próxima pelo CEP — e marca o contato feito. Crianças sem telefone próprio não geram régua duplicada. No 8º dia, se a família não fez check-in no culto, o alerta sobe ao </w:t>
+            </w:r>
+            <w:r>
+              <w:rPr>
+                <w:rFonts w:ascii="Calibri" w:cs="Calibri" w:eastAsia="Calibri" w:hAnsi="Calibri"/>
+                <w:color w:val="1E293B"/>
+                <w:sz w:val="20"/>
+                <w:szCs w:val="20"/>
+              </w:rPr>
+              <w:t xml:space="preserve">Cuidado Pastoral</w:t>
+            </w:r>
+            <w:r>
+              <w:rPr>
+                <w:rFonts w:ascii="Calibri" w:cs="Calibri" w:eastAsia="Calibri" w:hAnsi="Calibri"/>
+                <w:color w:val="1E293B"/>
+                <w:sz w:val="20"/>
+                <w:szCs w:val="20"/>
+              </w:rPr>
+              <w:t xml:space="preserve">.</w:t>
             </w:r>
           </w:p>
           <w:p>
@@ -22562,7 +23252,63 @@
                 <w:sz w:val="20"/>
                 <w:szCs w:val="20"/>
               </w:rPr>
-              <w:t xml:space="preserve">Pastoral e super administrador. Integra-se à Lista de Membros, carteirinha (status) e limites de billing.</w:t>
+              <w:t xml:space="preserve">Tabelas </w:t>
+            </w:r>
+            <w:r>
+              <w:rPr>
+                <w:rFonts w:ascii="Calibri" w:cs="Calibri" w:eastAsia="Calibri" w:hAnsi="Calibri"/>
+                <w:color w:val="1E293B"/>
+                <w:sz w:val="20"/>
+                <w:szCs w:val="20"/>
+                <w:shd w:fill="F1F5F9" w:val="clear"/>
+              </w:rPr>
+              <w:t xml:space="preserve">visitor_followup</w:t>
+            </w:r>
+            <w:r>
+              <w:rPr>
+                <w:rFonts w:ascii="Calibri" w:cs="Calibri" w:eastAsia="Calibri" w:hAnsi="Calibri"/>
+                <w:color w:val="1E293B"/>
+                <w:sz w:val="20"/>
+                <w:szCs w:val="20"/>
+              </w:rPr>
+              <w:t xml:space="preserve"> e </w:t>
+            </w:r>
+            <w:r>
+              <w:rPr>
+                <w:rFonts w:ascii="Calibri" w:cs="Calibri" w:eastAsia="Calibri" w:hAnsi="Calibri"/>
+                <w:color w:val="1E293B"/>
+                <w:sz w:val="20"/>
+                <w:szCs w:val="20"/>
+                <w:shd w:fill="F1F5F9" w:val="clear"/>
+              </w:rPr>
+              <w:t xml:space="preserve">task_alerts</w:t>
+            </w:r>
+            <w:r>
+              <w:rPr>
+                <w:rFonts w:ascii="Calibri" w:cs="Calibri" w:eastAsia="Calibri" w:hAnsi="Calibri"/>
+                <w:color w:val="1E293B"/>
+                <w:sz w:val="20"/>
+                <w:szCs w:val="20"/>
+              </w:rPr>
+              <w:t xml:space="preserve">. Disparo no trigger da recepção. Célula mais próxima por Haversine no CEP. Check-in confirmado da família no período encerra como integrado; ausência escala ao pastor. </w:t>
+            </w:r>
+            <w:r>
+              <w:rPr>
+                <w:rFonts w:ascii="Calibri" w:cs="Calibri" w:eastAsia="Calibri" w:hAnsi="Calibri"/>
+                <w:color w:val="1E293B"/>
+                <w:sz w:val="20"/>
+                <w:szCs w:val="20"/>
+              </w:rPr>
+              <w:t xml:space="preserve">Não</w:t>
+            </w:r>
+            <w:r>
+              <w:rPr>
+                <w:rFonts w:ascii="Calibri" w:cs="Calibri" w:eastAsia="Calibri" w:hAnsi="Calibri"/>
+                <w:color w:val="1E293B"/>
+                <w:sz w:val="20"/>
+                <w:szCs w:val="20"/>
+              </w:rPr>
+              <w:t xml:space="preserve"> altera o papel do visitante para membro. WhatsApp só habilita com telefone utilizável.</w:t>
             </w:r>
           </w:p>
           <w:tbl>
@@ -22627,7 +23373,7 @@
                       <w:sz w:val="19"/>
                       <w:szCs w:val="19"/>
                     </w:rPr>
-                    <w:t xml:space="preserve">O reconhecimento da igreja (membro/congregado) aparece na carteirinha.</w:t>
+                    <w:t xml:space="preserve">Recebe acolhimento concreto — mensagem, convite à célula — em vez de sumir depois do primeiro culto.</w:t>
                   </w:r>
                 </w:p>
               </w:tc>
@@ -22676,7 +23422,7 @@
                       <w:sz w:val="19"/>
                       <w:szCs w:val="19"/>
                     </w:rPr>
-                    <w:t xml:space="preserve">Métricas de membresia reais, não estimativa de lista de presença.</w:t>
+                    <w:t xml:space="preserve">Fila operacional da equipe de boas-vindas e alerta pastoral no dia 8, isolado por igreja, sem promover o visitante automaticamente.</w:t>
                   </w:r>
                 </w:p>
               </w:tc>
@@ -22741,7 +23487,7 @@
                       <w:sz w:val="20"/>
                       <w:szCs w:val="20"/>
                     </w:rPr>
-                    <w:t xml:space="preserve">Espaço para imagem — Mudança de Papéis</w:t>
+                    <w:t xml:space="preserve">Espaço para imagem — Régua de Acolhimento</w:t>
                   </w:r>
                 </w:p>
                 <w:p>
@@ -22823,7 +23569,7 @@
                 <w:sz w:val="29"/>
                 <w:szCs w:val="29"/>
               </w:rPr>
-              <w:t xml:space="preserve">Transferência de Membro</w:t>
+              <w:t xml:space="preserve">Controle de Acesso</w:t>
             </w:r>
           </w:p>
           <w:p>
@@ -22839,7 +23585,7 @@
                 <w:szCs w:val="16"/>
                 <w:shd w:fill="EFF6FF" w:val="clear"/>
               </w:rPr>
-              <w:t xml:space="preserve">Painel transferencia_igreja</w:t>
+              <w:t xml:space="preserve">Painel access_control</w:t>
             </w:r>
           </w:p>
           <w:p>
@@ -22871,7 +23617,7 @@
                 <w:sz w:val="20"/>
                 <w:szCs w:val="20"/>
               </w:rPr>
-              <w:t xml:space="preserve">Quando a família muda de congregação no mesmo ecossistema, o cadastro não se duplica. A igreja de destino solicita; a origem aprova; o vínculo e o grupo familiar seguem para a nova casa.</w:t>
+              <w:t xml:space="preserve">O coração da governança: papéis, grants, visão por papel ou por recurso. O Gestor de Controle de Acesso não vê o Super Administrador — escudo explícito. LGPD da instância liga/desliga aqui.</w:t>
             </w:r>
           </w:p>
           <w:p>
@@ -22903,7 +23649,7 @@
                 <w:sz w:val="20"/>
                 <w:szCs w:val="20"/>
               </w:rPr>
-              <w:t xml:space="preserve">Mesmo </w:t>
+              <w:t xml:space="preserve">RPCs SECURITY DEFINER amarradas à sessão do ator, matriz de grants, </w:t>
             </w:r>
             <w:r>
               <w:rPr>
@@ -22913,54 +23659,16 @@
                 <w:szCs w:val="20"/>
                 <w:shd w:fill="F1F5F9" w:val="clear"/>
               </w:rPr>
-              <w:t xml:space="preserve">profiles.id</w:t>
-            </w:r>
-            <w:r>
-              <w:rPr>
-                <w:rFonts w:ascii="Calibri" w:cs="Calibri" w:eastAsia="Calibri" w:hAnsi="Calibri"/>
-                <w:color w:val="1E293B"/>
-                <w:sz w:val="20"/>
-                <w:szCs w:val="20"/>
-              </w:rPr>
-              <w:t xml:space="preserve">; telefone e CPF permanecem únicos. Pedido pastoral na origem. Isolamento por </w:t>
-            </w:r>
-            <w:r>
-              <w:rPr>
-                <w:rFonts w:ascii="Calibri" w:cs="Calibri" w:eastAsia="Calibri" w:hAnsi="Calibri"/>
-                <w:color w:val="1E293B"/>
-                <w:sz w:val="20"/>
-                <w:szCs w:val="20"/>
-                <w:shd w:fill="F1F5F9" w:val="clear"/>
-              </w:rPr>
-              <w:t xml:space="preserve">igrejas</w:t>
-            </w:r>
-            <w:r>
-              <w:rPr>
-                <w:rFonts w:ascii="Calibri" w:cs="Calibri" w:eastAsia="Calibri" w:hAnsi="Calibri"/>
-                <w:color w:val="1E293B"/>
-                <w:sz w:val="20"/>
-                <w:szCs w:val="20"/>
-              </w:rPr>
-              <w:t xml:space="preserve"> / </w:t>
-            </w:r>
-            <w:r>
-              <w:rPr>
-                <w:rFonts w:ascii="Calibri" w:cs="Calibri" w:eastAsia="Calibri" w:hAnsi="Calibri"/>
-                <w:color w:val="1E293B"/>
-                <w:sz w:val="20"/>
-                <w:szCs w:val="20"/>
-                <w:shd w:fill="F1F5F9" w:val="clear"/>
-              </w:rPr>
-              <w:t xml:space="preserve">profile_igreja_vinculos</w:t>
-            </w:r>
-            <w:r>
-              <w:rPr>
-                <w:rFonts w:ascii="Calibri" w:cs="Calibri" w:eastAsia="Calibri" w:hAnsi="Calibri"/>
-                <w:color w:val="1E293B"/>
-                <w:sz w:val="20"/>
-                <w:szCs w:val="20"/>
-              </w:rPr>
-              <w:t xml:space="preserve">.</w:t>
+              <w:t xml:space="preserve">assert_gestor_super_admin_shield</w:t>
+            </w:r>
+            <w:r>
+              <w:rPr>
+                <w:rFonts w:ascii="Calibri" w:cs="Calibri" w:eastAsia="Calibri" w:hAnsi="Calibri"/>
+                <w:color w:val="1E293B"/>
+                <w:sz w:val="20"/>
+                <w:szCs w:val="20"/>
+              </w:rPr>
+              <w:t xml:space="preserve">. Afeta todas as telas.</w:t>
             </w:r>
           </w:p>
           <w:tbl>
@@ -23025,7 +23733,7 @@
                       <w:sz w:val="19"/>
                       <w:szCs w:val="19"/>
                     </w:rPr>
-                    <w:t xml:space="preserve">Continua a mesma pessoa na plataforma, agora na igreja nova, sem recadastrar a vida inteira.</w:t>
+                    <w:t xml:space="preserve">Vê só o que lhe cabe — e isso é cuidado, não restrição vazia.</w:t>
                   </w:r>
                 </w:p>
               </w:tc>
@@ -23074,7 +23782,7 @@
                       <w:sz w:val="19"/>
                       <w:szCs w:val="19"/>
                     </w:rPr>
-                    <w:t xml:space="preserve">Transferência formal entre instâncias, sem clone de perfil e sem perder o histórico da família.</w:t>
+                    <w:t xml:space="preserve">ACL auditável, fail-closed, sem o gestor enxergar o super administrador.</w:t>
                   </w:r>
                 </w:p>
               </w:tc>
@@ -23139,7 +23847,7 @@
                       <w:sz w:val="20"/>
                       <w:szCs w:val="20"/>
                     </w:rPr>
-                    <w:t xml:space="preserve">Espaço para imagem — Transferência de Membro</w:t>
+                    <w:t xml:space="preserve">Espaço para imagem — Controle de Acesso</w:t>
                   </w:r>
                 </w:p>
                 <w:p>
@@ -23221,7 +23929,7 @@
                 <w:sz w:val="29"/>
                 <w:szCs w:val="29"/>
               </w:rPr>
-              <w:t xml:space="preserve">Acessos de Usuários</w:t>
+              <w:t xml:space="preserve">Mudança de Papéis</w:t>
             </w:r>
           </w:p>
           <w:p>
@@ -23237,7 +23945,7 @@
                 <w:szCs w:val="16"/>
                 <w:shd w:fill="EFF6FF" w:val="clear"/>
               </w:rPr>
-              <w:t xml:space="preserve">Painel profile_access_insights</w:t>
+              <w:t xml:space="preserve">Painel mudanca_papeis</w:t>
             </w:r>
           </w:p>
           <w:p>
@@ -23269,7 +23977,7 @@
                 <w:sz w:val="20"/>
                 <w:szCs w:val="20"/>
               </w:rPr>
-              <w:t xml:space="preserve">Quem entrou, quando, quais telas. Transparência de uso para a liderança responsável — recortada à igreja da sessão. Limpeza global só no super administrador.</w:t>
+              <w:t xml:space="preserve">Visitante, congregado, membro: a caminhada eclesial vira dado oficial, com contagem de ativos e herança familiar.</w:t>
             </w:r>
           </w:p>
           <w:p>
@@ -23301,7 +24009,7 @@
                 <w:sz w:val="20"/>
                 <w:szCs w:val="20"/>
               </w:rPr>
-              <w:t xml:space="preserve">Histórico de sessão. Gestor não vê registros do Super Administrador. Estatísticas não atravessam igrejas.</w:t>
+              <w:t xml:space="preserve">Pastoral e super administrador. Integra-se à Lista de Membros, carteirinha (status) e limites de billing.</w:t>
             </w:r>
           </w:p>
           <w:tbl>
@@ -23366,7 +24074,7 @@
                       <w:sz w:val="19"/>
                       <w:szCs w:val="19"/>
                     </w:rPr>
-                    <w:t xml:space="preserve">Indireta: a igreja cuida do acesso sem vigiar a vida privada além do necessário.</w:t>
+                    <w:t xml:space="preserve">O reconhecimento da igreja (membro/congregado) aparece na carteirinha.</w:t>
                   </w:r>
                 </w:p>
               </w:tc>
@@ -23415,7 +24123,7 @@
                       <w:sz w:val="19"/>
                       <w:szCs w:val="19"/>
                     </w:rPr>
-                    <w:t xml:space="preserve">Auditoria de login e navegação, com recorte de segurança entre papéis e instâncias.</w:t>
+                    <w:t xml:space="preserve">Métricas de membresia reais, não estimativa de lista de presença.</w:t>
                   </w:r>
                 </w:p>
               </w:tc>
@@ -23480,7 +24188,7 @@
                       <w:sz w:val="20"/>
                       <w:szCs w:val="20"/>
                     </w:rPr>
-                    <w:t xml:space="preserve">Espaço para imagem — Acessos de Usuários</w:t>
+                    <w:t xml:space="preserve">Espaço para imagem — Mudança de Papéis</w:t>
                   </w:r>
                 </w:p>
                 <w:p>
@@ -23562,7 +24270,7 @@
                 <w:sz w:val="29"/>
                 <w:szCs w:val="29"/>
               </w:rPr>
-              <w:t xml:space="preserve">Instâncias (Igrejas)</w:t>
+              <w:t xml:space="preserve">Transferência de Membro</w:t>
             </w:r>
           </w:p>
           <w:p>
@@ -23578,7 +24286,7 @@
                 <w:szCs w:val="16"/>
                 <w:shd w:fill="EFF6FF" w:val="clear"/>
               </w:rPr>
-              <w:t xml:space="preserve">Rota /igrejas · super administrador</w:t>
+              <w:t xml:space="preserve">Painel transferencia_igreja</w:t>
             </w:r>
           </w:p>
           <w:p>
@@ -23610,7 +24318,7 @@
                 <w:sz w:val="20"/>
                 <w:szCs w:val="20"/>
               </w:rPr>
-              <w:t xml:space="preserve">O ecossistema multi-igreja: logo, redes, CNPJ de ofertas, código da entidade. Cada casa tem cara e PIX próprios.</w:t>
+              <w:t xml:space="preserve">Quando a família muda de congregação no mesmo ecossistema, o cadastro não se duplica. A igreja de destino solicita; a origem aprova; o vínculo e o grupo familiar seguem para a nova casa.</w:t>
             </w:r>
           </w:p>
           <w:p>
@@ -23642,7 +24350,7 @@
                 <w:sz w:val="20"/>
                 <w:szCs w:val="20"/>
               </w:rPr>
-              <w:t xml:space="preserve">Tenancy, branding, prefixo familiar (</w:t>
+              <w:t xml:space="preserve">Mesmo </w:t>
             </w:r>
             <w:r>
               <w:rPr>
@@ -23652,16 +24360,54 @@
                 <w:szCs w:val="20"/>
                 <w:shd w:fill="F1F5F9" w:val="clear"/>
               </w:rPr>
-              <w:t xml:space="preserve">Parm_entidade</w:t>
-            </w:r>
-            <w:r>
-              <w:rPr>
-                <w:rFonts w:ascii="Calibri" w:cs="Calibri" w:eastAsia="Calibri" w:hAnsi="Calibri"/>
-                <w:color w:val="1E293B"/>
-                <w:sz w:val="20"/>
-                <w:szCs w:val="20"/>
-              </w:rPr>
-              <w:t xml:space="preserve">), ofertas. Engrenagem do menu.</w:t>
+              <w:t xml:space="preserve">profiles.id</w:t>
+            </w:r>
+            <w:r>
+              <w:rPr>
+                <w:rFonts w:ascii="Calibri" w:cs="Calibri" w:eastAsia="Calibri" w:hAnsi="Calibri"/>
+                <w:color w:val="1E293B"/>
+                <w:sz w:val="20"/>
+                <w:szCs w:val="20"/>
+              </w:rPr>
+              <w:t xml:space="preserve">; telefone e CPF permanecem únicos. Pedido pastoral na origem. Isolamento por </w:t>
+            </w:r>
+            <w:r>
+              <w:rPr>
+                <w:rFonts w:ascii="Calibri" w:cs="Calibri" w:eastAsia="Calibri" w:hAnsi="Calibri"/>
+                <w:color w:val="1E293B"/>
+                <w:sz w:val="20"/>
+                <w:szCs w:val="20"/>
+                <w:shd w:fill="F1F5F9" w:val="clear"/>
+              </w:rPr>
+              <w:t xml:space="preserve">igrejas</w:t>
+            </w:r>
+            <w:r>
+              <w:rPr>
+                <w:rFonts w:ascii="Calibri" w:cs="Calibri" w:eastAsia="Calibri" w:hAnsi="Calibri"/>
+                <w:color w:val="1E293B"/>
+                <w:sz w:val="20"/>
+                <w:szCs w:val="20"/>
+              </w:rPr>
+              <w:t xml:space="preserve"> / </w:t>
+            </w:r>
+            <w:r>
+              <w:rPr>
+                <w:rFonts w:ascii="Calibri" w:cs="Calibri" w:eastAsia="Calibri" w:hAnsi="Calibri"/>
+                <w:color w:val="1E293B"/>
+                <w:sz w:val="20"/>
+                <w:szCs w:val="20"/>
+                <w:shd w:fill="F1F5F9" w:val="clear"/>
+              </w:rPr>
+              <w:t xml:space="preserve">profile_igreja_vinculos</w:t>
+            </w:r>
+            <w:r>
+              <w:rPr>
+                <w:rFonts w:ascii="Calibri" w:cs="Calibri" w:eastAsia="Calibri" w:hAnsi="Calibri"/>
+                <w:color w:val="1E293B"/>
+                <w:sz w:val="20"/>
+                <w:szCs w:val="20"/>
+              </w:rPr>
+              <w:t xml:space="preserve">.</w:t>
             </w:r>
           </w:p>
           <w:tbl>
@@ -23726,7 +24472,7 @@
                       <w:sz w:val="19"/>
                       <w:szCs w:val="19"/>
                     </w:rPr>
-                    <w:t xml:space="preserve">Vive a identidade da sua congregação.</w:t>
+                    <w:t xml:space="preserve">Continua a mesma pessoa na plataforma, agora na igreja nova, sem recadastrar a vida inteira.</w:t>
                   </w:r>
                 </w:p>
               </w:tc>
@@ -23775,7 +24521,7 @@
                       <w:sz w:val="19"/>
                       <w:szCs w:val="19"/>
                     </w:rPr>
-                    <w:t xml:space="preserve">Operar várias igrejas sem misturar cadastro, marca e tesouraria.</w:t>
+                    <w:t xml:space="preserve">Transferência formal entre instâncias, sem clone de perfil e sem perder o histórico da família.</w:t>
                   </w:r>
                 </w:p>
               </w:tc>
@@ -23840,7 +24586,7 @@
                       <w:sz w:val="20"/>
                       <w:szCs w:val="20"/>
                     </w:rPr>
-                    <w:t xml:space="preserve">Espaço para imagem — Instâncias (Igrejas)</w:t>
+                    <w:t xml:space="preserve">Espaço para imagem — Transferência de Membro</w:t>
                   </w:r>
                 </w:p>
                 <w:p>
@@ -23922,7 +24668,7 @@
                 <w:sz w:val="29"/>
                 <w:szCs w:val="29"/>
               </w:rPr>
-              <w:t xml:space="preserve">Assinaturas (Billing)</w:t>
+              <w:t xml:space="preserve">Acessos de Usuários</w:t>
             </w:r>
           </w:p>
           <w:p>
@@ -23938,7 +24684,7 @@
                 <w:szCs w:val="16"/>
                 <w:shd w:fill="EFF6FF" w:val="clear"/>
               </w:rPr>
-              <w:t xml:space="preserve">Rota /billing</w:t>
+              <w:t xml:space="preserve">Painel profile_access_insights</w:t>
             </w:r>
           </w:p>
           <w:p>
@@ -23970,7 +24716,7 @@
                 <w:sz w:val="20"/>
                 <w:szCs w:val="20"/>
               </w:rPr>
-              <w:t xml:space="preserve">A sustentabilidade da plataforma: planos, limite de membros, checkout Stripe em modo teste/produção conforme ambiente. A igreja escolhe o plano com números de ativos à vista. A tela exige sessão.</w:t>
+              <w:t xml:space="preserve">Quem entrou, quando, quais telas. Transparência de uso para a liderança responsável — recortada à igreja da sessão. Limpeza global só no super administrador.</w:t>
             </w:r>
           </w:p>
           <w:p>
@@ -24001,56 +24747,8 @@
                 <w:color w:val="1E293B"/>
                 <w:sz w:val="20"/>
                 <w:szCs w:val="20"/>
-                <w:shd w:fill="F1F5F9" w:val="clear"/>
-              </w:rPr>
-              <w:t xml:space="preserve">BillingClass</w:t>
-            </w:r>
-            <w:r>
-              <w:rPr>
-                <w:rFonts w:ascii="Calibri" w:cs="Calibri" w:eastAsia="Calibri" w:hAnsi="Calibri"/>
-                <w:color w:val="1E293B"/>
-                <w:sz w:val="20"/>
-                <w:szCs w:val="20"/>
-              </w:rPr>
-              <w:t xml:space="preserve">, Functions Stripe, </w:t>
-            </w:r>
-            <w:r>
-              <w:rPr>
-                <w:rFonts w:ascii="Calibri" w:cs="Calibri" w:eastAsia="Calibri" w:hAnsi="Calibri"/>
-                <w:color w:val="1E293B"/>
-                <w:sz w:val="20"/>
-                <w:szCs w:val="20"/>
-                <w:shd w:fill="F1F5F9" w:val="clear"/>
-              </w:rPr>
-              <w:t xml:space="preserve">assert_tenant_can_add_member</w:t>
-            </w:r>
-            <w:r>
-              <w:rPr>
-                <w:rFonts w:ascii="Calibri" w:cs="Calibri" w:eastAsia="Calibri" w:hAnsi="Calibri"/>
-                <w:color w:val="1E293B"/>
-                <w:sz w:val="20"/>
-                <w:szCs w:val="20"/>
-              </w:rPr>
-              <w:t xml:space="preserve">. Isolamento por </w:t>
-            </w:r>
-            <w:r>
-              <w:rPr>
-                <w:rFonts w:ascii="Calibri" w:cs="Calibri" w:eastAsia="Calibri" w:hAnsi="Calibri"/>
-                <w:color w:val="1E293B"/>
-                <w:sz w:val="20"/>
-                <w:szCs w:val="20"/>
-                <w:shd w:fill="F1F5F9" w:val="clear"/>
-              </w:rPr>
-              <w:t xml:space="preserve">tenant_id</w:t>
-            </w:r>
-            <w:r>
-              <w:rPr>
-                <w:rFonts w:ascii="Calibri" w:cs="Calibri" w:eastAsia="Calibri" w:hAnsi="Calibri"/>
-                <w:color w:val="1E293B"/>
-                <w:sz w:val="20"/>
-                <w:szCs w:val="20"/>
-              </w:rPr>
-              <w:t xml:space="preserve">. Gate de acesso na rota.</w:t>
+              </w:rPr>
+              <w:t xml:space="preserve">Histórico de sessão. Gestor não vê registros do Super Administrador. Estatísticas não atravessam igrejas.</w:t>
             </w:r>
           </w:p>
           <w:tbl>
@@ -24115,7 +24813,7 @@
                       <w:sz w:val="19"/>
                       <w:szCs w:val="19"/>
                     </w:rPr>
-                    <w:t xml:space="preserve">Indireta: o app da igreja permanece disponível e dimensionado.</w:t>
+                    <w:t xml:space="preserve">Indireta: a igreja cuida do acesso sem vigiar a vida privada além do necessário.</w:t>
                   </w:r>
                 </w:p>
               </w:tc>
@@ -24164,7 +24862,792 @@
                       <w:sz w:val="19"/>
                       <w:szCs w:val="19"/>
                     </w:rPr>
-                    <w:t xml:space="preserve">Contrato SaaS visível, com teto de membresia alinhado ao plano.</w:t>
+                    <w:t xml:space="preserve">Auditoria de login e navegação, com recorte de segurança entre papéis e instâncias.</w:t>
+                  </w:r>
+                </w:p>
+              </w:tc>
+            </w:tr>
+          </w:tbl>
+          <w:p>
+            <w:pPr>
+              <w:spacing w:after="160"/>
+            </w:pPr>
+            <w:r>
+              <w:t xml:space="preserve"/>
+            </w:r>
+          </w:p>
+          <w:tbl>
+            <w:tblPr>
+              <w:tblW w:type="pct" w:w="100%"/>
+              <w:tblBorders>
+                <w:top w:val="single" w:color="auto" w:sz="4"/>
+                <w:left w:val="single" w:color="auto" w:sz="4"/>
+                <w:bottom w:val="single" w:color="auto" w:sz="4"/>
+                <w:right w:val="single" w:color="auto" w:sz="4"/>
+                <w:insideH w:val="single" w:color="auto" w:sz="4"/>
+                <w:insideV w:val="single" w:color="auto" w:sz="4"/>
+              </w:tblBorders>
+            </w:tblPr>
+            <w:tblGrid>
+              <w:gridCol w:w="100"/>
+            </w:tblGrid>
+            <w:tr>
+              <w:trPr>
+                <w:trHeight w:val="2800" w:hRule="atLeast"/>
+              </w:trPr>
+              <w:tc>
+                <w:tcPr>
+                  <w:tcW w:type="dxa" w:w="10320"/>
+                  <w:tcBorders>
+                    <w:top w:val="dashed" w:color="94A3B8" w:sz="8"/>
+                    <w:left w:val="dashed" w:color="94A3B8" w:sz="8"/>
+                    <w:bottom w:val="dashed" w:color="94A3B8" w:sz="8"/>
+                    <w:right w:val="dashed" w:color="94A3B8" w:sz="8"/>
+                  </w:tcBorders>
+                  <w:shd w:fill="F8FAFC" w:val="clear"/>
+                  <w:tcMar>
+                    <w:top w:type="dxa" w:w="200"/>
+                    <w:left w:type="dxa" w:w="200"/>
+                    <w:bottom w:type="dxa" w:w="200"/>
+                    <w:right w:type="dxa" w:w="200"/>
+                  </w:tcMar>
+                  <w:vAlign w:val="center"/>
+                </w:tcPr>
+                <w:p>
+                  <w:pPr>
+                    <w:spacing w:after="60"/>
+                    <w:jc w:val="center"/>
+                  </w:pPr>
+                  <w:r>
+                    <w:rPr>
+                      <w:rFonts w:ascii="Calibri" w:cs="Calibri" w:eastAsia="Calibri" w:hAnsi="Calibri"/>
+                      <w:b/>
+                      <w:bCs/>
+                      <w:color w:val="475569"/>
+                      <w:sz w:val="20"/>
+                      <w:szCs w:val="20"/>
+                    </w:rPr>
+                    <w:t xml:space="preserve">Espaço para imagem — Acessos de Usuários</w:t>
+                  </w:r>
+                </w:p>
+                <w:p>
+                  <w:pPr>
+                    <w:jc w:val="center"/>
+                  </w:pPr>
+                  <w:r>
+                    <w:rPr>
+                      <w:rFonts w:ascii="Calibri" w:cs="Calibri" w:eastAsia="Calibri" w:hAnsi="Calibri"/>
+                      <w:i/>
+                      <w:iCs/>
+                      <w:color w:val="64748B"/>
+                      <w:sz w:val="18"/>
+                      <w:szCs w:val="18"/>
+                    </w:rPr>
+                    <w:t xml:space="preserve">No Word: clique nesta caixa → Inserir → Imagens → Esta pasta (ou Arrastar a captura para cá).</w:t>
+                  </w:r>
+                </w:p>
+              </w:tc>
+            </w:tr>
+          </w:tbl>
+          <w:p/>
+        </w:tc>
+      </w:tr>
+    </w:tbl>
+    <w:p>
+      <w:pPr>
+        <w:spacing w:after="200"/>
+      </w:pPr>
+      <w:r>
+        <w:t xml:space="preserve"/>
+      </w:r>
+    </w:p>
+    <w:tbl>
+      <w:tblPr>
+        <w:tblW w:type="pct" w:w="100%"/>
+        <w:tblBorders>
+          <w:top w:val="single" w:color="auto" w:sz="4"/>
+          <w:left w:val="single" w:color="auto" w:sz="4"/>
+          <w:bottom w:val="single" w:color="auto" w:sz="4"/>
+          <w:right w:val="single" w:color="auto" w:sz="4"/>
+          <w:insideH w:val="single" w:color="auto" w:sz="4"/>
+          <w:insideV w:val="single" w:color="auto" w:sz="4"/>
+        </w:tblBorders>
+      </w:tblPr>
+      <w:tblGrid>
+        <w:gridCol w:w="100"/>
+      </w:tblGrid>
+      <w:tr>
+        <w:tc>
+          <w:tcPr>
+            <w:tcW w:type="dxa" w:w="10320"/>
+            <w:tcBorders>
+              <w:top w:val="single" w:color="E2E8F0" w:sz="8"/>
+              <w:left w:val="single" w:color="E2E8F0" w:sz="8"/>
+              <w:bottom w:val="single" w:color="E2E8F0" w:sz="8"/>
+              <w:right w:val="single" w:color="E2E8F0" w:sz="8"/>
+            </w:tcBorders>
+            <w:shd w:fill="FFFFFF" w:val="clear"/>
+            <w:tcMar>
+              <w:top w:type="dxa" w:w="160"/>
+              <w:left w:type="dxa" w:w="180"/>
+              <w:bottom w:type="dxa" w:w="160"/>
+              <w:right w:type="dxa" w:w="180"/>
+            </w:tcMar>
+          </w:tcPr>
+          <w:p>
+            <w:pPr>
+              <w:pStyle w:val="Heading2"/>
+              <w:keepNext/>
+              <w:spacing w:after="80" w:before="0"/>
+            </w:pPr>
+            <w:r>
+              <w:rPr>
+                <w:rFonts w:ascii="Calibri" w:cs="Calibri" w:eastAsia="Calibri" w:hAnsi="Calibri"/>
+                <w:b/>
+                <w:bCs/>
+                <w:color w:val="1E3A8A"/>
+                <w:sz w:val="29"/>
+                <w:szCs w:val="29"/>
+              </w:rPr>
+              <w:t xml:space="preserve">Instâncias (Igrejas)</w:t>
+            </w:r>
+          </w:p>
+          <w:p>
+            <w:pPr>
+              <w:keepNext/>
+              <w:spacing w:after="120"/>
+            </w:pPr>
+            <w:r>
+              <w:rPr>
+                <w:rFonts w:ascii="Consolas" w:cs="Consolas" w:eastAsia="Consolas" w:hAnsi="Consolas"/>
+                <w:color w:val="1E40AF"/>
+                <w:sz w:val="16"/>
+                <w:szCs w:val="16"/>
+                <w:shd w:fill="EFF6FF" w:val="clear"/>
+              </w:rPr>
+              <w:t xml:space="preserve">Rota /igrejas · super administrador</w:t>
+            </w:r>
+          </w:p>
+          <w:p>
+            <w:pPr>
+              <w:pStyle w:val="Heading3"/>
+              <w:keepNext/>
+              <w:spacing w:after="80" w:before="160"/>
+            </w:pPr>
+            <w:r>
+              <w:rPr>
+                <w:rFonts w:ascii="Calibri" w:cs="Calibri" w:eastAsia="Calibri" w:hAnsi="Calibri"/>
+                <w:b/>
+                <w:bCs/>
+                <w:color w:val="1E40AF"/>
+                <w:sz w:val="23"/>
+                <w:szCs w:val="23"/>
+              </w:rPr>
+              <w:t xml:space="preserve">Descrição comercial</w:t>
+            </w:r>
+          </w:p>
+          <w:p>
+            <w:pPr>
+              <w:spacing w:after="140" w:line="276" w:lineRule="auto"/>
+            </w:pPr>
+            <w:r>
+              <w:rPr>
+                <w:rFonts w:ascii="Calibri" w:cs="Calibri" w:eastAsia="Calibri" w:hAnsi="Calibri"/>
+                <w:color w:val="1E293B"/>
+                <w:sz w:val="20"/>
+                <w:szCs w:val="20"/>
+              </w:rPr>
+              <w:t xml:space="preserve">O ecossistema multi-igreja: logo, redes, CNPJ de ofertas, código da entidade. Cada casa tem cara e PIX próprios.</w:t>
+            </w:r>
+          </w:p>
+          <w:p>
+            <w:pPr>
+              <w:pStyle w:val="Heading3"/>
+              <w:keepNext/>
+              <w:spacing w:after="80" w:before="160"/>
+            </w:pPr>
+            <w:r>
+              <w:rPr>
+                <w:rFonts w:ascii="Calibri" w:cs="Calibri" w:eastAsia="Calibri" w:hAnsi="Calibri"/>
+                <w:b/>
+                <w:bCs/>
+                <w:color w:val="1E40AF"/>
+                <w:sz w:val="23"/>
+                <w:szCs w:val="23"/>
+              </w:rPr>
+              <w:t xml:space="preserve">Propósito e conexões</w:t>
+            </w:r>
+          </w:p>
+          <w:p>
+            <w:pPr>
+              <w:spacing w:after="160" w:line="276" w:lineRule="auto"/>
+            </w:pPr>
+            <w:r>
+              <w:rPr>
+                <w:rFonts w:ascii="Calibri" w:cs="Calibri" w:eastAsia="Calibri" w:hAnsi="Calibri"/>
+                <w:color w:val="1E293B"/>
+                <w:sz w:val="20"/>
+                <w:szCs w:val="20"/>
+              </w:rPr>
+              <w:t xml:space="preserve">Tenancy, branding, prefixo familiar (</w:t>
+            </w:r>
+            <w:r>
+              <w:rPr>
+                <w:rFonts w:ascii="Calibri" w:cs="Calibri" w:eastAsia="Calibri" w:hAnsi="Calibri"/>
+                <w:color w:val="1E293B"/>
+                <w:sz w:val="20"/>
+                <w:szCs w:val="20"/>
+                <w:shd w:fill="F1F5F9" w:val="clear"/>
+              </w:rPr>
+              <w:t xml:space="preserve">Parm_entidade</w:t>
+            </w:r>
+            <w:r>
+              <w:rPr>
+                <w:rFonts w:ascii="Calibri" w:cs="Calibri" w:eastAsia="Calibri" w:hAnsi="Calibri"/>
+                <w:color w:val="1E293B"/>
+                <w:sz w:val="20"/>
+                <w:szCs w:val="20"/>
+              </w:rPr>
+              <w:t xml:space="preserve">), ofertas. Engrenagem do menu.</w:t>
+            </w:r>
+          </w:p>
+          <w:tbl>
+            <w:tblPr>
+              <w:tblW w:type="pct" w:w="100%"/>
+              <w:tblBorders>
+                <w:top w:val="single" w:color="auto" w:sz="4"/>
+                <w:left w:val="single" w:color="auto" w:sz="4"/>
+                <w:bottom w:val="single" w:color="auto" w:sz="4"/>
+                <w:right w:val="single" w:color="auto" w:sz="4"/>
+                <w:insideH w:val="single" w:color="auto" w:sz="4"/>
+                <w:insideV w:val="single" w:color="auto" w:sz="4"/>
+              </w:tblBorders>
+            </w:tblPr>
+            <w:tblGrid>
+              <w:gridCol w:w="5060"/>
+              <w:gridCol w:w="5060"/>
+            </w:tblGrid>
+            <w:tr>
+              <w:tc>
+                <w:tcPr>
+                  <w:tcW w:type="dxa" w:w="5060"/>
+                  <w:tcBorders>
+                    <w:top w:val="none" w:color="FFFFFF" w:sz="0"/>
+                    <w:left w:val="single" w:color="15803D" w:sz="24"/>
+                    <w:bottom w:val="none" w:color="FFFFFF" w:sz="0"/>
+                    <w:right w:val="none" w:color="FFFFFF" w:sz="0"/>
+                  </w:tcBorders>
+                  <w:shd w:fill="F0FDF4" w:val="clear"/>
+                  <w:tcMar>
+                    <w:top w:type="dxa" w:w="120"/>
+                    <w:left w:type="dxa" w:w="140"/>
+                    <w:bottom w:type="dxa" w:w="120"/>
+                    <w:right w:type="dxa" w:w="140"/>
+                  </w:tcMar>
+                  <w:vAlign w:val="top"/>
+                </w:tcPr>
+                <w:p>
+                  <w:pPr>
+                    <w:spacing w:after="80"/>
+                  </w:pPr>
+                  <w:r>
+                    <w:rPr>
+                      <w:rFonts w:ascii="Calibri" w:cs="Calibri" w:eastAsia="Calibri" w:hAnsi="Calibri"/>
+                      <w:b/>
+                      <w:bCs/>
+                      <w:color w:val="166534"/>
+                      <w:sz w:val="20"/>
+                      <w:szCs w:val="20"/>
+                    </w:rPr>
+                    <w:t xml:space="preserve">Visão do Usuário Final</w:t>
+                  </w:r>
+                </w:p>
+                <w:p>
+                  <w:pPr>
+                    <w:spacing w:after="0" w:line="276" w:lineRule="auto"/>
+                  </w:pPr>
+                  <w:r>
+                    <w:rPr>
+                      <w:rFonts w:ascii="Calibri" w:cs="Calibri" w:eastAsia="Calibri" w:hAnsi="Calibri"/>
+                      <w:color w:val="1E293B"/>
+                      <w:sz w:val="19"/>
+                      <w:szCs w:val="19"/>
+                    </w:rPr>
+                    <w:t xml:space="preserve">Vive a identidade da sua congregação.</w:t>
+                  </w:r>
+                </w:p>
+              </w:tc>
+              <w:tc>
+                <w:tcPr>
+                  <w:tcW w:type="dxa" w:w="5060"/>
+                  <w:tcBorders>
+                    <w:top w:val="none" w:color="FFFFFF" w:sz="0"/>
+                    <w:left w:val="single" w:color="1D4ED8" w:sz="24"/>
+                    <w:bottom w:val="none" w:color="FFFFFF" w:sz="0"/>
+                    <w:right w:val="none" w:color="FFFFFF" w:sz="0"/>
+                  </w:tcBorders>
+                  <w:shd w:fill="EFF6FF" w:val="clear"/>
+                  <w:tcMar>
+                    <w:top w:type="dxa" w:w="120"/>
+                    <w:left w:type="dxa" w:w="140"/>
+                    <w:bottom w:type="dxa" w:w="120"/>
+                    <w:right w:type="dxa" w:w="140"/>
+                  </w:tcMar>
+                  <w:vAlign w:val="top"/>
+                </w:tcPr>
+                <w:p>
+                  <w:pPr>
+                    <w:spacing w:after="80"/>
+                  </w:pPr>
+                  <w:r>
+                    <w:rPr>
+                      <w:rFonts w:ascii="Calibri" w:cs="Calibri" w:eastAsia="Calibri" w:hAnsi="Calibri"/>
+                      <w:b/>
+                      <w:bCs/>
+                      <w:color w:val="1E3A8A"/>
+                      <w:sz w:val="20"/>
+                      <w:szCs w:val="20"/>
+                    </w:rPr>
+                    <w:t xml:space="preserve">Visão da Administração</w:t>
+                  </w:r>
+                </w:p>
+                <w:p>
+                  <w:pPr>
+                    <w:spacing w:after="0" w:line="276" w:lineRule="auto"/>
+                  </w:pPr>
+                  <w:r>
+                    <w:rPr>
+                      <w:rFonts w:ascii="Calibri" w:cs="Calibri" w:eastAsia="Calibri" w:hAnsi="Calibri"/>
+                      <w:color w:val="1E293B"/>
+                      <w:sz w:val="19"/>
+                      <w:szCs w:val="19"/>
+                    </w:rPr>
+                    <w:t xml:space="preserve">Operar várias igrejas sem misturar cadastro, marca e tesouraria.</w:t>
+                  </w:r>
+                </w:p>
+              </w:tc>
+            </w:tr>
+          </w:tbl>
+          <w:p>
+            <w:pPr>
+              <w:spacing w:after="160"/>
+            </w:pPr>
+            <w:r>
+              <w:t xml:space="preserve"/>
+            </w:r>
+          </w:p>
+          <w:tbl>
+            <w:tblPr>
+              <w:tblW w:type="pct" w:w="100%"/>
+              <w:tblBorders>
+                <w:top w:val="single" w:color="auto" w:sz="4"/>
+                <w:left w:val="single" w:color="auto" w:sz="4"/>
+                <w:bottom w:val="single" w:color="auto" w:sz="4"/>
+                <w:right w:val="single" w:color="auto" w:sz="4"/>
+                <w:insideH w:val="single" w:color="auto" w:sz="4"/>
+                <w:insideV w:val="single" w:color="auto" w:sz="4"/>
+              </w:tblBorders>
+            </w:tblPr>
+            <w:tblGrid>
+              <w:gridCol w:w="100"/>
+            </w:tblGrid>
+            <w:tr>
+              <w:trPr>
+                <w:trHeight w:val="2800" w:hRule="atLeast"/>
+              </w:trPr>
+              <w:tc>
+                <w:tcPr>
+                  <w:tcW w:type="dxa" w:w="10320"/>
+                  <w:tcBorders>
+                    <w:top w:val="dashed" w:color="94A3B8" w:sz="8"/>
+                    <w:left w:val="dashed" w:color="94A3B8" w:sz="8"/>
+                    <w:bottom w:val="dashed" w:color="94A3B8" w:sz="8"/>
+                    <w:right w:val="dashed" w:color="94A3B8" w:sz="8"/>
+                  </w:tcBorders>
+                  <w:shd w:fill="F8FAFC" w:val="clear"/>
+                  <w:tcMar>
+                    <w:top w:type="dxa" w:w="200"/>
+                    <w:left w:type="dxa" w:w="200"/>
+                    <w:bottom w:type="dxa" w:w="200"/>
+                    <w:right w:type="dxa" w:w="200"/>
+                  </w:tcMar>
+                  <w:vAlign w:val="center"/>
+                </w:tcPr>
+                <w:p>
+                  <w:pPr>
+                    <w:spacing w:after="60"/>
+                    <w:jc w:val="center"/>
+                  </w:pPr>
+                  <w:r>
+                    <w:rPr>
+                      <w:rFonts w:ascii="Calibri" w:cs="Calibri" w:eastAsia="Calibri" w:hAnsi="Calibri"/>
+                      <w:b/>
+                      <w:bCs/>
+                      <w:color w:val="475569"/>
+                      <w:sz w:val="20"/>
+                      <w:szCs w:val="20"/>
+                    </w:rPr>
+                    <w:t xml:space="preserve">Espaço para imagem — Instâncias (Igrejas)</w:t>
+                  </w:r>
+                </w:p>
+                <w:p>
+                  <w:pPr>
+                    <w:jc w:val="center"/>
+                  </w:pPr>
+                  <w:r>
+                    <w:rPr>
+                      <w:rFonts w:ascii="Calibri" w:cs="Calibri" w:eastAsia="Calibri" w:hAnsi="Calibri"/>
+                      <w:i/>
+                      <w:iCs/>
+                      <w:color w:val="64748B"/>
+                      <w:sz w:val="18"/>
+                      <w:szCs w:val="18"/>
+                    </w:rPr>
+                    <w:t xml:space="preserve">No Word: clique nesta caixa → Inserir → Imagens → Esta pasta (ou Arrastar a captura para cá).</w:t>
+                  </w:r>
+                </w:p>
+              </w:tc>
+            </w:tr>
+          </w:tbl>
+          <w:p/>
+        </w:tc>
+      </w:tr>
+    </w:tbl>
+    <w:p>
+      <w:pPr>
+        <w:spacing w:after="200"/>
+      </w:pPr>
+      <w:r>
+        <w:t xml:space="preserve"/>
+      </w:r>
+    </w:p>
+    <w:tbl>
+      <w:tblPr>
+        <w:tblW w:type="pct" w:w="100%"/>
+        <w:tblBorders>
+          <w:top w:val="single" w:color="auto" w:sz="4"/>
+          <w:left w:val="single" w:color="auto" w:sz="4"/>
+          <w:bottom w:val="single" w:color="auto" w:sz="4"/>
+          <w:right w:val="single" w:color="auto" w:sz="4"/>
+          <w:insideH w:val="single" w:color="auto" w:sz="4"/>
+          <w:insideV w:val="single" w:color="auto" w:sz="4"/>
+        </w:tblBorders>
+      </w:tblPr>
+      <w:tblGrid>
+        <w:gridCol w:w="100"/>
+      </w:tblGrid>
+      <w:tr>
+        <w:tc>
+          <w:tcPr>
+            <w:tcW w:type="dxa" w:w="10320"/>
+            <w:tcBorders>
+              <w:top w:val="single" w:color="E2E8F0" w:sz="8"/>
+              <w:left w:val="single" w:color="E2E8F0" w:sz="8"/>
+              <w:bottom w:val="single" w:color="E2E8F0" w:sz="8"/>
+              <w:right w:val="single" w:color="E2E8F0" w:sz="8"/>
+            </w:tcBorders>
+            <w:shd w:fill="FFFFFF" w:val="clear"/>
+            <w:tcMar>
+              <w:top w:type="dxa" w:w="160"/>
+              <w:left w:type="dxa" w:w="180"/>
+              <w:bottom w:type="dxa" w:w="160"/>
+              <w:right w:type="dxa" w:w="180"/>
+            </w:tcMar>
+          </w:tcPr>
+          <w:p>
+            <w:pPr>
+              <w:pStyle w:val="Heading2"/>
+              <w:keepNext/>
+              <w:spacing w:after="80" w:before="0"/>
+            </w:pPr>
+            <w:r>
+              <w:rPr>
+                <w:rFonts w:ascii="Calibri" w:cs="Calibri" w:eastAsia="Calibri" w:hAnsi="Calibri"/>
+                <w:b/>
+                <w:bCs/>
+                <w:color w:val="1E3A8A"/>
+                <w:sz w:val="29"/>
+                <w:szCs w:val="29"/>
+              </w:rPr>
+              <w:t xml:space="preserve">Assinaturas (Billing)</w:t>
+            </w:r>
+          </w:p>
+          <w:p>
+            <w:pPr>
+              <w:keepNext/>
+              <w:spacing w:after="120"/>
+            </w:pPr>
+            <w:r>
+              <w:rPr>
+                <w:rFonts w:ascii="Consolas" w:cs="Consolas" w:eastAsia="Consolas" w:hAnsi="Consolas"/>
+                <w:color w:val="1E40AF"/>
+                <w:sz w:val="16"/>
+                <w:szCs w:val="16"/>
+                <w:shd w:fill="EFF6FF" w:val="clear"/>
+              </w:rPr>
+              <w:t xml:space="preserve">Rota /billing</w:t>
+            </w:r>
+          </w:p>
+          <w:p>
+            <w:pPr>
+              <w:pStyle w:val="Heading3"/>
+              <w:keepNext/>
+              <w:spacing w:after="80" w:before="160"/>
+            </w:pPr>
+            <w:r>
+              <w:rPr>
+                <w:rFonts w:ascii="Calibri" w:cs="Calibri" w:eastAsia="Calibri" w:hAnsi="Calibri"/>
+                <w:b/>
+                <w:bCs/>
+                <w:color w:val="1E40AF"/>
+                <w:sz w:val="23"/>
+                <w:szCs w:val="23"/>
+              </w:rPr>
+              <w:t xml:space="preserve">Descrição comercial</w:t>
+            </w:r>
+          </w:p>
+          <w:p>
+            <w:pPr>
+              <w:spacing w:after="140" w:line="276" w:lineRule="auto"/>
+            </w:pPr>
+            <w:r>
+              <w:rPr>
+                <w:rFonts w:ascii="Calibri" w:cs="Calibri" w:eastAsia="Calibri" w:hAnsi="Calibri"/>
+                <w:color w:val="1E293B"/>
+                <w:sz w:val="20"/>
+                <w:szCs w:val="20"/>
+              </w:rPr>
+              <w:t xml:space="preserve">A sustentabilidade da plataforma: planos com </w:t>
+            </w:r>
+            <w:r>
+              <w:rPr>
+                <w:rFonts w:ascii="Calibri" w:cs="Calibri" w:eastAsia="Calibri" w:hAnsi="Calibri"/>
+                <w:color w:val="1E293B"/>
+                <w:sz w:val="20"/>
+                <w:szCs w:val="20"/>
+              </w:rPr>
+              <w:t xml:space="preserve">cobrança trimestral</w:t>
+            </w:r>
+            <w:r>
+              <w:rPr>
+                <w:rFonts w:ascii="Calibri" w:cs="Calibri" w:eastAsia="Calibri" w:hAnsi="Calibri"/>
+                <w:color w:val="1E293B"/>
+                <w:sz w:val="20"/>
+                <w:szCs w:val="20"/>
+              </w:rPr>
+              <w:t xml:space="preserve">, teto de </w:t>
+            </w:r>
+            <w:r>
+              <w:rPr>
+                <w:rFonts w:ascii="Calibri" w:cs="Calibri" w:eastAsia="Calibri" w:hAnsi="Calibri"/>
+                <w:color w:val="1E293B"/>
+                <w:sz w:val="20"/>
+                <w:szCs w:val="20"/>
+              </w:rPr>
+              <w:t xml:space="preserve">usuários ativos (membros + congregados)</w:t>
+            </w:r>
+            <w:r>
+              <w:rPr>
+                <w:rFonts w:ascii="Calibri" w:cs="Calibri" w:eastAsia="Calibri" w:hAnsi="Calibri"/>
+                <w:color w:val="1E293B"/>
+                <w:sz w:val="20"/>
+                <w:szCs w:val="20"/>
+              </w:rPr>
+              <w:t xml:space="preserve"> e checkout Stripe. Pacotes com limite abaixo da quantidade atual da igreja não ficam disponíveis para assinatura. A tela exige sessão.</w:t>
+            </w:r>
+          </w:p>
+          <w:p>
+            <w:pPr>
+              <w:pStyle w:val="Heading3"/>
+              <w:keepNext/>
+              <w:spacing w:after="80" w:before="160"/>
+            </w:pPr>
+            <w:r>
+              <w:rPr>
+                <w:rFonts w:ascii="Calibri" w:cs="Calibri" w:eastAsia="Calibri" w:hAnsi="Calibri"/>
+                <w:b/>
+                <w:bCs/>
+                <w:color w:val="1E40AF"/>
+                <w:sz w:val="23"/>
+                <w:szCs w:val="23"/>
+              </w:rPr>
+              <w:t xml:space="preserve">Propósito e conexões</w:t>
+            </w:r>
+          </w:p>
+          <w:p>
+            <w:pPr>
+              <w:spacing w:after="160" w:line="276" w:lineRule="auto"/>
+            </w:pPr>
+            <w:r>
+              <w:rPr>
+                <w:rFonts w:ascii="Calibri" w:cs="Calibri" w:eastAsia="Calibri" w:hAnsi="Calibri"/>
+                <w:color w:val="1E293B"/>
+                <w:sz w:val="20"/>
+                <w:szCs w:val="20"/>
+                <w:shd w:fill="F1F5F9" w:val="clear"/>
+              </w:rPr>
+              <w:t xml:space="preserve">BillingClass</w:t>
+            </w:r>
+            <w:r>
+              <w:rPr>
+                <w:rFonts w:ascii="Calibri" w:cs="Calibri" w:eastAsia="Calibri" w:hAnsi="Calibri"/>
+                <w:color w:val="1E293B"/>
+                <w:sz w:val="20"/>
+                <w:szCs w:val="20"/>
+              </w:rPr>
+              <w:t xml:space="preserve">, Functions Stripe, </w:t>
+            </w:r>
+            <w:r>
+              <w:rPr>
+                <w:rFonts w:ascii="Calibri" w:cs="Calibri" w:eastAsia="Calibri" w:hAnsi="Calibri"/>
+                <w:color w:val="1E293B"/>
+                <w:sz w:val="20"/>
+                <w:szCs w:val="20"/>
+                <w:shd w:fill="F1F5F9" w:val="clear"/>
+              </w:rPr>
+              <w:t xml:space="preserve">assert_tenant_can_add_member</w:t>
+            </w:r>
+            <w:r>
+              <w:rPr>
+                <w:rFonts w:ascii="Calibri" w:cs="Calibri" w:eastAsia="Calibri" w:hAnsi="Calibri"/>
+                <w:color w:val="1E293B"/>
+                <w:sz w:val="20"/>
+                <w:szCs w:val="20"/>
+              </w:rPr>
+              <w:t xml:space="preserve">. Isolamento por </w:t>
+            </w:r>
+            <w:r>
+              <w:rPr>
+                <w:rFonts w:ascii="Calibri" w:cs="Calibri" w:eastAsia="Calibri" w:hAnsi="Calibri"/>
+                <w:color w:val="1E293B"/>
+                <w:sz w:val="20"/>
+                <w:szCs w:val="20"/>
+                <w:shd w:fill="F1F5F9" w:val="clear"/>
+              </w:rPr>
+              <w:t xml:space="preserve">tenant_id</w:t>
+            </w:r>
+            <w:r>
+              <w:rPr>
+                <w:rFonts w:ascii="Calibri" w:cs="Calibri" w:eastAsia="Calibri" w:hAnsi="Calibri"/>
+                <w:color w:val="1E293B"/>
+                <w:sz w:val="20"/>
+                <w:szCs w:val="20"/>
+              </w:rPr>
+              <w:t xml:space="preserve">. Gate de acesso na rota.</w:t>
+            </w:r>
+          </w:p>
+          <w:tbl>
+            <w:tblPr>
+              <w:tblW w:type="pct" w:w="100%"/>
+              <w:tblBorders>
+                <w:top w:val="single" w:color="auto" w:sz="4"/>
+                <w:left w:val="single" w:color="auto" w:sz="4"/>
+                <w:bottom w:val="single" w:color="auto" w:sz="4"/>
+                <w:right w:val="single" w:color="auto" w:sz="4"/>
+                <w:insideH w:val="single" w:color="auto" w:sz="4"/>
+                <w:insideV w:val="single" w:color="auto" w:sz="4"/>
+              </w:tblBorders>
+            </w:tblPr>
+            <w:tblGrid>
+              <w:gridCol w:w="5060"/>
+              <w:gridCol w:w="5060"/>
+            </w:tblGrid>
+            <w:tr>
+              <w:tc>
+                <w:tcPr>
+                  <w:tcW w:type="dxa" w:w="5060"/>
+                  <w:tcBorders>
+                    <w:top w:val="none" w:color="FFFFFF" w:sz="0"/>
+                    <w:left w:val="single" w:color="15803D" w:sz="24"/>
+                    <w:bottom w:val="none" w:color="FFFFFF" w:sz="0"/>
+                    <w:right w:val="none" w:color="FFFFFF" w:sz="0"/>
+                  </w:tcBorders>
+                  <w:shd w:fill="F0FDF4" w:val="clear"/>
+                  <w:tcMar>
+                    <w:top w:type="dxa" w:w="120"/>
+                    <w:left w:type="dxa" w:w="140"/>
+                    <w:bottom w:type="dxa" w:w="120"/>
+                    <w:right w:type="dxa" w:w="140"/>
+                  </w:tcMar>
+                  <w:vAlign w:val="top"/>
+                </w:tcPr>
+                <w:p>
+                  <w:pPr>
+                    <w:spacing w:after="80"/>
+                  </w:pPr>
+                  <w:r>
+                    <w:rPr>
+                      <w:rFonts w:ascii="Calibri" w:cs="Calibri" w:eastAsia="Calibri" w:hAnsi="Calibri"/>
+                      <w:b/>
+                      <w:bCs/>
+                      <w:color w:val="166534"/>
+                      <w:sz w:val="20"/>
+                      <w:szCs w:val="20"/>
+                    </w:rPr>
+                    <w:t xml:space="preserve">Visão do Usuário Final</w:t>
+                  </w:r>
+                </w:p>
+                <w:p>
+                  <w:pPr>
+                    <w:spacing w:after="0" w:line="276" w:lineRule="auto"/>
+                  </w:pPr>
+                  <w:r>
+                    <w:rPr>
+                      <w:rFonts w:ascii="Calibri" w:cs="Calibri" w:eastAsia="Calibri" w:hAnsi="Calibri"/>
+                      <w:color w:val="1E293B"/>
+                      <w:sz w:val="19"/>
+                      <w:szCs w:val="19"/>
+                    </w:rPr>
+                    <w:t xml:space="preserve">Indireta: o app da igreja permanece disponível e dimensionado.</w:t>
+                  </w:r>
+                </w:p>
+              </w:tc>
+              <w:tc>
+                <w:tcPr>
+                  <w:tcW w:type="dxa" w:w="5060"/>
+                  <w:tcBorders>
+                    <w:top w:val="none" w:color="FFFFFF" w:sz="0"/>
+                    <w:left w:val="single" w:color="1D4ED8" w:sz="24"/>
+                    <w:bottom w:val="none" w:color="FFFFFF" w:sz="0"/>
+                    <w:right w:val="none" w:color="FFFFFF" w:sz="0"/>
+                  </w:tcBorders>
+                  <w:shd w:fill="EFF6FF" w:val="clear"/>
+                  <w:tcMar>
+                    <w:top w:type="dxa" w:w="120"/>
+                    <w:left w:type="dxa" w:w="140"/>
+                    <w:bottom w:type="dxa" w:w="120"/>
+                    <w:right w:type="dxa" w:w="140"/>
+                  </w:tcMar>
+                  <w:vAlign w:val="top"/>
+                </w:tcPr>
+                <w:p>
+                  <w:pPr>
+                    <w:spacing w:after="80"/>
+                  </w:pPr>
+                  <w:r>
+                    <w:rPr>
+                      <w:rFonts w:ascii="Calibri" w:cs="Calibri" w:eastAsia="Calibri" w:hAnsi="Calibri"/>
+                      <w:b/>
+                      <w:bCs/>
+                      <w:color w:val="1E3A8A"/>
+                      <w:sz w:val="20"/>
+                      <w:szCs w:val="20"/>
+                    </w:rPr>
+                    <w:t xml:space="preserve">Visão da Administração</w:t>
+                  </w:r>
+                </w:p>
+                <w:p>
+                  <w:pPr>
+                    <w:spacing w:after="0" w:line="276" w:lineRule="auto"/>
+                  </w:pPr>
+                  <w:r>
+                    <w:rPr>
+                      <w:rFonts w:ascii="Calibri" w:cs="Calibri" w:eastAsia="Calibri" w:hAnsi="Calibri"/>
+                      <w:color w:val="1E293B"/>
+                      <w:sz w:val="19"/>
+                      <w:szCs w:val="19"/>
+                    </w:rPr>
+                    <w:t xml:space="preserve">Contrato SaaS visível, com teto de membresia alinhado ao plano e ciclo trimestral no Stripe.</w:t>
                   </w:r>
                 </w:p>
               </w:tc>

</xml_diff>